<commit_message>
Added pipeline.py withh 3 clean functions
</commit_message>
<xml_diff>
--- a/Automation_Study_Plan.docx
+++ b/Automation_Study_Plan.docx
@@ -2,22 +2,6 @@
 <file path=word/document.xml><?xml version="1.0" encoding="utf-8"?>
 <w:document xmlns:o="urn:schemas-microsoft-com:office:office" xmlns:r="http://schemas.openxmlformats.org/officeDocument/2006/relationships" xmlns:v="urn:schemas-microsoft-com:vml" xmlns:w="http://schemas.openxmlformats.org/wordprocessingml/2006/main" xmlns:w10="urn:schemas-microsoft-com:office:word" xmlns:wp="http://schemas.openxmlformats.org/drawingml/2006/wordprocessingDrawing" xmlns:pic="http://schemas.openxmlformats.org/drawingml/2006/picture" xmlns:wps="http://schemas.microsoft.com/office/word/2010/wordprocessingShape" xmlns:wpg="http://schemas.microsoft.com/office/word/2010/wordprocessingGroup" xmlns:mc="http://schemas.openxmlformats.org/markup-compatibility/2006" xmlns:wp14="http://schemas.microsoft.com/office/word/2010/wordprocessingDrawing" xmlns:w14="http://schemas.microsoft.com/office/word/2010/wordml" xmlns:w15="http://schemas.microsoft.com/office/word/2012/wordml" mc:Ignorable="w14 wp14 w15">
   <w:body>
-    <w:p>
-      <w:pPr>
-        <w:pStyle w:val="Normal"/>
-        <w:spacing w:before="1200" w:after="1200"/>
-        <w:rPr>
-          <w:sz w:val="26"/>
-          <w:szCs w:val="26"/>
-        </w:rPr>
-      </w:pPr>
-      <w:r>
-        <w:rPr>
-          <w:sz w:val="26"/>
-          <w:szCs w:val="26"/>
-        </w:rPr>
-      </w:r>
-    </w:p>
     <w:p>
       <w:pPr>
         <w:pStyle w:val="Normal"/>
@@ -108,17 +92,7 @@
           <w:szCs w:val="26"/>
           <w:u w:val="single"/>
         </w:rPr>
-        <w:t xml:space="preserve"> </w:t>
-      </w:r>
-      <w:r>
-        <w:rPr>
-          <w:rFonts w:eastAsia="Arial" w:cs="Arial"/>
-          <w:color w:val="666666"/>
-          <w:sz w:val="26"/>
-          <w:szCs w:val="26"/>
-          <w:u w:val="single"/>
-        </w:rPr>
-        <w:t>PRINCE JOHN MARTINE</w:t>
+        <w:t xml:space="preserve"> PRINCE JOHN MARTINE</w:t>
       </w:r>
     </w:p>
     <w:p>
@@ -258,16 +232,7 @@
           <w:sz w:val="32"/>
           <w:szCs w:val="32"/>
         </w:rPr>
-        <w:t xml:space="preserve">Do not move to the next phase </w:t>
-      </w:r>
-      <w:r>
-        <w:rPr>
-          <w:rFonts w:eastAsia="Arial" w:cs="Arial"/>
-          <w:color w:val="FF0000"/>
-          <w:sz w:val="32"/>
-          <w:szCs w:val="32"/>
-        </w:rPr>
-        <w:t>until the mini project is reviewed. Quality over speed</w:t>
+        <w:t>Do not move to the next phase until the mini project is reviewed. Quality over speed</w:t>
       </w:r>
       <w:r>
         <w:rPr>
@@ -370,10 +335,10 @@
       </w:tblPr>
       <w:tblGrid>
         <w:gridCol w:w="1290"/>
-        <w:gridCol w:w="2130"/>
+        <w:gridCol w:w="2129"/>
         <w:gridCol w:w="1440"/>
         <w:gridCol w:w="1530"/>
-        <w:gridCol w:w="1530"/>
+        <w:gridCol w:w="1531"/>
       </w:tblGrid>
       <w:tr>
         <w:trPr/>
@@ -413,7 +378,7 @@
         </w:tc>
         <w:tc>
           <w:tcPr>
-            <w:tcW w:w="2130" w:type="dxa"/>
+            <w:tcW w:w="2129" w:type="dxa"/>
             <w:tcBorders>
               <w:top w:val="single" w:sz="4" w:space="0" w:color="CCCCCC"/>
               <w:start w:val="single" w:sz="4" w:space="0" w:color="CCCCCC"/>
@@ -515,7 +480,7 @@
         </w:tc>
         <w:tc>
           <w:tcPr>
-            <w:tcW w:w="1530" w:type="dxa"/>
+            <w:tcW w:w="1531" w:type="dxa"/>
             <w:tcBorders>
               <w:top w:val="single" w:sz="4" w:space="0" w:color="CCCCCC"/>
               <w:start w:val="single" w:sz="4" w:space="0" w:color="CCCCCC"/>
@@ -586,7 +551,7 @@
         </w:tc>
         <w:tc>
           <w:tcPr>
-            <w:tcW w:w="2130" w:type="dxa"/>
+            <w:tcW w:w="2129" w:type="dxa"/>
             <w:tcBorders>
               <w:top w:val="single" w:sz="4" w:space="0" w:color="CCCCCC"/>
               <w:start w:val="single" w:sz="4" w:space="0" w:color="CCCCCC"/>
@@ -688,7 +653,7 @@
         </w:tc>
         <w:tc>
           <w:tcPr>
-            <w:tcW w:w="1530" w:type="dxa"/>
+            <w:tcW w:w="1531" w:type="dxa"/>
             <w:tcBorders>
               <w:top w:val="single" w:sz="4" w:space="0" w:color="CCCCCC"/>
               <w:start w:val="single" w:sz="4" w:space="0" w:color="CCCCCC"/>
@@ -759,7 +724,7 @@
         </w:tc>
         <w:tc>
           <w:tcPr>
-            <w:tcW w:w="2130" w:type="dxa"/>
+            <w:tcW w:w="2129" w:type="dxa"/>
             <w:tcBorders>
               <w:top w:val="single" w:sz="4" w:space="0" w:color="CCCCCC"/>
               <w:start w:val="single" w:sz="4" w:space="0" w:color="CCCCCC"/>
@@ -861,7 +826,7 @@
         </w:tc>
         <w:tc>
           <w:tcPr>
-            <w:tcW w:w="1530" w:type="dxa"/>
+            <w:tcW w:w="1531" w:type="dxa"/>
             <w:tcBorders>
               <w:top w:val="single" w:sz="4" w:space="0" w:color="CCCCCC"/>
               <w:start w:val="single" w:sz="4" w:space="0" w:color="CCCCCC"/>
@@ -932,7 +897,7 @@
         </w:tc>
         <w:tc>
           <w:tcPr>
-            <w:tcW w:w="2130" w:type="dxa"/>
+            <w:tcW w:w="2129" w:type="dxa"/>
             <w:tcBorders>
               <w:top w:val="single" w:sz="4" w:space="0" w:color="CCCCCC"/>
               <w:start w:val="single" w:sz="4" w:space="0" w:color="CCCCCC"/>
@@ -1034,7 +999,7 @@
         </w:tc>
         <w:tc>
           <w:tcPr>
-            <w:tcW w:w="1530" w:type="dxa"/>
+            <w:tcW w:w="1531" w:type="dxa"/>
             <w:tcBorders>
               <w:top w:val="single" w:sz="4" w:space="0" w:color="CCCCCC"/>
               <w:start w:val="single" w:sz="4" w:space="0" w:color="CCCCCC"/>
@@ -1105,7 +1070,7 @@
         </w:tc>
         <w:tc>
           <w:tcPr>
-            <w:tcW w:w="2130" w:type="dxa"/>
+            <w:tcW w:w="2129" w:type="dxa"/>
             <w:tcBorders>
               <w:top w:val="single" w:sz="4" w:space="0" w:color="CCCCCC"/>
               <w:start w:val="single" w:sz="4" w:space="0" w:color="CCCCCC"/>
@@ -1207,7 +1172,7 @@
         </w:tc>
         <w:tc>
           <w:tcPr>
-            <w:tcW w:w="1530" w:type="dxa"/>
+            <w:tcW w:w="1531" w:type="dxa"/>
             <w:tcBorders>
               <w:top w:val="single" w:sz="4" w:space="0" w:color="CCCCCC"/>
               <w:start w:val="single" w:sz="4" w:space="0" w:color="CCCCCC"/>
@@ -1278,7 +1243,7 @@
         </w:tc>
         <w:tc>
           <w:tcPr>
-            <w:tcW w:w="2130" w:type="dxa"/>
+            <w:tcW w:w="2129" w:type="dxa"/>
             <w:tcBorders>
               <w:top w:val="single" w:sz="4" w:space="0" w:color="CCCCCC"/>
               <w:start w:val="single" w:sz="4" w:space="0" w:color="CCCCCC"/>
@@ -1370,7 +1335,7 @@
         </w:tc>
         <w:tc>
           <w:tcPr>
-            <w:tcW w:w="1530" w:type="dxa"/>
+            <w:tcW w:w="1531" w:type="dxa"/>
             <w:tcBorders>
               <w:top w:val="single" w:sz="4" w:space="0" w:color="CCCCCC"/>
               <w:start w:val="single" w:sz="4" w:space="0" w:color="CCCCCC"/>
@@ -1509,7 +1474,7 @@
       </w:pPr>
       <w:r>
         <w:rPr>
-          <w:rFonts w:eastAsia="Arial" w:cs="Arial" w:ascii="Arial" w:hAnsi="Arial"/>
+          <w:rFonts w:eastAsia="Arial" w:cs="Arial"/>
           <w:b/>
           <w:bCs/>
           <w:color w:val="1D6F42"/>
@@ -1618,10 +1583,10 @@
         </w:tblCellMar>
       </w:tblPr>
       <w:tblGrid>
-        <w:gridCol w:w="555"/>
-        <w:gridCol w:w="1275"/>
-        <w:gridCol w:w="3960"/>
-        <w:gridCol w:w="1350"/>
+        <w:gridCol w:w="554"/>
+        <w:gridCol w:w="1456"/>
+        <w:gridCol w:w="3779"/>
+        <w:gridCol w:w="1351"/>
         <w:gridCol w:w="1445"/>
       </w:tblGrid>
       <w:tr>
@@ -1664,7 +1629,7 @@
         <w:trPr/>
         <w:tc>
           <w:tcPr>
-            <w:tcW w:w="555" w:type="dxa"/>
+            <w:tcW w:w="554" w:type="dxa"/>
             <w:tcBorders>
               <w:top w:val="single" w:sz="4" w:space="0" w:color="CCCCCC"/>
               <w:start w:val="single" w:sz="4" w:space="0" w:color="CCCCCC"/>
@@ -1704,7 +1669,7 @@
         </w:tc>
         <w:tc>
           <w:tcPr>
-            <w:tcW w:w="1275" w:type="dxa"/>
+            <w:tcW w:w="1456" w:type="dxa"/>
             <w:tcBorders>
               <w:top w:val="single" w:sz="4" w:space="0" w:color="CCCCCC"/>
               <w:start w:val="single" w:sz="4" w:space="0" w:color="CCCCCC"/>
@@ -1744,7 +1709,7 @@
         </w:tc>
         <w:tc>
           <w:tcPr>
-            <w:tcW w:w="3960" w:type="dxa"/>
+            <w:tcW w:w="3779" w:type="dxa"/>
             <w:tcBorders>
               <w:top w:val="single" w:sz="4" w:space="0" w:color="CCCCCC"/>
               <w:start w:val="single" w:sz="4" w:space="0" w:color="CCCCCC"/>
@@ -1784,7 +1749,7 @@
         </w:tc>
         <w:tc>
           <w:tcPr>
-            <w:tcW w:w="1350" w:type="dxa"/>
+            <w:tcW w:w="1351" w:type="dxa"/>
             <w:tcBorders>
               <w:top w:val="single" w:sz="4" w:space="0" w:color="CCCCCC"/>
               <w:start w:val="single" w:sz="4" w:space="0" w:color="CCCCCC"/>
@@ -1867,26 +1832,26 @@
         <w:trPr/>
         <w:tc>
           <w:tcPr>
-            <w:tcW w:w="555" w:type="dxa"/>
-            <w:tcBorders>
-              <w:top w:val="single" w:sz="4" w:space="0" w:color="CCCCCC"/>
-              <w:start w:val="single" w:sz="4" w:space="0" w:color="CCCCCC"/>
-              <w:bottom w:val="single" w:sz="4" w:space="0" w:color="CCCCCC"/>
-              <w:end w:val="single" w:sz="4" w:space="0" w:color="CCCCCC"/>
-            </w:tcBorders>
-            <w:shd w:fill="FFFFFF" w:val="clear"/>
-            <w:tcMar>
-              <w:top w:w="80" w:type="dxa"/>
-              <w:start w:w="120" w:type="dxa"/>
-              <w:bottom w:w="80" w:type="dxa"/>
-              <w:end w:w="120" w:type="dxa"/>
-            </w:tcMar>
-            <w:vAlign w:val="center"/>
-          </w:tcPr>
-          <w:p>
-            <w:pPr>
-              <w:pStyle w:val="Normal"/>
-              <w:shd w:fill="3FAF46" w:val="clear"/>
+            <w:tcW w:w="554" w:type="dxa"/>
+            <w:tcBorders>
+              <w:top w:val="single" w:sz="4" w:space="0" w:color="CCCCCC"/>
+              <w:start w:val="single" w:sz="4" w:space="0" w:color="CCCCCC"/>
+              <w:bottom w:val="single" w:sz="4" w:space="0" w:color="CCCCCC"/>
+              <w:end w:val="single" w:sz="4" w:space="0" w:color="CCCCCC"/>
+            </w:tcBorders>
+            <w:shd w:fill="FFFFFF" w:val="clear"/>
+            <w:tcMar>
+              <w:top w:w="80" w:type="dxa"/>
+              <w:start w:w="120" w:type="dxa"/>
+              <w:bottom w:w="80" w:type="dxa"/>
+              <w:end w:w="120" w:type="dxa"/>
+            </w:tcMar>
+            <w:vAlign w:val="center"/>
+          </w:tcPr>
+          <w:p>
+            <w:pPr>
+              <w:pStyle w:val="Normal"/>
+              <w:shd w:val="clear" w:fill="3FAF46"/>
               <w:jc w:val="center"/>
               <w:rPr>
                 <w:color w:val="FF0000"/>
@@ -1912,38 +1877,37 @@
         </w:tc>
         <w:tc>
           <w:tcPr>
-            <w:tcW w:w="1275" w:type="dxa"/>
-            <w:tcBorders>
-              <w:top w:val="single" w:sz="4" w:space="0" w:color="CCCCCC"/>
-              <w:start w:val="single" w:sz="4" w:space="0" w:color="CCCCCC"/>
-              <w:bottom w:val="single" w:sz="4" w:space="0" w:color="CCCCCC"/>
-              <w:end w:val="single" w:sz="4" w:space="0" w:color="CCCCCC"/>
-            </w:tcBorders>
-            <w:shd w:fill="FFFFFF" w:val="clear"/>
-            <w:tcMar>
-              <w:top w:w="80" w:type="dxa"/>
-              <w:start w:w="120" w:type="dxa"/>
-              <w:bottom w:w="80" w:type="dxa"/>
-              <w:end w:w="120" w:type="dxa"/>
-            </w:tcMar>
-            <w:vAlign w:val="center"/>
-          </w:tcPr>
-          <w:p>
-            <w:pPr>
-              <w:pStyle w:val="Normal"/>
-              <w:shd w:fill="3FAF46" w:val="clear"/>
-              <w:jc w:val="start"/>
-              <w:rPr>
-                <w:sz w:val="26"/>
-                <w:szCs w:val="26"/>
-              </w:rPr>
-            </w:pPr>
-            <w:r>
-              <w:rPr>
-                <w:rFonts w:eastAsia="Arial" w:cs="Arial"/>
-                <w:b w:val="false"/>
-                <w:bCs w:val="false"/>
-                <w:color w:val="888888"/>
+            <w:tcW w:w="1456" w:type="dxa"/>
+            <w:tcBorders>
+              <w:top w:val="single" w:sz="4" w:space="0" w:color="CCCCCC"/>
+              <w:start w:val="single" w:sz="4" w:space="0" w:color="CCCCCC"/>
+              <w:bottom w:val="single" w:sz="4" w:space="0" w:color="CCCCCC"/>
+              <w:end w:val="single" w:sz="4" w:space="0" w:color="CCCCCC"/>
+            </w:tcBorders>
+            <w:shd w:fill="FFFFFF" w:val="clear"/>
+            <w:tcMar>
+              <w:top w:w="80" w:type="dxa"/>
+              <w:start w:w="120" w:type="dxa"/>
+              <w:bottom w:w="80" w:type="dxa"/>
+              <w:end w:w="120" w:type="dxa"/>
+            </w:tcMar>
+            <w:vAlign w:val="center"/>
+          </w:tcPr>
+          <w:p>
+            <w:pPr>
+              <w:pStyle w:val="Normal"/>
+              <w:shd w:val="clear" w:fill="3FAF46"/>
+              <w:jc w:val="start"/>
+              <w:rPr>
+                <w:color w:val="000000"/>
+              </w:rPr>
+            </w:pPr>
+            <w:r>
+              <w:rPr>
+                <w:rFonts w:eastAsia="Arial" w:cs="Arial"/>
+                <w:b w:val="false"/>
+                <w:bCs w:val="false"/>
+                <w:color w:val="000000"/>
                 <w:sz w:val="26"/>
                 <w:szCs w:val="26"/>
               </w:rPr>
@@ -1953,26 +1917,26 @@
         </w:tc>
         <w:tc>
           <w:tcPr>
-            <w:tcW w:w="3960" w:type="dxa"/>
-            <w:tcBorders>
-              <w:top w:val="single" w:sz="4" w:space="0" w:color="CCCCCC"/>
-              <w:start w:val="single" w:sz="4" w:space="0" w:color="CCCCCC"/>
-              <w:bottom w:val="single" w:sz="4" w:space="0" w:color="CCCCCC"/>
-              <w:end w:val="single" w:sz="4" w:space="0" w:color="CCCCCC"/>
-            </w:tcBorders>
-            <w:shd w:fill="FFFFFF" w:val="clear"/>
-            <w:tcMar>
-              <w:top w:w="80" w:type="dxa"/>
-              <w:start w:w="120" w:type="dxa"/>
-              <w:bottom w:w="80" w:type="dxa"/>
-              <w:end w:w="120" w:type="dxa"/>
-            </w:tcMar>
-            <w:vAlign w:val="center"/>
-          </w:tcPr>
-          <w:p>
-            <w:pPr>
-              <w:pStyle w:val="Normal"/>
-              <w:shd w:fill="3FAF46" w:val="clear"/>
+            <w:tcW w:w="3779" w:type="dxa"/>
+            <w:tcBorders>
+              <w:top w:val="single" w:sz="4" w:space="0" w:color="CCCCCC"/>
+              <w:start w:val="single" w:sz="4" w:space="0" w:color="CCCCCC"/>
+              <w:bottom w:val="single" w:sz="4" w:space="0" w:color="CCCCCC"/>
+              <w:end w:val="single" w:sz="4" w:space="0" w:color="CCCCCC"/>
+            </w:tcBorders>
+            <w:shd w:fill="FFFFFF" w:val="clear"/>
+            <w:tcMar>
+              <w:top w:w="80" w:type="dxa"/>
+              <w:start w:w="120" w:type="dxa"/>
+              <w:bottom w:w="80" w:type="dxa"/>
+              <w:end w:w="120" w:type="dxa"/>
+            </w:tcMar>
+            <w:vAlign w:val="center"/>
+          </w:tcPr>
+          <w:p>
+            <w:pPr>
+              <w:pStyle w:val="Normal"/>
+              <w:shd w:val="clear" w:fill="3FAF46"/>
               <w:jc w:val="start"/>
               <w:rPr>
                 <w:sz w:val="26"/>
@@ -1994,26 +1958,26 @@
         </w:tc>
         <w:tc>
           <w:tcPr>
-            <w:tcW w:w="1350" w:type="dxa"/>
-            <w:tcBorders>
-              <w:top w:val="single" w:sz="4" w:space="0" w:color="CCCCCC"/>
-              <w:start w:val="single" w:sz="4" w:space="0" w:color="CCCCCC"/>
-              <w:bottom w:val="single" w:sz="4" w:space="0" w:color="CCCCCC"/>
-              <w:end w:val="single" w:sz="4" w:space="0" w:color="CCCCCC"/>
-            </w:tcBorders>
-            <w:shd w:fill="FFFFFF" w:val="clear"/>
-            <w:tcMar>
-              <w:top w:w="80" w:type="dxa"/>
-              <w:start w:w="120" w:type="dxa"/>
-              <w:bottom w:w="80" w:type="dxa"/>
-              <w:end w:w="120" w:type="dxa"/>
-            </w:tcMar>
-            <w:vAlign w:val="center"/>
-          </w:tcPr>
-          <w:p>
-            <w:pPr>
-              <w:pStyle w:val="Normal"/>
-              <w:shd w:fill="3FAF46" w:val="clear"/>
+            <w:tcW w:w="1351" w:type="dxa"/>
+            <w:tcBorders>
+              <w:top w:val="single" w:sz="4" w:space="0" w:color="CCCCCC"/>
+              <w:start w:val="single" w:sz="4" w:space="0" w:color="CCCCCC"/>
+              <w:bottom w:val="single" w:sz="4" w:space="0" w:color="CCCCCC"/>
+              <w:end w:val="single" w:sz="4" w:space="0" w:color="CCCCCC"/>
+            </w:tcBorders>
+            <w:shd w:fill="FFFFFF" w:val="clear"/>
+            <w:tcMar>
+              <w:top w:w="80" w:type="dxa"/>
+              <w:start w:w="120" w:type="dxa"/>
+              <w:bottom w:w="80" w:type="dxa"/>
+              <w:end w:w="120" w:type="dxa"/>
+            </w:tcMar>
+            <w:vAlign w:val="center"/>
+          </w:tcPr>
+          <w:p>
+            <w:pPr>
+              <w:pStyle w:val="Normal"/>
+              <w:shd w:val="clear" w:fill="3FAF46"/>
               <w:jc w:val="start"/>
               <w:rPr>
                 <w:sz w:val="26"/>
@@ -2054,7 +2018,7 @@
           <w:p>
             <w:pPr>
               <w:pStyle w:val="Normal"/>
-              <w:shd w:fill="3FAF46" w:val="clear"/>
+              <w:shd w:val="clear" w:fill="3FAF46"/>
               <w:jc w:val="start"/>
               <w:rPr>
                 <w:sz w:val="26"/>
@@ -2090,7 +2054,7 @@
         <w:trPr/>
         <w:tc>
           <w:tcPr>
-            <w:tcW w:w="555" w:type="dxa"/>
+            <w:tcW w:w="554" w:type="dxa"/>
             <w:tcBorders>
               <w:top w:val="single" w:sz="4" w:space="0" w:color="CCCCCC"/>
               <w:start w:val="single" w:sz="4" w:space="0" w:color="CCCCCC"/>
@@ -2111,8 +2075,8 @@
               <w:pStyle w:val="Normal"/>
               <w:jc w:val="center"/>
               <w:rPr>
-                <w:sz w:val="26"/>
-                <w:szCs w:val="26"/>
+                <w:highlight w:val="none"/>
+                <w:shd w:fill="069A2E" w:val="clear"/>
               </w:rPr>
             </w:pPr>
             <w:r>
@@ -2123,6 +2087,7 @@
                 <w:color w:val="999999"/>
                 <w:sz w:val="26"/>
                 <w:szCs w:val="26"/>
+                <w:shd w:fill="069A2E" w:val="clear"/>
               </w:rPr>
               <w:t>☐</w:t>
             </w:r>
@@ -2130,39 +2095,41 @@
         </w:tc>
         <w:tc>
           <w:tcPr>
-            <w:tcW w:w="1275" w:type="dxa"/>
-            <w:tcBorders>
-              <w:top w:val="single" w:sz="4" w:space="0" w:color="CCCCCC"/>
-              <w:start w:val="single" w:sz="4" w:space="0" w:color="CCCCCC"/>
-              <w:bottom w:val="single" w:sz="4" w:space="0" w:color="CCCCCC"/>
-              <w:end w:val="single" w:sz="4" w:space="0" w:color="CCCCCC"/>
-            </w:tcBorders>
-            <w:shd w:fill="FFFFFF" w:val="clear"/>
-            <w:tcMar>
-              <w:top w:w="80" w:type="dxa"/>
-              <w:start w:w="120" w:type="dxa"/>
-              <w:bottom w:w="80" w:type="dxa"/>
-              <w:end w:w="120" w:type="dxa"/>
-            </w:tcMar>
-            <w:vAlign w:val="center"/>
-          </w:tcPr>
-          <w:p>
-            <w:pPr>
-              <w:pStyle w:val="Normal"/>
-              <w:jc w:val="start"/>
-              <w:rPr>
-                <w:sz w:val="26"/>
-                <w:szCs w:val="26"/>
-              </w:rPr>
-            </w:pPr>
-            <w:r>
-              <w:rPr>
-                <w:rFonts w:eastAsia="Arial" w:cs="Arial"/>
-                <w:b w:val="false"/>
-                <w:bCs w:val="false"/>
-                <w:color w:val="888888"/>
-                <w:sz w:val="26"/>
-                <w:szCs w:val="26"/>
+            <w:tcW w:w="1456" w:type="dxa"/>
+            <w:tcBorders>
+              <w:top w:val="single" w:sz="4" w:space="0" w:color="CCCCCC"/>
+              <w:start w:val="single" w:sz="4" w:space="0" w:color="CCCCCC"/>
+              <w:bottom w:val="single" w:sz="4" w:space="0" w:color="CCCCCC"/>
+              <w:end w:val="single" w:sz="4" w:space="0" w:color="CCCCCC"/>
+            </w:tcBorders>
+            <w:shd w:fill="FFFFFF" w:val="clear"/>
+            <w:tcMar>
+              <w:top w:w="80" w:type="dxa"/>
+              <w:start w:w="120" w:type="dxa"/>
+              <w:bottom w:w="80" w:type="dxa"/>
+              <w:end w:w="120" w:type="dxa"/>
+            </w:tcMar>
+            <w:vAlign w:val="center"/>
+          </w:tcPr>
+          <w:p>
+            <w:pPr>
+              <w:pStyle w:val="Normal"/>
+              <w:jc w:val="start"/>
+              <w:rPr>
+                <w:color w:val="000000"/>
+                <w:highlight w:val="none"/>
+                <w:shd w:fill="069A2E" w:val="clear"/>
+              </w:rPr>
+            </w:pPr>
+            <w:r>
+              <w:rPr>
+                <w:rFonts w:eastAsia="Arial" w:cs="Arial"/>
+                <w:b w:val="false"/>
+                <w:bCs w:val="false"/>
+                <w:color w:val="000000"/>
+                <w:sz w:val="26"/>
+                <w:szCs w:val="26"/>
+                <w:shd w:fill="069A2E" w:val="clear"/>
               </w:rPr>
               <w:t>Day 2</w:t>
             </w:r>
@@ -2170,29 +2137,29 @@
         </w:tc>
         <w:tc>
           <w:tcPr>
-            <w:tcW w:w="3960" w:type="dxa"/>
-            <w:tcBorders>
-              <w:top w:val="single" w:sz="4" w:space="0" w:color="CCCCCC"/>
-              <w:start w:val="single" w:sz="4" w:space="0" w:color="CCCCCC"/>
-              <w:bottom w:val="single" w:sz="4" w:space="0" w:color="CCCCCC"/>
-              <w:end w:val="single" w:sz="4" w:space="0" w:color="CCCCCC"/>
-            </w:tcBorders>
-            <w:shd w:fill="FFFFFF" w:val="clear"/>
-            <w:tcMar>
-              <w:top w:w="80" w:type="dxa"/>
-              <w:start w:w="120" w:type="dxa"/>
-              <w:bottom w:w="80" w:type="dxa"/>
-              <w:end w:w="120" w:type="dxa"/>
-            </w:tcMar>
-            <w:vAlign w:val="center"/>
-          </w:tcPr>
-          <w:p>
-            <w:pPr>
-              <w:pStyle w:val="Normal"/>
-              <w:jc w:val="start"/>
-              <w:rPr>
-                <w:sz w:val="26"/>
-                <w:szCs w:val="26"/>
+            <w:tcW w:w="3779" w:type="dxa"/>
+            <w:tcBorders>
+              <w:top w:val="single" w:sz="4" w:space="0" w:color="CCCCCC"/>
+              <w:start w:val="single" w:sz="4" w:space="0" w:color="CCCCCC"/>
+              <w:bottom w:val="single" w:sz="4" w:space="0" w:color="CCCCCC"/>
+              <w:end w:val="single" w:sz="4" w:space="0" w:color="CCCCCC"/>
+            </w:tcBorders>
+            <w:shd w:fill="FFFFFF" w:val="clear"/>
+            <w:tcMar>
+              <w:top w:w="80" w:type="dxa"/>
+              <w:start w:w="120" w:type="dxa"/>
+              <w:bottom w:w="80" w:type="dxa"/>
+              <w:end w:w="120" w:type="dxa"/>
+            </w:tcMar>
+            <w:vAlign w:val="center"/>
+          </w:tcPr>
+          <w:p>
+            <w:pPr>
+              <w:pStyle w:val="Normal"/>
+              <w:jc w:val="start"/>
+              <w:rPr>
+                <w:highlight w:val="none"/>
+                <w:shd w:fill="069A2E" w:val="clear"/>
               </w:rPr>
             </w:pPr>
             <w:r>
@@ -2203,6 +2170,7 @@
                 <w:color w:val="222222"/>
                 <w:sz w:val="26"/>
                 <w:szCs w:val="26"/>
+                <w:shd w:fill="069A2E" w:val="clear"/>
               </w:rPr>
               <w:t>Git init, add, commit, status — practice in terminal</w:t>
             </w:r>
@@ -2210,29 +2178,29 @@
         </w:tc>
         <w:tc>
           <w:tcPr>
-            <w:tcW w:w="1350" w:type="dxa"/>
-            <w:tcBorders>
-              <w:top w:val="single" w:sz="4" w:space="0" w:color="CCCCCC"/>
-              <w:start w:val="single" w:sz="4" w:space="0" w:color="CCCCCC"/>
-              <w:bottom w:val="single" w:sz="4" w:space="0" w:color="CCCCCC"/>
-              <w:end w:val="single" w:sz="4" w:space="0" w:color="CCCCCC"/>
-            </w:tcBorders>
-            <w:shd w:fill="FFFFFF" w:val="clear"/>
-            <w:tcMar>
-              <w:top w:w="80" w:type="dxa"/>
-              <w:start w:w="120" w:type="dxa"/>
-              <w:bottom w:w="80" w:type="dxa"/>
-              <w:end w:w="120" w:type="dxa"/>
-            </w:tcMar>
-            <w:vAlign w:val="center"/>
-          </w:tcPr>
-          <w:p>
-            <w:pPr>
-              <w:pStyle w:val="Normal"/>
-              <w:jc w:val="start"/>
-              <w:rPr>
-                <w:sz w:val="26"/>
-                <w:szCs w:val="26"/>
+            <w:tcW w:w="1351" w:type="dxa"/>
+            <w:tcBorders>
+              <w:top w:val="single" w:sz="4" w:space="0" w:color="CCCCCC"/>
+              <w:start w:val="single" w:sz="4" w:space="0" w:color="CCCCCC"/>
+              <w:bottom w:val="single" w:sz="4" w:space="0" w:color="CCCCCC"/>
+              <w:end w:val="single" w:sz="4" w:space="0" w:color="CCCCCC"/>
+            </w:tcBorders>
+            <w:shd w:fill="FFFFFF" w:val="clear"/>
+            <w:tcMar>
+              <w:top w:w="80" w:type="dxa"/>
+              <w:start w:w="120" w:type="dxa"/>
+              <w:bottom w:w="80" w:type="dxa"/>
+              <w:end w:w="120" w:type="dxa"/>
+            </w:tcMar>
+            <w:vAlign w:val="center"/>
+          </w:tcPr>
+          <w:p>
+            <w:pPr>
+              <w:pStyle w:val="Normal"/>
+              <w:jc w:val="start"/>
+              <w:rPr>
+                <w:highlight w:val="none"/>
+                <w:shd w:fill="069A2E" w:val="clear"/>
               </w:rPr>
             </w:pPr>
             <w:r>
@@ -2243,6 +2211,7 @@
                 <w:color w:val="555555"/>
                 <w:sz w:val="26"/>
                 <w:szCs w:val="26"/>
+                <w:shd w:fill="069A2E" w:val="clear"/>
               </w:rPr>
               <w:t>1.5 hrs</w:t>
             </w:r>
@@ -2271,8 +2240,8 @@
               <w:pStyle w:val="Normal"/>
               <w:jc w:val="start"/>
               <w:rPr>
-                <w:sz w:val="26"/>
-                <w:szCs w:val="26"/>
+                <w:highlight w:val="none"/>
+                <w:shd w:fill="069A2E" w:val="clear"/>
               </w:rPr>
             </w:pPr>
             <w:r>
@@ -2283,6 +2252,7 @@
                 <w:color w:val="0C447C"/>
                 <w:sz w:val="26"/>
                 <w:szCs w:val="26"/>
+                <w:shd w:fill="069A2E" w:val="clear"/>
               </w:rPr>
               <w:t xml:space="preserve">⌨ </w:t>
             </w:r>
@@ -2294,6 +2264,7 @@
                 <w:color w:val="0C447C"/>
                 <w:sz w:val="26"/>
                 <w:szCs w:val="26"/>
+                <w:shd w:fill="069A2E" w:val="clear"/>
               </w:rPr>
               <w:t>Hands-on</w:t>
             </w:r>
@@ -2304,7 +2275,7 @@
         <w:trPr/>
         <w:tc>
           <w:tcPr>
-            <w:tcW w:w="555" w:type="dxa"/>
+            <w:tcW w:w="554" w:type="dxa"/>
             <w:tcBorders>
               <w:top w:val="single" w:sz="4" w:space="0" w:color="CCCCCC"/>
               <w:start w:val="single" w:sz="4" w:space="0" w:color="CCCCCC"/>
@@ -2344,37 +2315,38 @@
         </w:tc>
         <w:tc>
           <w:tcPr>
-            <w:tcW w:w="1275" w:type="dxa"/>
-            <w:tcBorders>
-              <w:top w:val="single" w:sz="4" w:space="0" w:color="CCCCCC"/>
-              <w:start w:val="single" w:sz="4" w:space="0" w:color="CCCCCC"/>
-              <w:bottom w:val="single" w:sz="4" w:space="0" w:color="CCCCCC"/>
-              <w:end w:val="single" w:sz="4" w:space="0" w:color="CCCCCC"/>
-            </w:tcBorders>
-            <w:shd w:fill="FFFFFF" w:val="clear"/>
-            <w:tcMar>
-              <w:top w:w="80" w:type="dxa"/>
-              <w:start w:w="120" w:type="dxa"/>
-              <w:bottom w:w="80" w:type="dxa"/>
-              <w:end w:w="120" w:type="dxa"/>
-            </w:tcMar>
-            <w:vAlign w:val="center"/>
-          </w:tcPr>
-          <w:p>
-            <w:pPr>
-              <w:pStyle w:val="Normal"/>
-              <w:jc w:val="start"/>
-              <w:rPr>
-                <w:sz w:val="26"/>
-                <w:szCs w:val="26"/>
-              </w:rPr>
-            </w:pPr>
-            <w:r>
-              <w:rPr>
-                <w:rFonts w:eastAsia="Arial" w:cs="Arial"/>
-                <w:b w:val="false"/>
-                <w:bCs w:val="false"/>
-                <w:color w:val="888888"/>
+            <w:tcW w:w="1456" w:type="dxa"/>
+            <w:tcBorders>
+              <w:top w:val="single" w:sz="4" w:space="0" w:color="CCCCCC"/>
+              <w:start w:val="single" w:sz="4" w:space="0" w:color="CCCCCC"/>
+              <w:bottom w:val="single" w:sz="4" w:space="0" w:color="CCCCCC"/>
+              <w:end w:val="single" w:sz="4" w:space="0" w:color="CCCCCC"/>
+            </w:tcBorders>
+            <w:shd w:fill="FFFFFF" w:val="clear"/>
+            <w:tcMar>
+              <w:top w:w="80" w:type="dxa"/>
+              <w:start w:w="120" w:type="dxa"/>
+              <w:bottom w:w="80" w:type="dxa"/>
+              <w:end w:w="120" w:type="dxa"/>
+            </w:tcMar>
+            <w:vAlign w:val="center"/>
+          </w:tcPr>
+          <w:p>
+            <w:pPr>
+              <w:pStyle w:val="Normal"/>
+              <w:jc w:val="start"/>
+              <w:rPr>
+                <w:b/>
+                <w:bCs/>
+                <w:color w:val="000000"/>
+              </w:rPr>
+            </w:pPr>
+            <w:r>
+              <w:rPr>
+                <w:rFonts w:eastAsia="Arial" w:cs="Arial"/>
+                <w:b/>
+                <w:bCs/>
+                <w:color w:val="000000"/>
                 <w:sz w:val="26"/>
                 <w:szCs w:val="26"/>
               </w:rPr>
@@ -2384,7 +2356,7 @@
         </w:tc>
         <w:tc>
           <w:tcPr>
-            <w:tcW w:w="3960" w:type="dxa"/>
+            <w:tcW w:w="3779" w:type="dxa"/>
             <w:tcBorders>
               <w:top w:val="single" w:sz="4" w:space="0" w:color="CCCCCC"/>
               <w:start w:val="single" w:sz="4" w:space="0" w:color="CCCCCC"/>
@@ -2424,7 +2396,7 @@
         </w:tc>
         <w:tc>
           <w:tcPr>
-            <w:tcW w:w="1350" w:type="dxa"/>
+            <w:tcW w:w="1351" w:type="dxa"/>
             <w:tcBorders>
               <w:top w:val="single" w:sz="4" w:space="0" w:color="CCCCCC"/>
               <w:start w:val="single" w:sz="4" w:space="0" w:color="CCCCCC"/>
@@ -2518,7 +2490,7 @@
         <w:trPr/>
         <w:tc>
           <w:tcPr>
-            <w:tcW w:w="555" w:type="dxa"/>
+            <w:tcW w:w="554" w:type="dxa"/>
             <w:tcBorders>
               <w:top w:val="single" w:sz="4" w:space="0" w:color="CCCCCC"/>
               <w:start w:val="single" w:sz="4" w:space="0" w:color="CCCCCC"/>
@@ -2558,37 +2530,38 @@
         </w:tc>
         <w:tc>
           <w:tcPr>
-            <w:tcW w:w="1275" w:type="dxa"/>
-            <w:tcBorders>
-              <w:top w:val="single" w:sz="4" w:space="0" w:color="CCCCCC"/>
-              <w:start w:val="single" w:sz="4" w:space="0" w:color="CCCCCC"/>
-              <w:bottom w:val="single" w:sz="4" w:space="0" w:color="CCCCCC"/>
-              <w:end w:val="single" w:sz="4" w:space="0" w:color="CCCCCC"/>
-            </w:tcBorders>
-            <w:shd w:fill="FFFFFF" w:val="clear"/>
-            <w:tcMar>
-              <w:top w:w="80" w:type="dxa"/>
-              <w:start w:w="120" w:type="dxa"/>
-              <w:bottom w:w="80" w:type="dxa"/>
-              <w:end w:w="120" w:type="dxa"/>
-            </w:tcMar>
-            <w:vAlign w:val="center"/>
-          </w:tcPr>
-          <w:p>
-            <w:pPr>
-              <w:pStyle w:val="Normal"/>
-              <w:jc w:val="start"/>
-              <w:rPr>
-                <w:sz w:val="26"/>
-                <w:szCs w:val="26"/>
-              </w:rPr>
-            </w:pPr>
-            <w:r>
-              <w:rPr>
-                <w:rFonts w:eastAsia="Arial" w:cs="Arial"/>
-                <w:b w:val="false"/>
-                <w:bCs w:val="false"/>
-                <w:color w:val="888888"/>
+            <w:tcW w:w="1456" w:type="dxa"/>
+            <w:tcBorders>
+              <w:top w:val="single" w:sz="4" w:space="0" w:color="CCCCCC"/>
+              <w:start w:val="single" w:sz="4" w:space="0" w:color="CCCCCC"/>
+              <w:bottom w:val="single" w:sz="4" w:space="0" w:color="CCCCCC"/>
+              <w:end w:val="single" w:sz="4" w:space="0" w:color="CCCCCC"/>
+            </w:tcBorders>
+            <w:shd w:fill="FFFFFF" w:val="clear"/>
+            <w:tcMar>
+              <w:top w:w="80" w:type="dxa"/>
+              <w:start w:w="120" w:type="dxa"/>
+              <w:bottom w:w="80" w:type="dxa"/>
+              <w:end w:w="120" w:type="dxa"/>
+            </w:tcMar>
+            <w:vAlign w:val="center"/>
+          </w:tcPr>
+          <w:p>
+            <w:pPr>
+              <w:pStyle w:val="Normal"/>
+              <w:jc w:val="start"/>
+              <w:rPr>
+                <w:b/>
+                <w:bCs/>
+                <w:color w:val="000000"/>
+              </w:rPr>
+            </w:pPr>
+            <w:r>
+              <w:rPr>
+                <w:rFonts w:eastAsia="Arial" w:cs="Arial"/>
+                <w:b/>
+                <w:bCs/>
+                <w:color w:val="000000"/>
                 <w:sz w:val="26"/>
                 <w:szCs w:val="26"/>
               </w:rPr>
@@ -2598,7 +2571,7 @@
         </w:tc>
         <w:tc>
           <w:tcPr>
-            <w:tcW w:w="3960" w:type="dxa"/>
+            <w:tcW w:w="3779" w:type="dxa"/>
             <w:tcBorders>
               <w:top w:val="single" w:sz="4" w:space="0" w:color="CCCCCC"/>
               <w:start w:val="single" w:sz="4" w:space="0" w:color="CCCCCC"/>
@@ -2638,7 +2611,7 @@
         </w:tc>
         <w:tc>
           <w:tcPr>
-            <w:tcW w:w="1350" w:type="dxa"/>
+            <w:tcW w:w="1351" w:type="dxa"/>
             <w:tcBorders>
               <w:top w:val="single" w:sz="4" w:space="0" w:color="CCCCCC"/>
               <w:start w:val="single" w:sz="4" w:space="0" w:color="CCCCCC"/>
@@ -2732,7 +2705,7 @@
         <w:trPr/>
         <w:tc>
           <w:tcPr>
-            <w:tcW w:w="555" w:type="dxa"/>
+            <w:tcW w:w="554" w:type="dxa"/>
             <w:tcBorders>
               <w:top w:val="single" w:sz="4" w:space="0" w:color="CCCCCC"/>
               <w:start w:val="single" w:sz="4" w:space="0" w:color="CCCCCC"/>
@@ -2772,37 +2745,38 @@
         </w:tc>
         <w:tc>
           <w:tcPr>
-            <w:tcW w:w="1275" w:type="dxa"/>
-            <w:tcBorders>
-              <w:top w:val="single" w:sz="4" w:space="0" w:color="CCCCCC"/>
-              <w:start w:val="single" w:sz="4" w:space="0" w:color="CCCCCC"/>
-              <w:bottom w:val="single" w:sz="4" w:space="0" w:color="CCCCCC"/>
-              <w:end w:val="single" w:sz="4" w:space="0" w:color="CCCCCC"/>
-            </w:tcBorders>
-            <w:shd w:fill="FFFFFF" w:val="clear"/>
-            <w:tcMar>
-              <w:top w:w="80" w:type="dxa"/>
-              <w:start w:w="120" w:type="dxa"/>
-              <w:bottom w:w="80" w:type="dxa"/>
-              <w:end w:w="120" w:type="dxa"/>
-            </w:tcMar>
-            <w:vAlign w:val="center"/>
-          </w:tcPr>
-          <w:p>
-            <w:pPr>
-              <w:pStyle w:val="Normal"/>
-              <w:jc w:val="start"/>
-              <w:rPr>
-                <w:sz w:val="26"/>
-                <w:szCs w:val="26"/>
-              </w:rPr>
-            </w:pPr>
-            <w:r>
-              <w:rPr>
-                <w:rFonts w:eastAsia="Arial" w:cs="Arial"/>
-                <w:b w:val="false"/>
-                <w:bCs w:val="false"/>
-                <w:color w:val="888888"/>
+            <w:tcW w:w="1456" w:type="dxa"/>
+            <w:tcBorders>
+              <w:top w:val="single" w:sz="4" w:space="0" w:color="CCCCCC"/>
+              <w:start w:val="single" w:sz="4" w:space="0" w:color="CCCCCC"/>
+              <w:bottom w:val="single" w:sz="4" w:space="0" w:color="CCCCCC"/>
+              <w:end w:val="single" w:sz="4" w:space="0" w:color="CCCCCC"/>
+            </w:tcBorders>
+            <w:shd w:fill="FFFFFF" w:val="clear"/>
+            <w:tcMar>
+              <w:top w:w="80" w:type="dxa"/>
+              <w:start w:w="120" w:type="dxa"/>
+              <w:bottom w:w="80" w:type="dxa"/>
+              <w:end w:w="120" w:type="dxa"/>
+            </w:tcMar>
+            <w:vAlign w:val="center"/>
+          </w:tcPr>
+          <w:p>
+            <w:pPr>
+              <w:pStyle w:val="Normal"/>
+              <w:jc w:val="start"/>
+              <w:rPr>
+                <w:b/>
+                <w:bCs/>
+                <w:color w:val="000000"/>
+              </w:rPr>
+            </w:pPr>
+            <w:r>
+              <w:rPr>
+                <w:rFonts w:eastAsia="Arial" w:cs="Arial"/>
+                <w:b/>
+                <w:bCs/>
+                <w:color w:val="000000"/>
                 <w:sz w:val="26"/>
                 <w:szCs w:val="26"/>
               </w:rPr>
@@ -2812,7 +2786,7 @@
         </w:tc>
         <w:tc>
           <w:tcPr>
-            <w:tcW w:w="3960" w:type="dxa"/>
+            <w:tcW w:w="3779" w:type="dxa"/>
             <w:tcBorders>
               <w:top w:val="single" w:sz="4" w:space="0" w:color="CCCCCC"/>
               <w:start w:val="single" w:sz="4" w:space="0" w:color="CCCCCC"/>
@@ -2852,7 +2826,7 @@
         </w:tc>
         <w:tc>
           <w:tcPr>
-            <w:tcW w:w="1350" w:type="dxa"/>
+            <w:tcW w:w="1351" w:type="dxa"/>
             <w:tcBorders>
               <w:top w:val="single" w:sz="4" w:space="0" w:color="CCCCCC"/>
               <w:start w:val="single" w:sz="4" w:space="0" w:color="CCCCCC"/>
@@ -2946,7 +2920,7 @@
         <w:trPr/>
         <w:tc>
           <w:tcPr>
-            <w:tcW w:w="555" w:type="dxa"/>
+            <w:tcW w:w="554" w:type="dxa"/>
             <w:tcBorders>
               <w:top w:val="single" w:sz="4" w:space="0" w:color="CCCCCC"/>
               <w:start w:val="single" w:sz="4" w:space="0" w:color="CCCCCC"/>
@@ -2986,37 +2960,38 @@
         </w:tc>
         <w:tc>
           <w:tcPr>
-            <w:tcW w:w="1275" w:type="dxa"/>
-            <w:tcBorders>
-              <w:top w:val="single" w:sz="4" w:space="0" w:color="CCCCCC"/>
-              <w:start w:val="single" w:sz="4" w:space="0" w:color="CCCCCC"/>
-              <w:bottom w:val="single" w:sz="4" w:space="0" w:color="CCCCCC"/>
-              <w:end w:val="single" w:sz="4" w:space="0" w:color="CCCCCC"/>
-            </w:tcBorders>
-            <w:shd w:fill="FFFFFF" w:val="clear"/>
-            <w:tcMar>
-              <w:top w:w="80" w:type="dxa"/>
-              <w:start w:w="120" w:type="dxa"/>
-              <w:bottom w:w="80" w:type="dxa"/>
-              <w:end w:w="120" w:type="dxa"/>
-            </w:tcMar>
-            <w:vAlign w:val="center"/>
-          </w:tcPr>
-          <w:p>
-            <w:pPr>
-              <w:pStyle w:val="Normal"/>
-              <w:jc w:val="start"/>
-              <w:rPr>
-                <w:sz w:val="26"/>
-                <w:szCs w:val="26"/>
-              </w:rPr>
-            </w:pPr>
-            <w:r>
-              <w:rPr>
-                <w:rFonts w:eastAsia="Arial" w:cs="Arial"/>
-                <w:b w:val="false"/>
-                <w:bCs w:val="false"/>
-                <w:color w:val="888888"/>
+            <w:tcW w:w="1456" w:type="dxa"/>
+            <w:tcBorders>
+              <w:top w:val="single" w:sz="4" w:space="0" w:color="CCCCCC"/>
+              <w:start w:val="single" w:sz="4" w:space="0" w:color="CCCCCC"/>
+              <w:bottom w:val="single" w:sz="4" w:space="0" w:color="CCCCCC"/>
+              <w:end w:val="single" w:sz="4" w:space="0" w:color="CCCCCC"/>
+            </w:tcBorders>
+            <w:shd w:fill="FFFFFF" w:val="clear"/>
+            <w:tcMar>
+              <w:top w:w="80" w:type="dxa"/>
+              <w:start w:w="120" w:type="dxa"/>
+              <w:bottom w:w="80" w:type="dxa"/>
+              <w:end w:w="120" w:type="dxa"/>
+            </w:tcMar>
+            <w:vAlign w:val="center"/>
+          </w:tcPr>
+          <w:p>
+            <w:pPr>
+              <w:pStyle w:val="Normal"/>
+              <w:jc w:val="start"/>
+              <w:rPr>
+                <w:b/>
+                <w:bCs/>
+                <w:color w:val="000000"/>
+              </w:rPr>
+            </w:pPr>
+            <w:r>
+              <w:rPr>
+                <w:rFonts w:eastAsia="Arial" w:cs="Arial"/>
+                <w:b/>
+                <w:bCs/>
+                <w:color w:val="000000"/>
                 <w:sz w:val="26"/>
                 <w:szCs w:val="26"/>
               </w:rPr>
@@ -3026,7 +3001,7 @@
         </w:tc>
         <w:tc>
           <w:tcPr>
-            <w:tcW w:w="3960" w:type="dxa"/>
+            <w:tcW w:w="3779" w:type="dxa"/>
             <w:tcBorders>
               <w:top w:val="single" w:sz="4" w:space="0" w:color="CCCCCC"/>
               <w:start w:val="single" w:sz="4" w:space="0" w:color="CCCCCC"/>
@@ -3066,7 +3041,7 @@
         </w:tc>
         <w:tc>
           <w:tcPr>
-            <w:tcW w:w="1350" w:type="dxa"/>
+            <w:tcW w:w="1351" w:type="dxa"/>
             <w:tcBorders>
               <w:top w:val="single" w:sz="4" w:space="0" w:color="CCCCCC"/>
               <w:start w:val="single" w:sz="4" w:space="0" w:color="CCCCCC"/>
@@ -3160,7 +3135,7 @@
         <w:trPr/>
         <w:tc>
           <w:tcPr>
-            <w:tcW w:w="555" w:type="dxa"/>
+            <w:tcW w:w="554" w:type="dxa"/>
             <w:tcBorders>
               <w:top w:val="single" w:sz="4" w:space="0" w:color="CCCCCC"/>
               <w:start w:val="single" w:sz="4" w:space="0" w:color="CCCCCC"/>
@@ -3200,37 +3175,38 @@
         </w:tc>
         <w:tc>
           <w:tcPr>
-            <w:tcW w:w="1275" w:type="dxa"/>
-            <w:tcBorders>
-              <w:top w:val="single" w:sz="4" w:space="0" w:color="CCCCCC"/>
-              <w:start w:val="single" w:sz="4" w:space="0" w:color="CCCCCC"/>
-              <w:bottom w:val="single" w:sz="4" w:space="0" w:color="CCCCCC"/>
-              <w:end w:val="single" w:sz="4" w:space="0" w:color="CCCCCC"/>
-            </w:tcBorders>
-            <w:shd w:fill="FFFFFF" w:val="clear"/>
-            <w:tcMar>
-              <w:top w:w="80" w:type="dxa"/>
-              <w:start w:w="120" w:type="dxa"/>
-              <w:bottom w:w="80" w:type="dxa"/>
-              <w:end w:w="120" w:type="dxa"/>
-            </w:tcMar>
-            <w:vAlign w:val="center"/>
-          </w:tcPr>
-          <w:p>
-            <w:pPr>
-              <w:pStyle w:val="Normal"/>
-              <w:jc w:val="start"/>
-              <w:rPr>
-                <w:sz w:val="26"/>
-                <w:szCs w:val="26"/>
-              </w:rPr>
-            </w:pPr>
-            <w:r>
-              <w:rPr>
-                <w:rFonts w:eastAsia="Arial" w:cs="Arial"/>
-                <w:b w:val="false"/>
-                <w:bCs w:val="false"/>
-                <w:color w:val="888888"/>
+            <w:tcW w:w="1456" w:type="dxa"/>
+            <w:tcBorders>
+              <w:top w:val="single" w:sz="4" w:space="0" w:color="CCCCCC"/>
+              <w:start w:val="single" w:sz="4" w:space="0" w:color="CCCCCC"/>
+              <w:bottom w:val="single" w:sz="4" w:space="0" w:color="CCCCCC"/>
+              <w:end w:val="single" w:sz="4" w:space="0" w:color="CCCCCC"/>
+            </w:tcBorders>
+            <w:shd w:fill="FFFFFF" w:val="clear"/>
+            <w:tcMar>
+              <w:top w:w="80" w:type="dxa"/>
+              <w:start w:w="120" w:type="dxa"/>
+              <w:bottom w:w="80" w:type="dxa"/>
+              <w:end w:w="120" w:type="dxa"/>
+            </w:tcMar>
+            <w:vAlign w:val="center"/>
+          </w:tcPr>
+          <w:p>
+            <w:pPr>
+              <w:pStyle w:val="Normal"/>
+              <w:jc w:val="start"/>
+              <w:rPr>
+                <w:b/>
+                <w:bCs/>
+                <w:color w:val="000000"/>
+              </w:rPr>
+            </w:pPr>
+            <w:r>
+              <w:rPr>
+                <w:rFonts w:eastAsia="Arial" w:cs="Arial"/>
+                <w:b/>
+                <w:bCs/>
+                <w:color w:val="000000"/>
                 <w:sz w:val="26"/>
                 <w:szCs w:val="26"/>
               </w:rPr>
@@ -3240,7 +3216,7 @@
         </w:tc>
         <w:tc>
           <w:tcPr>
-            <w:tcW w:w="3960" w:type="dxa"/>
+            <w:tcW w:w="3779" w:type="dxa"/>
             <w:tcBorders>
               <w:top w:val="single" w:sz="4" w:space="0" w:color="CCCCCC"/>
               <w:start w:val="single" w:sz="4" w:space="0" w:color="CCCCCC"/>
@@ -3280,7 +3256,7 @@
         </w:tc>
         <w:tc>
           <w:tcPr>
-            <w:tcW w:w="1350" w:type="dxa"/>
+            <w:tcW w:w="1351" w:type="dxa"/>
             <w:tcBorders>
               <w:top w:val="single" w:sz="4" w:space="0" w:color="CCCCCC"/>
               <w:start w:val="single" w:sz="4" w:space="0" w:color="CCCCCC"/>
@@ -3374,7 +3350,7 @@
         <w:trPr/>
         <w:tc>
           <w:tcPr>
-            <w:tcW w:w="555" w:type="dxa"/>
+            <w:tcW w:w="554" w:type="dxa"/>
             <w:tcBorders>
               <w:top w:val="single" w:sz="4" w:space="0" w:color="CCCCCC"/>
               <w:start w:val="single" w:sz="4" w:space="0" w:color="CCCCCC"/>
@@ -3414,37 +3390,38 @@
         </w:tc>
         <w:tc>
           <w:tcPr>
-            <w:tcW w:w="1275" w:type="dxa"/>
-            <w:tcBorders>
-              <w:top w:val="single" w:sz="4" w:space="0" w:color="CCCCCC"/>
-              <w:start w:val="single" w:sz="4" w:space="0" w:color="CCCCCC"/>
-              <w:bottom w:val="single" w:sz="4" w:space="0" w:color="CCCCCC"/>
-              <w:end w:val="single" w:sz="4" w:space="0" w:color="CCCCCC"/>
-            </w:tcBorders>
-            <w:shd w:fill="FFFFFF" w:val="clear"/>
-            <w:tcMar>
-              <w:top w:w="80" w:type="dxa"/>
-              <w:start w:w="120" w:type="dxa"/>
-              <w:bottom w:w="80" w:type="dxa"/>
-              <w:end w:w="120" w:type="dxa"/>
-            </w:tcMar>
-            <w:vAlign w:val="center"/>
-          </w:tcPr>
-          <w:p>
-            <w:pPr>
-              <w:pStyle w:val="Normal"/>
-              <w:jc w:val="start"/>
-              <w:rPr>
-                <w:sz w:val="26"/>
-                <w:szCs w:val="26"/>
-              </w:rPr>
-            </w:pPr>
-            <w:r>
-              <w:rPr>
-                <w:rFonts w:eastAsia="Arial" w:cs="Arial"/>
-                <w:b w:val="false"/>
-                <w:bCs w:val="false"/>
-                <w:color w:val="888888"/>
+            <w:tcW w:w="1456" w:type="dxa"/>
+            <w:tcBorders>
+              <w:top w:val="single" w:sz="4" w:space="0" w:color="CCCCCC"/>
+              <w:start w:val="single" w:sz="4" w:space="0" w:color="CCCCCC"/>
+              <w:bottom w:val="single" w:sz="4" w:space="0" w:color="CCCCCC"/>
+              <w:end w:val="single" w:sz="4" w:space="0" w:color="CCCCCC"/>
+            </w:tcBorders>
+            <w:shd w:fill="FFFFFF" w:val="clear"/>
+            <w:tcMar>
+              <w:top w:w="80" w:type="dxa"/>
+              <w:start w:w="120" w:type="dxa"/>
+              <w:bottom w:w="80" w:type="dxa"/>
+              <w:end w:w="120" w:type="dxa"/>
+            </w:tcMar>
+            <w:vAlign w:val="center"/>
+          </w:tcPr>
+          <w:p>
+            <w:pPr>
+              <w:pStyle w:val="Normal"/>
+              <w:jc w:val="start"/>
+              <w:rPr>
+                <w:b/>
+                <w:bCs/>
+                <w:color w:val="000000"/>
+              </w:rPr>
+            </w:pPr>
+            <w:r>
+              <w:rPr>
+                <w:rFonts w:eastAsia="Arial" w:cs="Arial"/>
+                <w:b/>
+                <w:bCs/>
+                <w:color w:val="000000"/>
                 <w:sz w:val="26"/>
                 <w:szCs w:val="26"/>
               </w:rPr>
@@ -3454,7 +3431,7 @@
         </w:tc>
         <w:tc>
           <w:tcPr>
-            <w:tcW w:w="3960" w:type="dxa"/>
+            <w:tcW w:w="3779" w:type="dxa"/>
             <w:tcBorders>
               <w:top w:val="single" w:sz="4" w:space="0" w:color="CCCCCC"/>
               <w:start w:val="single" w:sz="4" w:space="0" w:color="CCCCCC"/>
@@ -3494,7 +3471,7 @@
         </w:tc>
         <w:tc>
           <w:tcPr>
-            <w:tcW w:w="1350" w:type="dxa"/>
+            <w:tcW w:w="1351" w:type="dxa"/>
             <w:tcBorders>
               <w:top w:val="single" w:sz="4" w:space="0" w:color="CCCCCC"/>
               <w:start w:val="single" w:sz="4" w:space="0" w:color="CCCCCC"/>
@@ -3588,7 +3565,7 @@
         <w:trPr/>
         <w:tc>
           <w:tcPr>
-            <w:tcW w:w="555" w:type="dxa"/>
+            <w:tcW w:w="554" w:type="dxa"/>
             <w:tcBorders>
               <w:top w:val="single" w:sz="4" w:space="0" w:color="CCCCCC"/>
               <w:start w:val="single" w:sz="4" w:space="0" w:color="CCCCCC"/>
@@ -3628,37 +3605,38 @@
         </w:tc>
         <w:tc>
           <w:tcPr>
-            <w:tcW w:w="1275" w:type="dxa"/>
-            <w:tcBorders>
-              <w:top w:val="single" w:sz="4" w:space="0" w:color="CCCCCC"/>
-              <w:start w:val="single" w:sz="4" w:space="0" w:color="CCCCCC"/>
-              <w:bottom w:val="single" w:sz="4" w:space="0" w:color="CCCCCC"/>
-              <w:end w:val="single" w:sz="4" w:space="0" w:color="CCCCCC"/>
-            </w:tcBorders>
-            <w:shd w:fill="FFFFFF" w:val="clear"/>
-            <w:tcMar>
-              <w:top w:w="80" w:type="dxa"/>
-              <w:start w:w="120" w:type="dxa"/>
-              <w:bottom w:w="80" w:type="dxa"/>
-              <w:end w:w="120" w:type="dxa"/>
-            </w:tcMar>
-            <w:vAlign w:val="center"/>
-          </w:tcPr>
-          <w:p>
-            <w:pPr>
-              <w:pStyle w:val="Normal"/>
-              <w:jc w:val="start"/>
-              <w:rPr>
-                <w:sz w:val="26"/>
-                <w:szCs w:val="26"/>
-              </w:rPr>
-            </w:pPr>
-            <w:r>
-              <w:rPr>
-                <w:rFonts w:eastAsia="Arial" w:cs="Arial"/>
-                <w:b w:val="false"/>
-                <w:bCs w:val="false"/>
-                <w:color w:val="888888"/>
+            <w:tcW w:w="1456" w:type="dxa"/>
+            <w:tcBorders>
+              <w:top w:val="single" w:sz="4" w:space="0" w:color="CCCCCC"/>
+              <w:start w:val="single" w:sz="4" w:space="0" w:color="CCCCCC"/>
+              <w:bottom w:val="single" w:sz="4" w:space="0" w:color="CCCCCC"/>
+              <w:end w:val="single" w:sz="4" w:space="0" w:color="CCCCCC"/>
+            </w:tcBorders>
+            <w:shd w:fill="FFFFFF" w:val="clear"/>
+            <w:tcMar>
+              <w:top w:w="80" w:type="dxa"/>
+              <w:start w:w="120" w:type="dxa"/>
+              <w:bottom w:w="80" w:type="dxa"/>
+              <w:end w:w="120" w:type="dxa"/>
+            </w:tcMar>
+            <w:vAlign w:val="center"/>
+          </w:tcPr>
+          <w:p>
+            <w:pPr>
+              <w:pStyle w:val="Normal"/>
+              <w:jc w:val="start"/>
+              <w:rPr>
+                <w:b/>
+                <w:bCs/>
+                <w:color w:val="000000"/>
+              </w:rPr>
+            </w:pPr>
+            <w:r>
+              <w:rPr>
+                <w:rFonts w:eastAsia="Arial" w:cs="Arial"/>
+                <w:b/>
+                <w:bCs/>
+                <w:color w:val="000000"/>
                 <w:sz w:val="26"/>
                 <w:szCs w:val="26"/>
               </w:rPr>
@@ -3668,7 +3646,7 @@
         </w:tc>
         <w:tc>
           <w:tcPr>
-            <w:tcW w:w="3960" w:type="dxa"/>
+            <w:tcW w:w="3779" w:type="dxa"/>
             <w:tcBorders>
               <w:top w:val="single" w:sz="4" w:space="0" w:color="CCCCCC"/>
               <w:start w:val="single" w:sz="4" w:space="0" w:color="CCCCCC"/>
@@ -3708,7 +3686,7 @@
         </w:tc>
         <w:tc>
           <w:tcPr>
-            <w:tcW w:w="1350" w:type="dxa"/>
+            <w:tcW w:w="1351" w:type="dxa"/>
             <w:tcBorders>
               <w:top w:val="single" w:sz="4" w:space="0" w:color="CCCCCC"/>
               <w:start w:val="single" w:sz="4" w:space="0" w:color="CCCCCC"/>
@@ -3802,7 +3780,7 @@
         <w:trPr/>
         <w:tc>
           <w:tcPr>
-            <w:tcW w:w="555" w:type="dxa"/>
+            <w:tcW w:w="554" w:type="dxa"/>
             <w:tcBorders>
               <w:top w:val="single" w:sz="4" w:space="0" w:color="CCCCCC"/>
               <w:start w:val="single" w:sz="4" w:space="0" w:color="CCCCCC"/>
@@ -3842,37 +3820,38 @@
         </w:tc>
         <w:tc>
           <w:tcPr>
-            <w:tcW w:w="1275" w:type="dxa"/>
-            <w:tcBorders>
-              <w:top w:val="single" w:sz="4" w:space="0" w:color="CCCCCC"/>
-              <w:start w:val="single" w:sz="4" w:space="0" w:color="CCCCCC"/>
-              <w:bottom w:val="single" w:sz="4" w:space="0" w:color="CCCCCC"/>
-              <w:end w:val="single" w:sz="4" w:space="0" w:color="CCCCCC"/>
-            </w:tcBorders>
-            <w:shd w:fill="FFFFFF" w:val="clear"/>
-            <w:tcMar>
-              <w:top w:w="80" w:type="dxa"/>
-              <w:start w:w="120" w:type="dxa"/>
-              <w:bottom w:w="80" w:type="dxa"/>
-              <w:end w:w="120" w:type="dxa"/>
-            </w:tcMar>
-            <w:vAlign w:val="center"/>
-          </w:tcPr>
-          <w:p>
-            <w:pPr>
-              <w:pStyle w:val="Normal"/>
-              <w:jc w:val="start"/>
-              <w:rPr>
-                <w:sz w:val="26"/>
-                <w:szCs w:val="26"/>
-              </w:rPr>
-            </w:pPr>
-            <w:r>
-              <w:rPr>
-                <w:rFonts w:eastAsia="Arial" w:cs="Arial"/>
-                <w:b w:val="false"/>
-                <w:bCs w:val="false"/>
-                <w:color w:val="888888"/>
+            <w:tcW w:w="1456" w:type="dxa"/>
+            <w:tcBorders>
+              <w:top w:val="single" w:sz="4" w:space="0" w:color="CCCCCC"/>
+              <w:start w:val="single" w:sz="4" w:space="0" w:color="CCCCCC"/>
+              <w:bottom w:val="single" w:sz="4" w:space="0" w:color="CCCCCC"/>
+              <w:end w:val="single" w:sz="4" w:space="0" w:color="CCCCCC"/>
+            </w:tcBorders>
+            <w:shd w:fill="FFFFFF" w:val="clear"/>
+            <w:tcMar>
+              <w:top w:w="80" w:type="dxa"/>
+              <w:start w:w="120" w:type="dxa"/>
+              <w:bottom w:w="80" w:type="dxa"/>
+              <w:end w:w="120" w:type="dxa"/>
+            </w:tcMar>
+            <w:vAlign w:val="center"/>
+          </w:tcPr>
+          <w:p>
+            <w:pPr>
+              <w:pStyle w:val="Normal"/>
+              <w:jc w:val="start"/>
+              <w:rPr>
+                <w:b/>
+                <w:bCs/>
+                <w:color w:val="000000"/>
+              </w:rPr>
+            </w:pPr>
+            <w:r>
+              <w:rPr>
+                <w:rFonts w:eastAsia="Arial" w:cs="Arial"/>
+                <w:b/>
+                <w:bCs/>
+                <w:color w:val="000000"/>
                 <w:sz w:val="26"/>
                 <w:szCs w:val="26"/>
               </w:rPr>
@@ -3882,7 +3861,7 @@
         </w:tc>
         <w:tc>
           <w:tcPr>
-            <w:tcW w:w="3960" w:type="dxa"/>
+            <w:tcW w:w="3779" w:type="dxa"/>
             <w:tcBorders>
               <w:top w:val="single" w:sz="4" w:space="0" w:color="CCCCCC"/>
               <w:start w:val="single" w:sz="4" w:space="0" w:color="CCCCCC"/>
@@ -3922,7 +3901,7 @@
         </w:tc>
         <w:tc>
           <w:tcPr>
-            <w:tcW w:w="1350" w:type="dxa"/>
+            <w:tcW w:w="1351" w:type="dxa"/>
             <w:tcBorders>
               <w:top w:val="single" w:sz="4" w:space="0" w:color="CCCCCC"/>
               <w:start w:val="single" w:sz="4" w:space="0" w:color="CCCCCC"/>
@@ -4016,7 +3995,7 @@
         <w:trPr/>
         <w:tc>
           <w:tcPr>
-            <w:tcW w:w="555" w:type="dxa"/>
+            <w:tcW w:w="554" w:type="dxa"/>
             <w:tcBorders>
               <w:top w:val="single" w:sz="4" w:space="0" w:color="CCCCCC"/>
               <w:start w:val="single" w:sz="4" w:space="0" w:color="CCCCCC"/>
@@ -4056,37 +4035,38 @@
         </w:tc>
         <w:tc>
           <w:tcPr>
-            <w:tcW w:w="1275" w:type="dxa"/>
-            <w:tcBorders>
-              <w:top w:val="single" w:sz="4" w:space="0" w:color="CCCCCC"/>
-              <w:start w:val="single" w:sz="4" w:space="0" w:color="CCCCCC"/>
-              <w:bottom w:val="single" w:sz="4" w:space="0" w:color="CCCCCC"/>
-              <w:end w:val="single" w:sz="4" w:space="0" w:color="CCCCCC"/>
-            </w:tcBorders>
-            <w:shd w:fill="FFFFFF" w:val="clear"/>
-            <w:tcMar>
-              <w:top w:w="80" w:type="dxa"/>
-              <w:start w:w="120" w:type="dxa"/>
-              <w:bottom w:w="80" w:type="dxa"/>
-              <w:end w:w="120" w:type="dxa"/>
-            </w:tcMar>
-            <w:vAlign w:val="center"/>
-          </w:tcPr>
-          <w:p>
-            <w:pPr>
-              <w:pStyle w:val="Normal"/>
-              <w:jc w:val="start"/>
-              <w:rPr>
-                <w:sz w:val="26"/>
-                <w:szCs w:val="26"/>
-              </w:rPr>
-            </w:pPr>
-            <w:r>
-              <w:rPr>
-                <w:rFonts w:eastAsia="Arial" w:cs="Arial"/>
-                <w:b w:val="false"/>
-                <w:bCs w:val="false"/>
-                <w:color w:val="888888"/>
+            <w:tcW w:w="1456" w:type="dxa"/>
+            <w:tcBorders>
+              <w:top w:val="single" w:sz="4" w:space="0" w:color="CCCCCC"/>
+              <w:start w:val="single" w:sz="4" w:space="0" w:color="CCCCCC"/>
+              <w:bottom w:val="single" w:sz="4" w:space="0" w:color="CCCCCC"/>
+              <w:end w:val="single" w:sz="4" w:space="0" w:color="CCCCCC"/>
+            </w:tcBorders>
+            <w:shd w:fill="FFFFFF" w:val="clear"/>
+            <w:tcMar>
+              <w:top w:w="80" w:type="dxa"/>
+              <w:start w:w="120" w:type="dxa"/>
+              <w:bottom w:w="80" w:type="dxa"/>
+              <w:end w:w="120" w:type="dxa"/>
+            </w:tcMar>
+            <w:vAlign w:val="center"/>
+          </w:tcPr>
+          <w:p>
+            <w:pPr>
+              <w:pStyle w:val="Normal"/>
+              <w:jc w:val="start"/>
+              <w:rPr>
+                <w:b/>
+                <w:bCs/>
+                <w:color w:val="000000"/>
+              </w:rPr>
+            </w:pPr>
+            <w:r>
+              <w:rPr>
+                <w:rFonts w:eastAsia="Arial" w:cs="Arial"/>
+                <w:b/>
+                <w:bCs/>
+                <w:color w:val="000000"/>
                 <w:sz w:val="26"/>
                 <w:szCs w:val="26"/>
               </w:rPr>
@@ -4096,7 +4076,7 @@
         </w:tc>
         <w:tc>
           <w:tcPr>
-            <w:tcW w:w="3960" w:type="dxa"/>
+            <w:tcW w:w="3779" w:type="dxa"/>
             <w:tcBorders>
               <w:top w:val="single" w:sz="4" w:space="0" w:color="CCCCCC"/>
               <w:start w:val="single" w:sz="4" w:space="0" w:color="CCCCCC"/>
@@ -4136,7 +4116,7 @@
         </w:tc>
         <w:tc>
           <w:tcPr>
-            <w:tcW w:w="1350" w:type="dxa"/>
+            <w:tcW w:w="1351" w:type="dxa"/>
             <w:tcBorders>
               <w:top w:val="single" w:sz="4" w:space="0" w:color="CCCCCC"/>
               <w:start w:val="single" w:sz="4" w:space="0" w:color="CCCCCC"/>
@@ -4227,10 +4207,12 @@
         </w:tc>
       </w:tr>
       <w:tr>
-        <w:trPr/>
-        <w:tc>
-          <w:tcPr>
-            <w:tcW w:w="555" w:type="dxa"/>
+        <w:trPr>
+          <w:trHeight w:val="810" w:hRule="atLeast"/>
+        </w:trPr>
+        <w:tc>
+          <w:tcPr>
+            <w:tcW w:w="554" w:type="dxa"/>
             <w:tcBorders>
               <w:top w:val="single" w:sz="4" w:space="0" w:color="CCCCCC"/>
               <w:start w:val="single" w:sz="4" w:space="0" w:color="CCCCCC"/>
@@ -4270,47 +4252,48 @@
         </w:tc>
         <w:tc>
           <w:tcPr>
-            <w:tcW w:w="1275" w:type="dxa"/>
-            <w:tcBorders>
-              <w:top w:val="single" w:sz="4" w:space="0" w:color="CCCCCC"/>
-              <w:start w:val="single" w:sz="4" w:space="0" w:color="CCCCCC"/>
-              <w:bottom w:val="single" w:sz="4" w:space="0" w:color="CCCCCC"/>
-              <w:end w:val="single" w:sz="4" w:space="0" w:color="CCCCCC"/>
-            </w:tcBorders>
-            <w:shd w:fill="FFFFFF" w:val="clear"/>
-            <w:tcMar>
-              <w:top w:w="80" w:type="dxa"/>
-              <w:start w:w="120" w:type="dxa"/>
-              <w:bottom w:w="80" w:type="dxa"/>
-              <w:end w:w="120" w:type="dxa"/>
-            </w:tcMar>
-            <w:vAlign w:val="center"/>
-          </w:tcPr>
-          <w:p>
-            <w:pPr>
-              <w:pStyle w:val="Normal"/>
-              <w:jc w:val="start"/>
-              <w:rPr>
-                <w:sz w:val="26"/>
-                <w:szCs w:val="26"/>
-              </w:rPr>
-            </w:pPr>
-            <w:r>
-              <w:rPr>
-                <w:rFonts w:eastAsia="Arial" w:cs="Arial"/>
-                <w:b w:val="false"/>
-                <w:bCs w:val="false"/>
-                <w:color w:val="888888"/>
-                <w:sz w:val="26"/>
-                <w:szCs w:val="26"/>
-              </w:rPr>
-              <w:t>Day 12–15</w:t>
-            </w:r>
-          </w:p>
-        </w:tc>
-        <w:tc>
-          <w:tcPr>
-            <w:tcW w:w="3960" w:type="dxa"/>
+            <w:tcW w:w="1456" w:type="dxa"/>
+            <w:tcBorders>
+              <w:top w:val="single" w:sz="4" w:space="0" w:color="CCCCCC"/>
+              <w:start w:val="single" w:sz="4" w:space="0" w:color="CCCCCC"/>
+              <w:bottom w:val="single" w:sz="4" w:space="0" w:color="CCCCCC"/>
+              <w:end w:val="single" w:sz="4" w:space="0" w:color="CCCCCC"/>
+            </w:tcBorders>
+            <w:shd w:fill="FFFFFF" w:val="clear"/>
+            <w:tcMar>
+              <w:top w:w="80" w:type="dxa"/>
+              <w:start w:w="120" w:type="dxa"/>
+              <w:bottom w:w="80" w:type="dxa"/>
+              <w:end w:w="120" w:type="dxa"/>
+            </w:tcMar>
+            <w:vAlign w:val="center"/>
+          </w:tcPr>
+          <w:p>
+            <w:pPr>
+              <w:pStyle w:val="Normal"/>
+              <w:jc w:val="start"/>
+              <w:rPr>
+                <w:b/>
+                <w:bCs/>
+                <w:color w:val="000000"/>
+              </w:rPr>
+            </w:pPr>
+            <w:r>
+              <w:rPr>
+                <w:rFonts w:eastAsia="Arial" w:cs="Arial"/>
+                <w:b/>
+                <w:bCs/>
+                <w:color w:val="000000"/>
+                <w:sz w:val="26"/>
+                <w:szCs w:val="26"/>
+              </w:rPr>
+              <w:t>Day 12-15</w:t>
+            </w:r>
+          </w:p>
+        </w:tc>
+        <w:tc>
+          <w:tcPr>
+            <w:tcW w:w="3779" w:type="dxa"/>
             <w:tcBorders>
               <w:top w:val="single" w:sz="4" w:space="0" w:color="CCCCCC"/>
               <w:start w:val="single" w:sz="4" w:space="0" w:color="CCCCCC"/>
@@ -4350,7 +4333,7 @@
         </w:tc>
         <w:tc>
           <w:tcPr>
-            <w:tcW w:w="1350" w:type="dxa"/>
+            <w:tcW w:w="1351" w:type="dxa"/>
             <w:tcBorders>
               <w:top w:val="single" w:sz="4" w:space="0" w:color="CCCCCC"/>
               <w:start w:val="single" w:sz="4" w:space="0" w:color="CCCCCC"/>
@@ -4463,7 +4446,7 @@
     <w:p>
       <w:pPr>
         <w:pStyle w:val="Normal"/>
-        <w:spacing w:before="160" w:after="160"/>
+        <w:spacing w:before="0" w:after="160"/>
         <w:rPr>
           <w:sz w:val="26"/>
           <w:szCs w:val="26"/>
@@ -4824,9 +4807,9 @@
       <w:tblGrid>
         <w:gridCol w:w="519"/>
         <w:gridCol w:w="1671"/>
-        <w:gridCol w:w="4680"/>
+        <w:gridCol w:w="4679"/>
         <w:gridCol w:w="1260"/>
-        <w:gridCol w:w="1950"/>
+        <w:gridCol w:w="1951"/>
       </w:tblGrid>
       <w:tr>
         <w:trPr/>
@@ -4948,7 +4931,7 @@
         </w:tc>
         <w:tc>
           <w:tcPr>
-            <w:tcW w:w="4680" w:type="dxa"/>
+            <w:tcW w:w="4679" w:type="dxa"/>
             <w:tcBorders>
               <w:top w:val="single" w:sz="4" w:space="0" w:color="CCCCCC"/>
               <w:start w:val="single" w:sz="4" w:space="0" w:color="CCCCCC"/>
@@ -5028,7 +5011,7 @@
         </w:tc>
         <w:tc>
           <w:tcPr>
-            <w:tcW w:w="1950" w:type="dxa"/>
+            <w:tcW w:w="1951" w:type="dxa"/>
             <w:tcBorders>
               <w:top w:val="single" w:sz="4" w:space="0" w:color="CCCCCC"/>
               <w:start w:val="single" w:sz="4" w:space="0" w:color="CCCCCC"/>
@@ -5151,7 +5134,7 @@
         </w:tc>
         <w:tc>
           <w:tcPr>
-            <w:tcW w:w="4680" w:type="dxa"/>
+            <w:tcW w:w="4679" w:type="dxa"/>
             <w:tcBorders>
               <w:top w:val="single" w:sz="4" w:space="0" w:color="CCCCCC"/>
               <w:start w:val="single" w:sz="4" w:space="0" w:color="CCCCCC"/>
@@ -5231,7 +5214,7 @@
         </w:tc>
         <w:tc>
           <w:tcPr>
-            <w:tcW w:w="1950" w:type="dxa"/>
+            <w:tcW w:w="1951" w:type="dxa"/>
             <w:tcBorders>
               <w:top w:val="single" w:sz="4" w:space="0" w:color="CCCCCC"/>
               <w:start w:val="single" w:sz="4" w:space="0" w:color="CCCCCC"/>
@@ -5365,7 +5348,7 @@
         </w:tc>
         <w:tc>
           <w:tcPr>
-            <w:tcW w:w="4680" w:type="dxa"/>
+            <w:tcW w:w="4679" w:type="dxa"/>
             <w:tcBorders>
               <w:top w:val="single" w:sz="4" w:space="0" w:color="CCCCCC"/>
               <w:start w:val="single" w:sz="4" w:space="0" w:color="CCCCCC"/>
@@ -5445,7 +5428,7 @@
         </w:tc>
         <w:tc>
           <w:tcPr>
-            <w:tcW w:w="1950" w:type="dxa"/>
+            <w:tcW w:w="1951" w:type="dxa"/>
             <w:tcBorders>
               <w:top w:val="single" w:sz="4" w:space="0" w:color="CCCCCC"/>
               <w:start w:val="single" w:sz="4" w:space="0" w:color="CCCCCC"/>
@@ -5579,7 +5562,7 @@
         </w:tc>
         <w:tc>
           <w:tcPr>
-            <w:tcW w:w="4680" w:type="dxa"/>
+            <w:tcW w:w="4679" w:type="dxa"/>
             <w:tcBorders>
               <w:top w:val="single" w:sz="4" w:space="0" w:color="CCCCCC"/>
               <w:start w:val="single" w:sz="4" w:space="0" w:color="CCCCCC"/>
@@ -5659,7 +5642,7 @@
         </w:tc>
         <w:tc>
           <w:tcPr>
-            <w:tcW w:w="1950" w:type="dxa"/>
+            <w:tcW w:w="1951" w:type="dxa"/>
             <w:tcBorders>
               <w:top w:val="single" w:sz="4" w:space="0" w:color="CCCCCC"/>
               <w:start w:val="single" w:sz="4" w:space="0" w:color="CCCCCC"/>
@@ -5793,7 +5776,7 @@
         </w:tc>
         <w:tc>
           <w:tcPr>
-            <w:tcW w:w="4680" w:type="dxa"/>
+            <w:tcW w:w="4679" w:type="dxa"/>
             <w:tcBorders>
               <w:top w:val="single" w:sz="4" w:space="0" w:color="CCCCCC"/>
               <w:start w:val="single" w:sz="4" w:space="0" w:color="CCCCCC"/>
@@ -5873,7 +5856,7 @@
         </w:tc>
         <w:tc>
           <w:tcPr>
-            <w:tcW w:w="1950" w:type="dxa"/>
+            <w:tcW w:w="1951" w:type="dxa"/>
             <w:tcBorders>
               <w:top w:val="single" w:sz="4" w:space="0" w:color="CCCCCC"/>
               <w:start w:val="single" w:sz="4" w:space="0" w:color="CCCCCC"/>
@@ -6007,7 +5990,7 @@
         </w:tc>
         <w:tc>
           <w:tcPr>
-            <w:tcW w:w="4680" w:type="dxa"/>
+            <w:tcW w:w="4679" w:type="dxa"/>
             <w:tcBorders>
               <w:top w:val="single" w:sz="4" w:space="0" w:color="CCCCCC"/>
               <w:start w:val="single" w:sz="4" w:space="0" w:color="CCCCCC"/>
@@ -6087,7 +6070,7 @@
         </w:tc>
         <w:tc>
           <w:tcPr>
-            <w:tcW w:w="1950" w:type="dxa"/>
+            <w:tcW w:w="1951" w:type="dxa"/>
             <w:tcBorders>
               <w:top w:val="single" w:sz="4" w:space="0" w:color="CCCCCC"/>
               <w:start w:val="single" w:sz="4" w:space="0" w:color="CCCCCC"/>
@@ -6221,7 +6204,7 @@
         </w:tc>
         <w:tc>
           <w:tcPr>
-            <w:tcW w:w="4680" w:type="dxa"/>
+            <w:tcW w:w="4679" w:type="dxa"/>
             <w:tcBorders>
               <w:top w:val="single" w:sz="4" w:space="0" w:color="CCCCCC"/>
               <w:start w:val="single" w:sz="4" w:space="0" w:color="CCCCCC"/>
@@ -6301,7 +6284,7 @@
         </w:tc>
         <w:tc>
           <w:tcPr>
-            <w:tcW w:w="1950" w:type="dxa"/>
+            <w:tcW w:w="1951" w:type="dxa"/>
             <w:tcBorders>
               <w:top w:val="single" w:sz="4" w:space="0" w:color="CCCCCC"/>
               <w:start w:val="single" w:sz="4" w:space="0" w:color="CCCCCC"/>
@@ -6435,7 +6418,7 @@
         </w:tc>
         <w:tc>
           <w:tcPr>
-            <w:tcW w:w="4680" w:type="dxa"/>
+            <w:tcW w:w="4679" w:type="dxa"/>
             <w:tcBorders>
               <w:top w:val="single" w:sz="4" w:space="0" w:color="CCCCCC"/>
               <w:start w:val="single" w:sz="4" w:space="0" w:color="CCCCCC"/>
@@ -6515,7 +6498,7 @@
         </w:tc>
         <w:tc>
           <w:tcPr>
-            <w:tcW w:w="1950" w:type="dxa"/>
+            <w:tcW w:w="1951" w:type="dxa"/>
             <w:tcBorders>
               <w:top w:val="single" w:sz="4" w:space="0" w:color="CCCCCC"/>
               <w:start w:val="single" w:sz="4" w:space="0" w:color="CCCCCC"/>
@@ -6649,7 +6632,7 @@
         </w:tc>
         <w:tc>
           <w:tcPr>
-            <w:tcW w:w="4680" w:type="dxa"/>
+            <w:tcW w:w="4679" w:type="dxa"/>
             <w:tcBorders>
               <w:top w:val="single" w:sz="4" w:space="0" w:color="CCCCCC"/>
               <w:start w:val="single" w:sz="4" w:space="0" w:color="CCCCCC"/>
@@ -6729,7 +6712,7 @@
         </w:tc>
         <w:tc>
           <w:tcPr>
-            <w:tcW w:w="1950" w:type="dxa"/>
+            <w:tcW w:w="1951" w:type="dxa"/>
             <w:tcBorders>
               <w:top w:val="single" w:sz="4" w:space="0" w:color="CCCCCC"/>
               <w:start w:val="single" w:sz="4" w:space="0" w:color="CCCCCC"/>
@@ -6863,7 +6846,7 @@
         </w:tc>
         <w:tc>
           <w:tcPr>
-            <w:tcW w:w="4680" w:type="dxa"/>
+            <w:tcW w:w="4679" w:type="dxa"/>
             <w:tcBorders>
               <w:top w:val="single" w:sz="4" w:space="0" w:color="CCCCCC"/>
               <w:start w:val="single" w:sz="4" w:space="0" w:color="CCCCCC"/>
@@ -6943,7 +6926,7 @@
         </w:tc>
         <w:tc>
           <w:tcPr>
-            <w:tcW w:w="1950" w:type="dxa"/>
+            <w:tcW w:w="1951" w:type="dxa"/>
             <w:tcBorders>
               <w:top w:val="single" w:sz="4" w:space="0" w:color="CCCCCC"/>
               <w:start w:val="single" w:sz="4" w:space="0" w:color="CCCCCC"/>
@@ -7077,7 +7060,7 @@
         </w:tc>
         <w:tc>
           <w:tcPr>
-            <w:tcW w:w="4680" w:type="dxa"/>
+            <w:tcW w:w="4679" w:type="dxa"/>
             <w:tcBorders>
               <w:top w:val="single" w:sz="4" w:space="0" w:color="CCCCCC"/>
               <w:start w:val="single" w:sz="4" w:space="0" w:color="CCCCCC"/>
@@ -7157,7 +7140,7 @@
         </w:tc>
         <w:tc>
           <w:tcPr>
-            <w:tcW w:w="1950" w:type="dxa"/>
+            <w:tcW w:w="1951" w:type="dxa"/>
             <w:tcBorders>
               <w:top w:val="single" w:sz="4" w:space="0" w:color="CCCCCC"/>
               <w:start w:val="single" w:sz="4" w:space="0" w:color="CCCCCC"/>
@@ -7291,7 +7274,7 @@
         </w:tc>
         <w:tc>
           <w:tcPr>
-            <w:tcW w:w="4680" w:type="dxa"/>
+            <w:tcW w:w="4679" w:type="dxa"/>
             <w:tcBorders>
               <w:top w:val="single" w:sz="4" w:space="0" w:color="CCCCCC"/>
               <w:start w:val="single" w:sz="4" w:space="0" w:color="CCCCCC"/>
@@ -7371,7 +7354,7 @@
         </w:tc>
         <w:tc>
           <w:tcPr>
-            <w:tcW w:w="1950" w:type="dxa"/>
+            <w:tcW w:w="1951" w:type="dxa"/>
             <w:tcBorders>
               <w:top w:val="single" w:sz="4" w:space="0" w:color="CCCCCC"/>
               <w:start w:val="single" w:sz="4" w:space="0" w:color="CCCCCC"/>
@@ -7505,7 +7488,7 @@
         </w:tc>
         <w:tc>
           <w:tcPr>
-            <w:tcW w:w="4680" w:type="dxa"/>
+            <w:tcW w:w="4679" w:type="dxa"/>
             <w:tcBorders>
               <w:top w:val="single" w:sz="4" w:space="0" w:color="CCCCCC"/>
               <w:start w:val="single" w:sz="4" w:space="0" w:color="CCCCCC"/>
@@ -7585,7 +7568,7 @@
         </w:tc>
         <w:tc>
           <w:tcPr>
-            <w:tcW w:w="1950" w:type="dxa"/>
+            <w:tcW w:w="1951" w:type="dxa"/>
             <w:tcBorders>
               <w:top w:val="single" w:sz="4" w:space="0" w:color="CCCCCC"/>
               <w:start w:val="single" w:sz="4" w:space="0" w:color="CCCCCC"/>
@@ -7719,7 +7702,7 @@
         </w:tc>
         <w:tc>
           <w:tcPr>
-            <w:tcW w:w="4680" w:type="dxa"/>
+            <w:tcW w:w="4679" w:type="dxa"/>
             <w:tcBorders>
               <w:top w:val="single" w:sz="4" w:space="0" w:color="CCCCCC"/>
               <w:start w:val="single" w:sz="4" w:space="0" w:color="CCCCCC"/>
@@ -7799,7 +7782,7 @@
         </w:tc>
         <w:tc>
           <w:tcPr>
-            <w:tcW w:w="1950" w:type="dxa"/>
+            <w:tcW w:w="1951" w:type="dxa"/>
             <w:tcBorders>
               <w:top w:val="single" w:sz="4" w:space="0" w:color="CCCCCC"/>
               <w:start w:val="single" w:sz="4" w:space="0" w:color="CCCCCC"/>
@@ -7933,7 +7916,7 @@
         </w:tc>
         <w:tc>
           <w:tcPr>
-            <w:tcW w:w="4680" w:type="dxa"/>
+            <w:tcW w:w="4679" w:type="dxa"/>
             <w:tcBorders>
               <w:top w:val="single" w:sz="4" w:space="0" w:color="CCCCCC"/>
               <w:start w:val="single" w:sz="4" w:space="0" w:color="CCCCCC"/>
@@ -8013,7 +7996,7 @@
         </w:tc>
         <w:tc>
           <w:tcPr>
-            <w:tcW w:w="1950" w:type="dxa"/>
+            <w:tcW w:w="1951" w:type="dxa"/>
             <w:tcBorders>
               <w:top w:val="single" w:sz="4" w:space="0" w:color="CCCCCC"/>
               <w:start w:val="single" w:sz="4" w:space="0" w:color="CCCCCC"/>
@@ -8443,10 +8426,10 @@
       </w:tblPr>
       <w:tblGrid>
         <w:gridCol w:w="519"/>
-        <w:gridCol w:w="1671"/>
-        <w:gridCol w:w="3870"/>
-        <w:gridCol w:w="1050"/>
-        <w:gridCol w:w="2520"/>
+        <w:gridCol w:w="1670"/>
+        <w:gridCol w:w="3871"/>
+        <w:gridCol w:w="1049"/>
+        <w:gridCol w:w="2521"/>
       </w:tblGrid>
       <w:tr>
         <w:trPr/>
@@ -8528,7 +8511,7 @@
         </w:tc>
         <w:tc>
           <w:tcPr>
-            <w:tcW w:w="1671" w:type="dxa"/>
+            <w:tcW w:w="1670" w:type="dxa"/>
             <w:tcBorders>
               <w:top w:val="single" w:sz="4" w:space="0" w:color="CCCCCC"/>
               <w:start w:val="single" w:sz="4" w:space="0" w:color="CCCCCC"/>
@@ -8568,7 +8551,7 @@
         </w:tc>
         <w:tc>
           <w:tcPr>
-            <w:tcW w:w="3870" w:type="dxa"/>
+            <w:tcW w:w="3871" w:type="dxa"/>
             <w:tcBorders>
               <w:top w:val="single" w:sz="4" w:space="0" w:color="CCCCCC"/>
               <w:start w:val="single" w:sz="4" w:space="0" w:color="CCCCCC"/>
@@ -8608,7 +8591,7 @@
         </w:tc>
         <w:tc>
           <w:tcPr>
-            <w:tcW w:w="1050" w:type="dxa"/>
+            <w:tcW w:w="1049" w:type="dxa"/>
             <w:tcBorders>
               <w:top w:val="single" w:sz="4" w:space="0" w:color="CCCCCC"/>
               <w:start w:val="single" w:sz="4" w:space="0" w:color="CCCCCC"/>
@@ -8648,7 +8631,7 @@
         </w:tc>
         <w:tc>
           <w:tcPr>
-            <w:tcW w:w="2520" w:type="dxa"/>
+            <w:tcW w:w="2521" w:type="dxa"/>
             <w:tcBorders>
               <w:top w:val="single" w:sz="4" w:space="0" w:color="CCCCCC"/>
               <w:start w:val="single" w:sz="4" w:space="0" w:color="CCCCCC"/>
@@ -8731,7 +8714,7 @@
         </w:tc>
         <w:tc>
           <w:tcPr>
-            <w:tcW w:w="1671" w:type="dxa"/>
+            <w:tcW w:w="1670" w:type="dxa"/>
             <w:tcBorders>
               <w:top w:val="single" w:sz="4" w:space="0" w:color="CCCCCC"/>
               <w:start w:val="single" w:sz="4" w:space="0" w:color="CCCCCC"/>
@@ -8771,7 +8754,7 @@
         </w:tc>
         <w:tc>
           <w:tcPr>
-            <w:tcW w:w="3870" w:type="dxa"/>
+            <w:tcW w:w="3871" w:type="dxa"/>
             <w:tcBorders>
               <w:top w:val="single" w:sz="4" w:space="0" w:color="CCCCCC"/>
               <w:start w:val="single" w:sz="4" w:space="0" w:color="CCCCCC"/>
@@ -8811,7 +8794,7 @@
         </w:tc>
         <w:tc>
           <w:tcPr>
-            <w:tcW w:w="1050" w:type="dxa"/>
+            <w:tcW w:w="1049" w:type="dxa"/>
             <w:tcBorders>
               <w:top w:val="single" w:sz="4" w:space="0" w:color="CCCCCC"/>
               <w:start w:val="single" w:sz="4" w:space="0" w:color="CCCCCC"/>
@@ -8851,7 +8834,7 @@
         </w:tc>
         <w:tc>
           <w:tcPr>
-            <w:tcW w:w="2520" w:type="dxa"/>
+            <w:tcW w:w="2521" w:type="dxa"/>
             <w:tcBorders>
               <w:top w:val="single" w:sz="4" w:space="0" w:color="CCCCCC"/>
               <w:start w:val="single" w:sz="4" w:space="0" w:color="CCCCCC"/>
@@ -8945,7 +8928,7 @@
         </w:tc>
         <w:tc>
           <w:tcPr>
-            <w:tcW w:w="1671" w:type="dxa"/>
+            <w:tcW w:w="1670" w:type="dxa"/>
             <w:tcBorders>
               <w:top w:val="single" w:sz="4" w:space="0" w:color="CCCCCC"/>
               <w:start w:val="single" w:sz="4" w:space="0" w:color="CCCCCC"/>
@@ -8985,7 +8968,7 @@
         </w:tc>
         <w:tc>
           <w:tcPr>
-            <w:tcW w:w="3870" w:type="dxa"/>
+            <w:tcW w:w="3871" w:type="dxa"/>
             <w:tcBorders>
               <w:top w:val="single" w:sz="4" w:space="0" w:color="CCCCCC"/>
               <w:start w:val="single" w:sz="4" w:space="0" w:color="CCCCCC"/>
@@ -9025,7 +9008,7 @@
         </w:tc>
         <w:tc>
           <w:tcPr>
-            <w:tcW w:w="1050" w:type="dxa"/>
+            <w:tcW w:w="1049" w:type="dxa"/>
             <w:tcBorders>
               <w:top w:val="single" w:sz="4" w:space="0" w:color="CCCCCC"/>
               <w:start w:val="single" w:sz="4" w:space="0" w:color="CCCCCC"/>
@@ -9065,7 +9048,7 @@
         </w:tc>
         <w:tc>
           <w:tcPr>
-            <w:tcW w:w="2520" w:type="dxa"/>
+            <w:tcW w:w="2521" w:type="dxa"/>
             <w:tcBorders>
               <w:top w:val="single" w:sz="4" w:space="0" w:color="CCCCCC"/>
               <w:start w:val="single" w:sz="4" w:space="0" w:color="CCCCCC"/>
@@ -9159,7 +9142,7 @@
         </w:tc>
         <w:tc>
           <w:tcPr>
-            <w:tcW w:w="1671" w:type="dxa"/>
+            <w:tcW w:w="1670" w:type="dxa"/>
             <w:tcBorders>
               <w:top w:val="single" w:sz="4" w:space="0" w:color="CCCCCC"/>
               <w:start w:val="single" w:sz="4" w:space="0" w:color="CCCCCC"/>
@@ -9199,7 +9182,7 @@
         </w:tc>
         <w:tc>
           <w:tcPr>
-            <w:tcW w:w="3870" w:type="dxa"/>
+            <w:tcW w:w="3871" w:type="dxa"/>
             <w:tcBorders>
               <w:top w:val="single" w:sz="4" w:space="0" w:color="CCCCCC"/>
               <w:start w:val="single" w:sz="4" w:space="0" w:color="CCCCCC"/>
@@ -9239,7 +9222,7 @@
         </w:tc>
         <w:tc>
           <w:tcPr>
-            <w:tcW w:w="1050" w:type="dxa"/>
+            <w:tcW w:w="1049" w:type="dxa"/>
             <w:tcBorders>
               <w:top w:val="single" w:sz="4" w:space="0" w:color="CCCCCC"/>
               <w:start w:val="single" w:sz="4" w:space="0" w:color="CCCCCC"/>
@@ -9279,7 +9262,7 @@
         </w:tc>
         <w:tc>
           <w:tcPr>
-            <w:tcW w:w="2520" w:type="dxa"/>
+            <w:tcW w:w="2521" w:type="dxa"/>
             <w:tcBorders>
               <w:top w:val="single" w:sz="4" w:space="0" w:color="CCCCCC"/>
               <w:start w:val="single" w:sz="4" w:space="0" w:color="CCCCCC"/>
@@ -9373,7 +9356,7 @@
         </w:tc>
         <w:tc>
           <w:tcPr>
-            <w:tcW w:w="1671" w:type="dxa"/>
+            <w:tcW w:w="1670" w:type="dxa"/>
             <w:tcBorders>
               <w:top w:val="single" w:sz="4" w:space="0" w:color="CCCCCC"/>
               <w:start w:val="single" w:sz="4" w:space="0" w:color="CCCCCC"/>
@@ -9413,7 +9396,7 @@
         </w:tc>
         <w:tc>
           <w:tcPr>
-            <w:tcW w:w="3870" w:type="dxa"/>
+            <w:tcW w:w="3871" w:type="dxa"/>
             <w:tcBorders>
               <w:top w:val="single" w:sz="4" w:space="0" w:color="CCCCCC"/>
               <w:start w:val="single" w:sz="4" w:space="0" w:color="CCCCCC"/>
@@ -9453,7 +9436,7 @@
         </w:tc>
         <w:tc>
           <w:tcPr>
-            <w:tcW w:w="1050" w:type="dxa"/>
+            <w:tcW w:w="1049" w:type="dxa"/>
             <w:tcBorders>
               <w:top w:val="single" w:sz="4" w:space="0" w:color="CCCCCC"/>
               <w:start w:val="single" w:sz="4" w:space="0" w:color="CCCCCC"/>
@@ -9493,7 +9476,7 @@
         </w:tc>
         <w:tc>
           <w:tcPr>
-            <w:tcW w:w="2520" w:type="dxa"/>
+            <w:tcW w:w="2521" w:type="dxa"/>
             <w:tcBorders>
               <w:top w:val="single" w:sz="4" w:space="0" w:color="CCCCCC"/>
               <w:start w:val="single" w:sz="4" w:space="0" w:color="CCCCCC"/>
@@ -9587,7 +9570,7 @@
         </w:tc>
         <w:tc>
           <w:tcPr>
-            <w:tcW w:w="1671" w:type="dxa"/>
+            <w:tcW w:w="1670" w:type="dxa"/>
             <w:tcBorders>
               <w:top w:val="single" w:sz="4" w:space="0" w:color="CCCCCC"/>
               <w:start w:val="single" w:sz="4" w:space="0" w:color="CCCCCC"/>
@@ -9627,7 +9610,7 @@
         </w:tc>
         <w:tc>
           <w:tcPr>
-            <w:tcW w:w="3870" w:type="dxa"/>
+            <w:tcW w:w="3871" w:type="dxa"/>
             <w:tcBorders>
               <w:top w:val="single" w:sz="4" w:space="0" w:color="CCCCCC"/>
               <w:start w:val="single" w:sz="4" w:space="0" w:color="CCCCCC"/>
@@ -9667,7 +9650,7 @@
         </w:tc>
         <w:tc>
           <w:tcPr>
-            <w:tcW w:w="1050" w:type="dxa"/>
+            <w:tcW w:w="1049" w:type="dxa"/>
             <w:tcBorders>
               <w:top w:val="single" w:sz="4" w:space="0" w:color="CCCCCC"/>
               <w:start w:val="single" w:sz="4" w:space="0" w:color="CCCCCC"/>
@@ -9707,7 +9690,7 @@
         </w:tc>
         <w:tc>
           <w:tcPr>
-            <w:tcW w:w="2520" w:type="dxa"/>
+            <w:tcW w:w="2521" w:type="dxa"/>
             <w:tcBorders>
               <w:top w:val="single" w:sz="4" w:space="0" w:color="CCCCCC"/>
               <w:start w:val="single" w:sz="4" w:space="0" w:color="CCCCCC"/>
@@ -9801,7 +9784,7 @@
         </w:tc>
         <w:tc>
           <w:tcPr>
-            <w:tcW w:w="1671" w:type="dxa"/>
+            <w:tcW w:w="1670" w:type="dxa"/>
             <w:tcBorders>
               <w:top w:val="single" w:sz="4" w:space="0" w:color="CCCCCC"/>
               <w:start w:val="single" w:sz="4" w:space="0" w:color="CCCCCC"/>
@@ -9841,7 +9824,7 @@
         </w:tc>
         <w:tc>
           <w:tcPr>
-            <w:tcW w:w="3870" w:type="dxa"/>
+            <w:tcW w:w="3871" w:type="dxa"/>
             <w:tcBorders>
               <w:top w:val="single" w:sz="4" w:space="0" w:color="CCCCCC"/>
               <w:start w:val="single" w:sz="4" w:space="0" w:color="CCCCCC"/>
@@ -9881,7 +9864,7 @@
         </w:tc>
         <w:tc>
           <w:tcPr>
-            <w:tcW w:w="1050" w:type="dxa"/>
+            <w:tcW w:w="1049" w:type="dxa"/>
             <w:tcBorders>
               <w:top w:val="single" w:sz="4" w:space="0" w:color="CCCCCC"/>
               <w:start w:val="single" w:sz="4" w:space="0" w:color="CCCCCC"/>
@@ -9921,7 +9904,7 @@
         </w:tc>
         <w:tc>
           <w:tcPr>
-            <w:tcW w:w="2520" w:type="dxa"/>
+            <w:tcW w:w="2521" w:type="dxa"/>
             <w:tcBorders>
               <w:top w:val="single" w:sz="4" w:space="0" w:color="CCCCCC"/>
               <w:start w:val="single" w:sz="4" w:space="0" w:color="CCCCCC"/>
@@ -10015,7 +9998,7 @@
         </w:tc>
         <w:tc>
           <w:tcPr>
-            <w:tcW w:w="1671" w:type="dxa"/>
+            <w:tcW w:w="1670" w:type="dxa"/>
             <w:tcBorders>
               <w:top w:val="single" w:sz="4" w:space="0" w:color="CCCCCC"/>
               <w:start w:val="single" w:sz="4" w:space="0" w:color="CCCCCC"/>
@@ -10055,7 +10038,7 @@
         </w:tc>
         <w:tc>
           <w:tcPr>
-            <w:tcW w:w="3870" w:type="dxa"/>
+            <w:tcW w:w="3871" w:type="dxa"/>
             <w:tcBorders>
               <w:top w:val="single" w:sz="4" w:space="0" w:color="CCCCCC"/>
               <w:start w:val="single" w:sz="4" w:space="0" w:color="CCCCCC"/>
@@ -10095,7 +10078,7 @@
         </w:tc>
         <w:tc>
           <w:tcPr>
-            <w:tcW w:w="1050" w:type="dxa"/>
+            <w:tcW w:w="1049" w:type="dxa"/>
             <w:tcBorders>
               <w:top w:val="single" w:sz="4" w:space="0" w:color="CCCCCC"/>
               <w:start w:val="single" w:sz="4" w:space="0" w:color="CCCCCC"/>
@@ -10135,7 +10118,7 @@
         </w:tc>
         <w:tc>
           <w:tcPr>
-            <w:tcW w:w="2520" w:type="dxa"/>
+            <w:tcW w:w="2521" w:type="dxa"/>
             <w:tcBorders>
               <w:top w:val="single" w:sz="4" w:space="0" w:color="CCCCCC"/>
               <w:start w:val="single" w:sz="4" w:space="0" w:color="CCCCCC"/>
@@ -10229,7 +10212,7 @@
         </w:tc>
         <w:tc>
           <w:tcPr>
-            <w:tcW w:w="1671" w:type="dxa"/>
+            <w:tcW w:w="1670" w:type="dxa"/>
             <w:tcBorders>
               <w:top w:val="single" w:sz="4" w:space="0" w:color="CCCCCC"/>
               <w:start w:val="single" w:sz="4" w:space="0" w:color="CCCCCC"/>
@@ -10269,7 +10252,7 @@
         </w:tc>
         <w:tc>
           <w:tcPr>
-            <w:tcW w:w="3870" w:type="dxa"/>
+            <w:tcW w:w="3871" w:type="dxa"/>
             <w:tcBorders>
               <w:top w:val="single" w:sz="4" w:space="0" w:color="CCCCCC"/>
               <w:start w:val="single" w:sz="4" w:space="0" w:color="CCCCCC"/>
@@ -10309,7 +10292,7 @@
         </w:tc>
         <w:tc>
           <w:tcPr>
-            <w:tcW w:w="1050" w:type="dxa"/>
+            <w:tcW w:w="1049" w:type="dxa"/>
             <w:tcBorders>
               <w:top w:val="single" w:sz="4" w:space="0" w:color="CCCCCC"/>
               <w:start w:val="single" w:sz="4" w:space="0" w:color="CCCCCC"/>
@@ -10349,7 +10332,7 @@
         </w:tc>
         <w:tc>
           <w:tcPr>
-            <w:tcW w:w="2520" w:type="dxa"/>
+            <w:tcW w:w="2521" w:type="dxa"/>
             <w:tcBorders>
               <w:top w:val="single" w:sz="4" w:space="0" w:color="CCCCCC"/>
               <w:start w:val="single" w:sz="4" w:space="0" w:color="CCCCCC"/>
@@ -10443,7 +10426,7 @@
         </w:tc>
         <w:tc>
           <w:tcPr>
-            <w:tcW w:w="1671" w:type="dxa"/>
+            <w:tcW w:w="1670" w:type="dxa"/>
             <w:tcBorders>
               <w:top w:val="single" w:sz="4" w:space="0" w:color="CCCCCC"/>
               <w:start w:val="single" w:sz="4" w:space="0" w:color="CCCCCC"/>
@@ -10483,7 +10466,7 @@
         </w:tc>
         <w:tc>
           <w:tcPr>
-            <w:tcW w:w="3870" w:type="dxa"/>
+            <w:tcW w:w="3871" w:type="dxa"/>
             <w:tcBorders>
               <w:top w:val="single" w:sz="4" w:space="0" w:color="CCCCCC"/>
               <w:start w:val="single" w:sz="4" w:space="0" w:color="CCCCCC"/>
@@ -10523,7 +10506,7 @@
         </w:tc>
         <w:tc>
           <w:tcPr>
-            <w:tcW w:w="1050" w:type="dxa"/>
+            <w:tcW w:w="1049" w:type="dxa"/>
             <w:tcBorders>
               <w:top w:val="single" w:sz="4" w:space="0" w:color="CCCCCC"/>
               <w:start w:val="single" w:sz="4" w:space="0" w:color="CCCCCC"/>
@@ -10563,7 +10546,7 @@
         </w:tc>
         <w:tc>
           <w:tcPr>
-            <w:tcW w:w="2520" w:type="dxa"/>
+            <w:tcW w:w="2521" w:type="dxa"/>
             <w:tcBorders>
               <w:top w:val="single" w:sz="4" w:space="0" w:color="CCCCCC"/>
               <w:start w:val="single" w:sz="4" w:space="0" w:color="CCCCCC"/>
@@ -10657,7 +10640,7 @@
         </w:tc>
         <w:tc>
           <w:tcPr>
-            <w:tcW w:w="1671" w:type="dxa"/>
+            <w:tcW w:w="1670" w:type="dxa"/>
             <w:tcBorders>
               <w:top w:val="single" w:sz="4" w:space="0" w:color="CCCCCC"/>
               <w:start w:val="single" w:sz="4" w:space="0" w:color="CCCCCC"/>
@@ -10697,7 +10680,7 @@
         </w:tc>
         <w:tc>
           <w:tcPr>
-            <w:tcW w:w="3870" w:type="dxa"/>
+            <w:tcW w:w="3871" w:type="dxa"/>
             <w:tcBorders>
               <w:top w:val="single" w:sz="4" w:space="0" w:color="CCCCCC"/>
               <w:start w:val="single" w:sz="4" w:space="0" w:color="CCCCCC"/>
@@ -10737,7 +10720,7 @@
         </w:tc>
         <w:tc>
           <w:tcPr>
-            <w:tcW w:w="1050" w:type="dxa"/>
+            <w:tcW w:w="1049" w:type="dxa"/>
             <w:tcBorders>
               <w:top w:val="single" w:sz="4" w:space="0" w:color="CCCCCC"/>
               <w:start w:val="single" w:sz="4" w:space="0" w:color="CCCCCC"/>
@@ -10777,7 +10760,7 @@
         </w:tc>
         <w:tc>
           <w:tcPr>
-            <w:tcW w:w="2520" w:type="dxa"/>
+            <w:tcW w:w="2521" w:type="dxa"/>
             <w:tcBorders>
               <w:top w:val="single" w:sz="4" w:space="0" w:color="CCCCCC"/>
               <w:start w:val="single" w:sz="4" w:space="0" w:color="CCCCCC"/>
@@ -10850,7 +10833,7 @@
     <w:p>
       <w:pPr>
         <w:pStyle w:val="Normal"/>
-        <w:spacing w:before="160" w:after="160"/>
+        <w:spacing w:before="0" w:after="160"/>
         <w:rPr>
           <w:sz w:val="26"/>
           <w:szCs w:val="26"/>
@@ -11237,10 +11220,10 @@
         </w:tblCellMar>
       </w:tblPr>
       <w:tblGrid>
-        <w:gridCol w:w="519"/>
+        <w:gridCol w:w="518"/>
         <w:gridCol w:w="1551"/>
         <w:gridCol w:w="4620"/>
-        <w:gridCol w:w="1350"/>
+        <w:gridCol w:w="1351"/>
         <w:gridCol w:w="2070"/>
       </w:tblGrid>
       <w:tr>
@@ -11283,7 +11266,7 @@
         <w:trPr/>
         <w:tc>
           <w:tcPr>
-            <w:tcW w:w="519" w:type="dxa"/>
+            <w:tcW w:w="518" w:type="dxa"/>
             <w:tcBorders>
               <w:top w:val="single" w:sz="4" w:space="0" w:color="CCCCCC"/>
               <w:start w:val="single" w:sz="4" w:space="0" w:color="CCCCCC"/>
@@ -11403,7 +11386,7 @@
         </w:tc>
         <w:tc>
           <w:tcPr>
-            <w:tcW w:w="1350" w:type="dxa"/>
+            <w:tcW w:w="1351" w:type="dxa"/>
             <w:tcBorders>
               <w:top w:val="single" w:sz="4" w:space="0" w:color="CCCCCC"/>
               <w:start w:val="single" w:sz="4" w:space="0" w:color="CCCCCC"/>
@@ -11486,7 +11469,7 @@
         <w:trPr/>
         <w:tc>
           <w:tcPr>
-            <w:tcW w:w="519" w:type="dxa"/>
+            <w:tcW w:w="518" w:type="dxa"/>
             <w:tcBorders>
               <w:top w:val="single" w:sz="4" w:space="0" w:color="CCCCCC"/>
               <w:start w:val="single" w:sz="4" w:space="0" w:color="CCCCCC"/>
@@ -11606,7 +11589,7 @@
         </w:tc>
         <w:tc>
           <w:tcPr>
-            <w:tcW w:w="1350" w:type="dxa"/>
+            <w:tcW w:w="1351" w:type="dxa"/>
             <w:tcBorders>
               <w:top w:val="single" w:sz="4" w:space="0" w:color="CCCCCC"/>
               <w:start w:val="single" w:sz="4" w:space="0" w:color="CCCCCC"/>
@@ -11700,7 +11683,7 @@
         <w:trPr/>
         <w:tc>
           <w:tcPr>
-            <w:tcW w:w="519" w:type="dxa"/>
+            <w:tcW w:w="518" w:type="dxa"/>
             <w:tcBorders>
               <w:top w:val="single" w:sz="4" w:space="0" w:color="CCCCCC"/>
               <w:start w:val="single" w:sz="4" w:space="0" w:color="CCCCCC"/>
@@ -11820,7 +11803,7 @@
         </w:tc>
         <w:tc>
           <w:tcPr>
-            <w:tcW w:w="1350" w:type="dxa"/>
+            <w:tcW w:w="1351" w:type="dxa"/>
             <w:tcBorders>
               <w:top w:val="single" w:sz="4" w:space="0" w:color="CCCCCC"/>
               <w:start w:val="single" w:sz="4" w:space="0" w:color="CCCCCC"/>
@@ -11914,7 +11897,7 @@
         <w:trPr/>
         <w:tc>
           <w:tcPr>
-            <w:tcW w:w="519" w:type="dxa"/>
+            <w:tcW w:w="518" w:type="dxa"/>
             <w:tcBorders>
               <w:top w:val="single" w:sz="4" w:space="0" w:color="CCCCCC"/>
               <w:start w:val="single" w:sz="4" w:space="0" w:color="CCCCCC"/>
@@ -12034,7 +12017,7 @@
         </w:tc>
         <w:tc>
           <w:tcPr>
-            <w:tcW w:w="1350" w:type="dxa"/>
+            <w:tcW w:w="1351" w:type="dxa"/>
             <w:tcBorders>
               <w:top w:val="single" w:sz="4" w:space="0" w:color="CCCCCC"/>
               <w:start w:val="single" w:sz="4" w:space="0" w:color="CCCCCC"/>
@@ -12128,7 +12111,7 @@
         <w:trPr/>
         <w:tc>
           <w:tcPr>
-            <w:tcW w:w="519" w:type="dxa"/>
+            <w:tcW w:w="518" w:type="dxa"/>
             <w:tcBorders>
               <w:top w:val="single" w:sz="4" w:space="0" w:color="CCCCCC"/>
               <w:start w:val="single" w:sz="4" w:space="0" w:color="CCCCCC"/>
@@ -12248,7 +12231,7 @@
         </w:tc>
         <w:tc>
           <w:tcPr>
-            <w:tcW w:w="1350" w:type="dxa"/>
+            <w:tcW w:w="1351" w:type="dxa"/>
             <w:tcBorders>
               <w:top w:val="single" w:sz="4" w:space="0" w:color="CCCCCC"/>
               <w:start w:val="single" w:sz="4" w:space="0" w:color="CCCCCC"/>
@@ -12342,7 +12325,7 @@
         <w:trPr/>
         <w:tc>
           <w:tcPr>
-            <w:tcW w:w="519" w:type="dxa"/>
+            <w:tcW w:w="518" w:type="dxa"/>
             <w:tcBorders>
               <w:top w:val="single" w:sz="4" w:space="0" w:color="CCCCCC"/>
               <w:start w:val="single" w:sz="4" w:space="0" w:color="CCCCCC"/>
@@ -12462,7 +12445,7 @@
         </w:tc>
         <w:tc>
           <w:tcPr>
-            <w:tcW w:w="1350" w:type="dxa"/>
+            <w:tcW w:w="1351" w:type="dxa"/>
             <w:tcBorders>
               <w:top w:val="single" w:sz="4" w:space="0" w:color="CCCCCC"/>
               <w:start w:val="single" w:sz="4" w:space="0" w:color="CCCCCC"/>
@@ -12556,7 +12539,7 @@
         <w:trPr/>
         <w:tc>
           <w:tcPr>
-            <w:tcW w:w="519" w:type="dxa"/>
+            <w:tcW w:w="518" w:type="dxa"/>
             <w:tcBorders>
               <w:top w:val="single" w:sz="4" w:space="0" w:color="CCCCCC"/>
               <w:start w:val="single" w:sz="4" w:space="0" w:color="CCCCCC"/>
@@ -12676,7 +12659,7 @@
         </w:tc>
         <w:tc>
           <w:tcPr>
-            <w:tcW w:w="1350" w:type="dxa"/>
+            <w:tcW w:w="1351" w:type="dxa"/>
             <w:tcBorders>
               <w:top w:val="single" w:sz="4" w:space="0" w:color="CCCCCC"/>
               <w:start w:val="single" w:sz="4" w:space="0" w:color="CCCCCC"/>
@@ -12770,7 +12753,7 @@
         <w:trPr/>
         <w:tc>
           <w:tcPr>
-            <w:tcW w:w="519" w:type="dxa"/>
+            <w:tcW w:w="518" w:type="dxa"/>
             <w:tcBorders>
               <w:top w:val="single" w:sz="4" w:space="0" w:color="CCCCCC"/>
               <w:start w:val="single" w:sz="4" w:space="0" w:color="CCCCCC"/>
@@ -12890,7 +12873,7 @@
         </w:tc>
         <w:tc>
           <w:tcPr>
-            <w:tcW w:w="1350" w:type="dxa"/>
+            <w:tcW w:w="1351" w:type="dxa"/>
             <w:tcBorders>
               <w:top w:val="single" w:sz="4" w:space="0" w:color="CCCCCC"/>
               <w:start w:val="single" w:sz="4" w:space="0" w:color="CCCCCC"/>
@@ -12984,7 +12967,7 @@
         <w:trPr/>
         <w:tc>
           <w:tcPr>
-            <w:tcW w:w="519" w:type="dxa"/>
+            <w:tcW w:w="518" w:type="dxa"/>
             <w:tcBorders>
               <w:top w:val="single" w:sz="4" w:space="0" w:color="CCCCCC"/>
               <w:start w:val="single" w:sz="4" w:space="0" w:color="CCCCCC"/>
@@ -13104,7 +13087,7 @@
         </w:tc>
         <w:tc>
           <w:tcPr>
-            <w:tcW w:w="1350" w:type="dxa"/>
+            <w:tcW w:w="1351" w:type="dxa"/>
             <w:tcBorders>
               <w:top w:val="single" w:sz="4" w:space="0" w:color="CCCCCC"/>
               <w:start w:val="single" w:sz="4" w:space="0" w:color="CCCCCC"/>
@@ -13198,7 +13181,7 @@
         <w:trPr/>
         <w:tc>
           <w:tcPr>
-            <w:tcW w:w="519" w:type="dxa"/>
+            <w:tcW w:w="518" w:type="dxa"/>
             <w:tcBorders>
               <w:top w:val="single" w:sz="4" w:space="0" w:color="CCCCCC"/>
               <w:start w:val="single" w:sz="4" w:space="0" w:color="CCCCCC"/>
@@ -13318,7 +13301,7 @@
         </w:tc>
         <w:tc>
           <w:tcPr>
-            <w:tcW w:w="1350" w:type="dxa"/>
+            <w:tcW w:w="1351" w:type="dxa"/>
             <w:tcBorders>
               <w:top w:val="single" w:sz="4" w:space="0" w:color="CCCCCC"/>
               <w:start w:val="single" w:sz="4" w:space="0" w:color="CCCCCC"/>
@@ -13412,7 +13395,7 @@
         <w:trPr/>
         <w:tc>
           <w:tcPr>
-            <w:tcW w:w="519" w:type="dxa"/>
+            <w:tcW w:w="518" w:type="dxa"/>
             <w:tcBorders>
               <w:top w:val="single" w:sz="4" w:space="0" w:color="CCCCCC"/>
               <w:start w:val="single" w:sz="4" w:space="0" w:color="CCCCCC"/>
@@ -13532,7 +13515,7 @@
         </w:tc>
         <w:tc>
           <w:tcPr>
-            <w:tcW w:w="1350" w:type="dxa"/>
+            <w:tcW w:w="1351" w:type="dxa"/>
             <w:tcBorders>
               <w:top w:val="single" w:sz="4" w:space="0" w:color="CCCCCC"/>
               <w:start w:val="single" w:sz="4" w:space="0" w:color="CCCCCC"/>
@@ -13626,7 +13609,7 @@
         <w:trPr/>
         <w:tc>
           <w:tcPr>
-            <w:tcW w:w="519" w:type="dxa"/>
+            <w:tcW w:w="518" w:type="dxa"/>
             <w:tcBorders>
               <w:top w:val="single" w:sz="4" w:space="0" w:color="CCCCCC"/>
               <w:start w:val="single" w:sz="4" w:space="0" w:color="CCCCCC"/>
@@ -13746,7 +13729,7 @@
         </w:tc>
         <w:tc>
           <w:tcPr>
-            <w:tcW w:w="1350" w:type="dxa"/>
+            <w:tcW w:w="1351" w:type="dxa"/>
             <w:tcBorders>
               <w:top w:val="single" w:sz="4" w:space="0" w:color="CCCCCC"/>
               <w:start w:val="single" w:sz="4" w:space="0" w:color="CCCCCC"/>
@@ -13840,7 +13823,7 @@
         <w:trPr/>
         <w:tc>
           <w:tcPr>
-            <w:tcW w:w="519" w:type="dxa"/>
+            <w:tcW w:w="518" w:type="dxa"/>
             <w:tcBorders>
               <w:top w:val="single" w:sz="4" w:space="0" w:color="CCCCCC"/>
               <w:start w:val="single" w:sz="4" w:space="0" w:color="CCCCCC"/>
@@ -13960,7 +13943,7 @@
         </w:tc>
         <w:tc>
           <w:tcPr>
-            <w:tcW w:w="1350" w:type="dxa"/>
+            <w:tcW w:w="1351" w:type="dxa"/>
             <w:tcBorders>
               <w:top w:val="single" w:sz="4" w:space="0" w:color="CCCCCC"/>
               <w:start w:val="single" w:sz="4" w:space="0" w:color="CCCCCC"/>
@@ -14054,7 +14037,7 @@
         <w:trPr/>
         <w:tc>
           <w:tcPr>
-            <w:tcW w:w="519" w:type="dxa"/>
+            <w:tcW w:w="518" w:type="dxa"/>
             <w:tcBorders>
               <w:top w:val="single" w:sz="4" w:space="0" w:color="CCCCCC"/>
               <w:start w:val="single" w:sz="4" w:space="0" w:color="CCCCCC"/>
@@ -14174,7 +14157,7 @@
         </w:tc>
         <w:tc>
           <w:tcPr>
-            <w:tcW w:w="1350" w:type="dxa"/>
+            <w:tcW w:w="1351" w:type="dxa"/>
             <w:tcBorders>
               <w:top w:val="single" w:sz="4" w:space="0" w:color="CCCCCC"/>
               <w:start w:val="single" w:sz="4" w:space="0" w:color="CCCCCC"/>
@@ -14789,6 +14772,7 @@
     <w:qFormat/>
     <w:pPr>
       <w:widowControl/>
+      <w:suppressAutoHyphens w:val="true"/>
       <w:bidi w:val="0"/>
       <w:spacing w:before="0" w:after="0"/>
       <w:jc w:val="start"/>
@@ -14885,11 +14869,18 @@
       <w:u w:val="single"/>
     </w:rPr>
   </w:style>
-  <w:style w:type="character" w:styleId="FootnoteCharacters">
-    <w:name w:val="Footnote Characters"/>
+  <w:style w:type="character" w:styleId="FootnoteCharactersuser">
+    <w:name w:val="Footnote Characters (user)"/>
     <w:uiPriority w:val="99"/>
     <w:semiHidden/>
     <w:unhideWhenUsed/>
+    <w:qFormat/>
+    <w:rPr>
+      <w:vertAlign w:val="superscript"/>
+    </w:rPr>
+  </w:style>
+  <w:style w:type="character" w:styleId="FootnoteCharacters">
+    <w:name w:val="Footnote Characters"/>
     <w:qFormat/>
     <w:rPr>
       <w:vertAlign w:val="superscript"/>
@@ -14913,11 +14904,18 @@
       <w:szCs w:val="20"/>
     </w:rPr>
   </w:style>
-  <w:style w:type="character" w:styleId="EndnoteCharacters">
-    <w:name w:val="Endnote Characters"/>
+  <w:style w:type="character" w:styleId="EndnoteCharactersuser">
+    <w:name w:val="Endnote Characters (user)"/>
     <w:uiPriority w:val="99"/>
     <w:semiHidden/>
     <w:unhideWhenUsed/>
+    <w:qFormat/>
+    <w:rPr>
+      <w:vertAlign w:val="superscript"/>
+    </w:rPr>
+  </w:style>
+  <w:style w:type="character" w:styleId="EndnoteCharacters">
+    <w:name w:val="Endnote Characters"/>
     <w:qFormat/>
     <w:rPr>
       <w:vertAlign w:val="superscript"/>
@@ -15014,6 +15012,7 @@
     <w:qFormat/>
     <w:pPr>
       <w:widowControl/>
+      <w:suppressAutoHyphens w:val="true"/>
       <w:bidi w:val="0"/>
       <w:spacing w:before="0" w:after="0"/>
       <w:jc w:val="start"/>
@@ -15034,6 +15033,7 @@
     <w:qFormat/>
     <w:pPr>
       <w:widowControl/>
+      <w:suppressAutoHyphens w:val="true"/>
       <w:bidi w:val="0"/>
       <w:spacing w:before="0" w:after="0"/>
       <w:jc w:val="start"/>

</xml_diff>

<commit_message>
Added check_runs.py for viewing MLflow experiment results
</commit_message>
<xml_diff>
--- a/Automation_Study_Plan.docx
+++ b/Automation_Study_Plan.docx
@@ -336,8 +336,8 @@
       <w:tblGrid>
         <w:gridCol w:w="1290"/>
         <w:gridCol w:w="2129"/>
-        <w:gridCol w:w="1440"/>
-        <w:gridCol w:w="1530"/>
+        <w:gridCol w:w="1439"/>
+        <w:gridCol w:w="1531"/>
         <w:gridCol w:w="1531"/>
       </w:tblGrid>
       <w:tr>
@@ -412,7 +412,7 @@
         </w:tc>
         <w:tc>
           <w:tcPr>
-            <w:tcW w:w="1440" w:type="dxa"/>
+            <w:tcW w:w="1439" w:type="dxa"/>
             <w:tcBorders>
               <w:top w:val="single" w:sz="4" w:space="0" w:color="CCCCCC"/>
               <w:start w:val="single" w:sz="4" w:space="0" w:color="CCCCCC"/>
@@ -446,7 +446,7 @@
         </w:tc>
         <w:tc>
           <w:tcPr>
-            <w:tcW w:w="1530" w:type="dxa"/>
+            <w:tcW w:w="1531" w:type="dxa"/>
             <w:tcBorders>
               <w:top w:val="single" w:sz="4" w:space="0" w:color="CCCCCC"/>
               <w:start w:val="single" w:sz="4" w:space="0" w:color="CCCCCC"/>
@@ -585,7 +585,7 @@
         </w:tc>
         <w:tc>
           <w:tcPr>
-            <w:tcW w:w="1440" w:type="dxa"/>
+            <w:tcW w:w="1439" w:type="dxa"/>
             <w:tcBorders>
               <w:top w:val="single" w:sz="4" w:space="0" w:color="CCCCCC"/>
               <w:start w:val="single" w:sz="4" w:space="0" w:color="CCCCCC"/>
@@ -619,7 +619,7 @@
         </w:tc>
         <w:tc>
           <w:tcPr>
-            <w:tcW w:w="1530" w:type="dxa"/>
+            <w:tcW w:w="1531" w:type="dxa"/>
             <w:tcBorders>
               <w:top w:val="single" w:sz="4" w:space="0" w:color="CCCCCC"/>
               <w:start w:val="single" w:sz="4" w:space="0" w:color="CCCCCC"/>
@@ -758,7 +758,7 @@
         </w:tc>
         <w:tc>
           <w:tcPr>
-            <w:tcW w:w="1440" w:type="dxa"/>
+            <w:tcW w:w="1439" w:type="dxa"/>
             <w:tcBorders>
               <w:top w:val="single" w:sz="4" w:space="0" w:color="CCCCCC"/>
               <w:start w:val="single" w:sz="4" w:space="0" w:color="CCCCCC"/>
@@ -792,7 +792,7 @@
         </w:tc>
         <w:tc>
           <w:tcPr>
-            <w:tcW w:w="1530" w:type="dxa"/>
+            <w:tcW w:w="1531" w:type="dxa"/>
             <w:tcBorders>
               <w:top w:val="single" w:sz="4" w:space="0" w:color="CCCCCC"/>
               <w:start w:val="single" w:sz="4" w:space="0" w:color="CCCCCC"/>
@@ -931,7 +931,7 @@
         </w:tc>
         <w:tc>
           <w:tcPr>
-            <w:tcW w:w="1440" w:type="dxa"/>
+            <w:tcW w:w="1439" w:type="dxa"/>
             <w:tcBorders>
               <w:top w:val="single" w:sz="4" w:space="0" w:color="CCCCCC"/>
               <w:start w:val="single" w:sz="4" w:space="0" w:color="CCCCCC"/>
@@ -965,7 +965,7 @@
         </w:tc>
         <w:tc>
           <w:tcPr>
-            <w:tcW w:w="1530" w:type="dxa"/>
+            <w:tcW w:w="1531" w:type="dxa"/>
             <w:tcBorders>
               <w:top w:val="single" w:sz="4" w:space="0" w:color="CCCCCC"/>
               <w:start w:val="single" w:sz="4" w:space="0" w:color="CCCCCC"/>
@@ -1104,7 +1104,7 @@
         </w:tc>
         <w:tc>
           <w:tcPr>
-            <w:tcW w:w="1440" w:type="dxa"/>
+            <w:tcW w:w="1439" w:type="dxa"/>
             <w:tcBorders>
               <w:top w:val="single" w:sz="4" w:space="0" w:color="CCCCCC"/>
               <w:start w:val="single" w:sz="4" w:space="0" w:color="CCCCCC"/>
@@ -1138,7 +1138,7 @@
         </w:tc>
         <w:tc>
           <w:tcPr>
-            <w:tcW w:w="1530" w:type="dxa"/>
+            <w:tcW w:w="1531" w:type="dxa"/>
             <w:tcBorders>
               <w:top w:val="single" w:sz="4" w:space="0" w:color="CCCCCC"/>
               <w:start w:val="single" w:sz="4" w:space="0" w:color="CCCCCC"/>
@@ -1272,7 +1272,7 @@
         </w:tc>
         <w:tc>
           <w:tcPr>
-            <w:tcW w:w="1440" w:type="dxa"/>
+            <w:tcW w:w="1439" w:type="dxa"/>
             <w:tcBorders>
               <w:top w:val="single" w:sz="4" w:space="0" w:color="CCCCCC"/>
               <w:start w:val="single" w:sz="4" w:space="0" w:color="CCCCCC"/>
@@ -1306,7 +1306,7 @@
         </w:tc>
         <w:tc>
           <w:tcPr>
-            <w:tcW w:w="1530" w:type="dxa"/>
+            <w:tcW w:w="1531" w:type="dxa"/>
             <w:tcBorders>
               <w:top w:val="single" w:sz="4" w:space="0" w:color="CCCCCC"/>
               <w:start w:val="single" w:sz="4" w:space="0" w:color="CCCCCC"/>
@@ -1583,10 +1583,10 @@
         </w:tblCellMar>
       </w:tblPr>
       <w:tblGrid>
-        <w:gridCol w:w="554"/>
+        <w:gridCol w:w="553"/>
         <w:gridCol w:w="1456"/>
         <w:gridCol w:w="3779"/>
-        <w:gridCol w:w="1351"/>
+        <w:gridCol w:w="1352"/>
         <w:gridCol w:w="1445"/>
       </w:tblGrid>
       <w:tr>
@@ -1629,7 +1629,7 @@
         <w:trPr/>
         <w:tc>
           <w:tcPr>
-            <w:tcW w:w="554" w:type="dxa"/>
+            <w:tcW w:w="553" w:type="dxa"/>
             <w:tcBorders>
               <w:top w:val="single" w:sz="4" w:space="0" w:color="CCCCCC"/>
               <w:start w:val="single" w:sz="4" w:space="0" w:color="CCCCCC"/>
@@ -1749,7 +1749,7 @@
         </w:tc>
         <w:tc>
           <w:tcPr>
-            <w:tcW w:w="1351" w:type="dxa"/>
+            <w:tcW w:w="1352" w:type="dxa"/>
             <w:tcBorders>
               <w:top w:val="single" w:sz="4" w:space="0" w:color="CCCCCC"/>
               <w:start w:val="single" w:sz="4" w:space="0" w:color="CCCCCC"/>
@@ -1832,7 +1832,7 @@
         <w:trPr/>
         <w:tc>
           <w:tcPr>
-            <w:tcW w:w="554" w:type="dxa"/>
+            <w:tcW w:w="553" w:type="dxa"/>
             <w:tcBorders>
               <w:top w:val="single" w:sz="4" w:space="0" w:color="CCCCCC"/>
               <w:start w:val="single" w:sz="4" w:space="0" w:color="CCCCCC"/>
@@ -1958,7 +1958,7 @@
         </w:tc>
         <w:tc>
           <w:tcPr>
-            <w:tcW w:w="1351" w:type="dxa"/>
+            <w:tcW w:w="1352" w:type="dxa"/>
             <w:tcBorders>
               <w:top w:val="single" w:sz="4" w:space="0" w:color="CCCCCC"/>
               <w:start w:val="single" w:sz="4" w:space="0" w:color="CCCCCC"/>
@@ -2054,7 +2054,7 @@
         <w:trPr/>
         <w:tc>
           <w:tcPr>
-            <w:tcW w:w="554" w:type="dxa"/>
+            <w:tcW w:w="553" w:type="dxa"/>
             <w:tcBorders>
               <w:top w:val="single" w:sz="4" w:space="0" w:color="CCCCCC"/>
               <w:start w:val="single" w:sz="4" w:space="0" w:color="CCCCCC"/>
@@ -2178,7 +2178,7 @@
         </w:tc>
         <w:tc>
           <w:tcPr>
-            <w:tcW w:w="1351" w:type="dxa"/>
+            <w:tcW w:w="1352" w:type="dxa"/>
             <w:tcBorders>
               <w:top w:val="single" w:sz="4" w:space="0" w:color="CCCCCC"/>
               <w:start w:val="single" w:sz="4" w:space="0" w:color="CCCCCC"/>
@@ -2275,7 +2275,7 @@
         <w:trPr/>
         <w:tc>
           <w:tcPr>
-            <w:tcW w:w="554" w:type="dxa"/>
+            <w:tcW w:w="553" w:type="dxa"/>
             <w:tcBorders>
               <w:top w:val="single" w:sz="4" w:space="0" w:color="CCCCCC"/>
               <w:start w:val="single" w:sz="4" w:space="0" w:color="CCCCCC"/>
@@ -2334,19 +2334,16 @@
           <w:p>
             <w:pPr>
               <w:pStyle w:val="Normal"/>
-              <w:jc w:val="start"/>
-              <w:rPr>
+              <w:shd w:fill="3FAF46" w:val="clear"/>
+              <w:jc w:val="start"/>
+              <w:rPr/>
+            </w:pPr>
+            <w:r>
+              <w:rPr>
+                <w:rFonts w:eastAsia="Arial" w:cs="Arial"/>
                 <w:b/>
                 <w:bCs/>
                 <w:color w:val="000000"/>
-              </w:rPr>
-            </w:pPr>
-            <w:r>
-              <w:rPr>
-                <w:rFonts w:eastAsia="Arial" w:cs="Arial"/>
-                <w:b/>
-                <w:bCs/>
-                <w:color w:val="000000"/>
                 <w:sz w:val="26"/>
                 <w:szCs w:val="26"/>
               </w:rPr>
@@ -2375,11 +2372,9 @@
           <w:p>
             <w:pPr>
               <w:pStyle w:val="Normal"/>
-              <w:jc w:val="start"/>
-              <w:rPr>
-                <w:sz w:val="26"/>
-                <w:szCs w:val="26"/>
-              </w:rPr>
+              <w:shd w:fill="3FAF46" w:val="clear"/>
+              <w:jc w:val="start"/>
+              <w:rPr/>
             </w:pPr>
             <w:r>
               <w:rPr>
@@ -2396,30 +2391,28 @@
         </w:tc>
         <w:tc>
           <w:tcPr>
-            <w:tcW w:w="1351" w:type="dxa"/>
-            <w:tcBorders>
-              <w:top w:val="single" w:sz="4" w:space="0" w:color="CCCCCC"/>
-              <w:start w:val="single" w:sz="4" w:space="0" w:color="CCCCCC"/>
-              <w:bottom w:val="single" w:sz="4" w:space="0" w:color="CCCCCC"/>
-              <w:end w:val="single" w:sz="4" w:space="0" w:color="CCCCCC"/>
-            </w:tcBorders>
-            <w:shd w:fill="FFFFFF" w:val="clear"/>
-            <w:tcMar>
-              <w:top w:w="80" w:type="dxa"/>
-              <w:start w:w="120" w:type="dxa"/>
-              <w:bottom w:w="80" w:type="dxa"/>
-              <w:end w:w="120" w:type="dxa"/>
-            </w:tcMar>
-            <w:vAlign w:val="center"/>
-          </w:tcPr>
-          <w:p>
-            <w:pPr>
-              <w:pStyle w:val="Normal"/>
-              <w:jc w:val="start"/>
-              <w:rPr>
-                <w:sz w:val="26"/>
-                <w:szCs w:val="26"/>
-              </w:rPr>
+            <w:tcW w:w="1352" w:type="dxa"/>
+            <w:tcBorders>
+              <w:top w:val="single" w:sz="4" w:space="0" w:color="CCCCCC"/>
+              <w:start w:val="single" w:sz="4" w:space="0" w:color="CCCCCC"/>
+              <w:bottom w:val="single" w:sz="4" w:space="0" w:color="CCCCCC"/>
+              <w:end w:val="single" w:sz="4" w:space="0" w:color="CCCCCC"/>
+            </w:tcBorders>
+            <w:shd w:fill="FFFFFF" w:val="clear"/>
+            <w:tcMar>
+              <w:top w:w="80" w:type="dxa"/>
+              <w:start w:w="120" w:type="dxa"/>
+              <w:bottom w:w="80" w:type="dxa"/>
+              <w:end w:w="120" w:type="dxa"/>
+            </w:tcMar>
+            <w:vAlign w:val="center"/>
+          </w:tcPr>
+          <w:p>
+            <w:pPr>
+              <w:pStyle w:val="Normal"/>
+              <w:shd w:fill="3FAF46" w:val="clear"/>
+              <w:jc w:val="start"/>
+              <w:rPr/>
             </w:pPr>
             <w:r>
               <w:rPr>
@@ -2455,11 +2448,9 @@
           <w:p>
             <w:pPr>
               <w:pStyle w:val="Normal"/>
-              <w:jc w:val="start"/>
-              <w:rPr>
-                <w:sz w:val="26"/>
-                <w:szCs w:val="26"/>
-              </w:rPr>
+              <w:shd w:fill="3FAF46" w:val="clear"/>
+              <w:jc w:val="start"/>
+              <w:rPr/>
             </w:pPr>
             <w:r>
               <w:rPr>
@@ -2490,7 +2481,7 @@
         <w:trPr/>
         <w:tc>
           <w:tcPr>
-            <w:tcW w:w="554" w:type="dxa"/>
+            <w:tcW w:w="553" w:type="dxa"/>
             <w:tcBorders>
               <w:top w:val="single" w:sz="4" w:space="0" w:color="CCCCCC"/>
               <w:start w:val="single" w:sz="4" w:space="0" w:color="CCCCCC"/>
@@ -2551,19 +2542,19 @@
               <w:pStyle w:val="Normal"/>
               <w:jc w:val="start"/>
               <w:rPr>
+                <w:highlight w:val="none"/>
+                <w:shd w:fill="069A2E" w:val="clear"/>
+              </w:rPr>
+            </w:pPr>
+            <w:r>
+              <w:rPr>
+                <w:rFonts w:eastAsia="Arial" w:cs="Arial"/>
                 <w:b/>
                 <w:bCs/>
                 <w:color w:val="000000"/>
-              </w:rPr>
-            </w:pPr>
-            <w:r>
-              <w:rPr>
-                <w:rFonts w:eastAsia="Arial" w:cs="Arial"/>
-                <w:b/>
-                <w:bCs/>
-                <w:color w:val="000000"/>
-                <w:sz w:val="26"/>
-                <w:szCs w:val="26"/>
+                <w:sz w:val="26"/>
+                <w:szCs w:val="26"/>
+                <w:shd w:fill="069A2E" w:val="clear"/>
               </w:rPr>
               <w:t>Day 4</w:t>
             </w:r>
@@ -2592,8 +2583,8 @@
               <w:pStyle w:val="Normal"/>
               <w:jc w:val="start"/>
               <w:rPr>
-                <w:sz w:val="26"/>
-                <w:szCs w:val="26"/>
+                <w:highlight w:val="none"/>
+                <w:shd w:fill="069A2E" w:val="clear"/>
               </w:rPr>
             </w:pPr>
             <w:r>
@@ -2604,6 +2595,7 @@
                 <w:color w:val="222222"/>
                 <w:sz w:val="26"/>
                 <w:szCs w:val="26"/>
+                <w:shd w:fill="069A2E" w:val="clear"/>
               </w:rPr>
               <w:t>Python functions — writing clean reusable code</w:t>
             </w:r>
@@ -2611,29 +2603,29 @@
         </w:tc>
         <w:tc>
           <w:tcPr>
-            <w:tcW w:w="1351" w:type="dxa"/>
-            <w:tcBorders>
-              <w:top w:val="single" w:sz="4" w:space="0" w:color="CCCCCC"/>
-              <w:start w:val="single" w:sz="4" w:space="0" w:color="CCCCCC"/>
-              <w:bottom w:val="single" w:sz="4" w:space="0" w:color="CCCCCC"/>
-              <w:end w:val="single" w:sz="4" w:space="0" w:color="CCCCCC"/>
-            </w:tcBorders>
-            <w:shd w:fill="FFFFFF" w:val="clear"/>
-            <w:tcMar>
-              <w:top w:w="80" w:type="dxa"/>
-              <w:start w:w="120" w:type="dxa"/>
-              <w:bottom w:w="80" w:type="dxa"/>
-              <w:end w:w="120" w:type="dxa"/>
-            </w:tcMar>
-            <w:vAlign w:val="center"/>
-          </w:tcPr>
-          <w:p>
-            <w:pPr>
-              <w:pStyle w:val="Normal"/>
-              <w:jc w:val="start"/>
-              <w:rPr>
-                <w:sz w:val="26"/>
-                <w:szCs w:val="26"/>
+            <w:tcW w:w="1352" w:type="dxa"/>
+            <w:tcBorders>
+              <w:top w:val="single" w:sz="4" w:space="0" w:color="CCCCCC"/>
+              <w:start w:val="single" w:sz="4" w:space="0" w:color="CCCCCC"/>
+              <w:bottom w:val="single" w:sz="4" w:space="0" w:color="CCCCCC"/>
+              <w:end w:val="single" w:sz="4" w:space="0" w:color="CCCCCC"/>
+            </w:tcBorders>
+            <w:shd w:fill="FFFFFF" w:val="clear"/>
+            <w:tcMar>
+              <w:top w:w="80" w:type="dxa"/>
+              <w:start w:w="120" w:type="dxa"/>
+              <w:bottom w:w="80" w:type="dxa"/>
+              <w:end w:w="120" w:type="dxa"/>
+            </w:tcMar>
+            <w:vAlign w:val="center"/>
+          </w:tcPr>
+          <w:p>
+            <w:pPr>
+              <w:pStyle w:val="Normal"/>
+              <w:jc w:val="start"/>
+              <w:rPr>
+                <w:highlight w:val="none"/>
+                <w:shd w:fill="069A2E" w:val="clear"/>
               </w:rPr>
             </w:pPr>
             <w:r>
@@ -2644,6 +2636,7 @@
                 <w:color w:val="555555"/>
                 <w:sz w:val="26"/>
                 <w:szCs w:val="26"/>
+                <w:shd w:fill="069A2E" w:val="clear"/>
               </w:rPr>
               <w:t>1.5 hrs</w:t>
             </w:r>
@@ -2672,8 +2665,8 @@
               <w:pStyle w:val="Normal"/>
               <w:jc w:val="start"/>
               <w:rPr>
-                <w:sz w:val="26"/>
-                <w:szCs w:val="26"/>
+                <w:highlight w:val="none"/>
+                <w:shd w:fill="069A2E" w:val="clear"/>
               </w:rPr>
             </w:pPr>
             <w:r>
@@ -2684,6 +2677,7 @@
                 <w:color w:val="0C447C"/>
                 <w:sz w:val="26"/>
                 <w:szCs w:val="26"/>
+                <w:shd w:fill="069A2E" w:val="clear"/>
               </w:rPr>
               <w:t xml:space="preserve">⌨ </w:t>
             </w:r>
@@ -2695,6 +2689,7 @@
                 <w:color w:val="0C447C"/>
                 <w:sz w:val="26"/>
                 <w:szCs w:val="26"/>
+                <w:shd w:fill="069A2E" w:val="clear"/>
               </w:rPr>
               <w:t>Hands-on</w:t>
             </w:r>
@@ -2705,7 +2700,7 @@
         <w:trPr/>
         <w:tc>
           <w:tcPr>
-            <w:tcW w:w="554" w:type="dxa"/>
+            <w:tcW w:w="553" w:type="dxa"/>
             <w:tcBorders>
               <w:top w:val="single" w:sz="4" w:space="0" w:color="CCCCCC"/>
               <w:start w:val="single" w:sz="4" w:space="0" w:color="CCCCCC"/>
@@ -2766,19 +2761,19 @@
               <w:pStyle w:val="Normal"/>
               <w:jc w:val="start"/>
               <w:rPr>
+                <w:highlight w:val="none"/>
+                <w:shd w:fill="069A2E" w:val="clear"/>
+              </w:rPr>
+            </w:pPr>
+            <w:r>
+              <w:rPr>
+                <w:rFonts w:eastAsia="Arial" w:cs="Arial"/>
                 <w:b/>
                 <w:bCs/>
                 <w:color w:val="000000"/>
-              </w:rPr>
-            </w:pPr>
-            <w:r>
-              <w:rPr>
-                <w:rFonts w:eastAsia="Arial" w:cs="Arial"/>
-                <w:b/>
-                <w:bCs/>
-                <w:color w:val="000000"/>
-                <w:sz w:val="26"/>
-                <w:szCs w:val="26"/>
+                <w:sz w:val="26"/>
+                <w:szCs w:val="26"/>
+                <w:shd w:fill="069A2E" w:val="clear"/>
               </w:rPr>
               <w:t>Day 5</w:t>
             </w:r>
@@ -2807,8 +2802,8 @@
               <w:pStyle w:val="Normal"/>
               <w:jc w:val="start"/>
               <w:rPr>
-                <w:sz w:val="26"/>
-                <w:szCs w:val="26"/>
+                <w:highlight w:val="none"/>
+                <w:shd w:fill="069A2E" w:val="clear"/>
               </w:rPr>
             </w:pPr>
             <w:r>
@@ -2819,6 +2814,7 @@
                 <w:color w:val="222222"/>
                 <w:sz w:val="26"/>
                 <w:szCs w:val="26"/>
+                <w:shd w:fill="069A2E" w:val="clear"/>
               </w:rPr>
               <w:t>Refactor a Pandas notebook into a clean Python script</w:t>
             </w:r>
@@ -2826,29 +2822,29 @@
         </w:tc>
         <w:tc>
           <w:tcPr>
-            <w:tcW w:w="1351" w:type="dxa"/>
-            <w:tcBorders>
-              <w:top w:val="single" w:sz="4" w:space="0" w:color="CCCCCC"/>
-              <w:start w:val="single" w:sz="4" w:space="0" w:color="CCCCCC"/>
-              <w:bottom w:val="single" w:sz="4" w:space="0" w:color="CCCCCC"/>
-              <w:end w:val="single" w:sz="4" w:space="0" w:color="CCCCCC"/>
-            </w:tcBorders>
-            <w:shd w:fill="FFFFFF" w:val="clear"/>
-            <w:tcMar>
-              <w:top w:w="80" w:type="dxa"/>
-              <w:start w:w="120" w:type="dxa"/>
-              <w:bottom w:w="80" w:type="dxa"/>
-              <w:end w:w="120" w:type="dxa"/>
-            </w:tcMar>
-            <w:vAlign w:val="center"/>
-          </w:tcPr>
-          <w:p>
-            <w:pPr>
-              <w:pStyle w:val="Normal"/>
-              <w:jc w:val="start"/>
-              <w:rPr>
-                <w:sz w:val="26"/>
-                <w:szCs w:val="26"/>
+            <w:tcW w:w="1352" w:type="dxa"/>
+            <w:tcBorders>
+              <w:top w:val="single" w:sz="4" w:space="0" w:color="CCCCCC"/>
+              <w:start w:val="single" w:sz="4" w:space="0" w:color="CCCCCC"/>
+              <w:bottom w:val="single" w:sz="4" w:space="0" w:color="CCCCCC"/>
+              <w:end w:val="single" w:sz="4" w:space="0" w:color="CCCCCC"/>
+            </w:tcBorders>
+            <w:shd w:fill="FFFFFF" w:val="clear"/>
+            <w:tcMar>
+              <w:top w:w="80" w:type="dxa"/>
+              <w:start w:w="120" w:type="dxa"/>
+              <w:bottom w:w="80" w:type="dxa"/>
+              <w:end w:w="120" w:type="dxa"/>
+            </w:tcMar>
+            <w:vAlign w:val="center"/>
+          </w:tcPr>
+          <w:p>
+            <w:pPr>
+              <w:pStyle w:val="Normal"/>
+              <w:jc w:val="start"/>
+              <w:rPr>
+                <w:highlight w:val="none"/>
+                <w:shd w:fill="069A2E" w:val="clear"/>
               </w:rPr>
             </w:pPr>
             <w:r>
@@ -2859,6 +2855,7 @@
                 <w:color w:val="555555"/>
                 <w:sz w:val="26"/>
                 <w:szCs w:val="26"/>
+                <w:shd w:fill="069A2E" w:val="clear"/>
               </w:rPr>
               <w:t>1.5 hrs</w:t>
             </w:r>
@@ -2887,8 +2884,8 @@
               <w:pStyle w:val="Normal"/>
               <w:jc w:val="start"/>
               <w:rPr>
-                <w:sz w:val="26"/>
-                <w:szCs w:val="26"/>
+                <w:highlight w:val="none"/>
+                <w:shd w:fill="069A2E" w:val="clear"/>
               </w:rPr>
             </w:pPr>
             <w:r>
@@ -2899,6 +2896,7 @@
                 <w:color w:val="0C447C"/>
                 <w:sz w:val="26"/>
                 <w:szCs w:val="26"/>
+                <w:shd w:fill="069A2E" w:val="clear"/>
               </w:rPr>
               <w:t xml:space="preserve">⌨ </w:t>
             </w:r>
@@ -2910,6 +2908,7 @@
                 <w:color w:val="0C447C"/>
                 <w:sz w:val="26"/>
                 <w:szCs w:val="26"/>
+                <w:shd w:fill="069A2E" w:val="clear"/>
               </w:rPr>
               <w:t>Hands-on</w:t>
             </w:r>
@@ -2920,7 +2919,7 @@
         <w:trPr/>
         <w:tc>
           <w:tcPr>
-            <w:tcW w:w="554" w:type="dxa"/>
+            <w:tcW w:w="553" w:type="dxa"/>
             <w:tcBorders>
               <w:top w:val="single" w:sz="4" w:space="0" w:color="CCCCCC"/>
               <w:start w:val="single" w:sz="4" w:space="0" w:color="CCCCCC"/>
@@ -2981,19 +2980,19 @@
               <w:pStyle w:val="Normal"/>
               <w:jc w:val="start"/>
               <w:rPr>
+                <w:highlight w:val="none"/>
+                <w:shd w:fill="069A2E" w:val="clear"/>
+              </w:rPr>
+            </w:pPr>
+            <w:r>
+              <w:rPr>
+                <w:rFonts w:eastAsia="Arial" w:cs="Arial"/>
                 <w:b/>
                 <w:bCs/>
                 <w:color w:val="000000"/>
-              </w:rPr>
-            </w:pPr>
-            <w:r>
-              <w:rPr>
-                <w:rFonts w:eastAsia="Arial" w:cs="Arial"/>
-                <w:b/>
-                <w:bCs/>
-                <w:color w:val="000000"/>
-                <w:sz w:val="26"/>
-                <w:szCs w:val="26"/>
+                <w:sz w:val="26"/>
+                <w:szCs w:val="26"/>
+                <w:shd w:fill="069A2E" w:val="clear"/>
               </w:rPr>
               <w:t>Day 6</w:t>
             </w:r>
@@ -3022,8 +3021,8 @@
               <w:pStyle w:val="Normal"/>
               <w:jc w:val="start"/>
               <w:rPr>
-                <w:sz w:val="26"/>
-                <w:szCs w:val="26"/>
+                <w:highlight w:val="none"/>
+                <w:shd w:fill="069A2E" w:val="clear"/>
               </w:rPr>
             </w:pPr>
             <w:r>
@@ -3034,6 +3033,7 @@
                 <w:color w:val="222222"/>
                 <w:sz w:val="26"/>
                 <w:szCs w:val="26"/>
+                <w:shd w:fill="069A2E" w:val="clear"/>
               </w:rPr>
               <w:t>Virtual environments — venv, pip, requirements.txt</w:t>
             </w:r>
@@ -3041,29 +3041,29 @@
         </w:tc>
         <w:tc>
           <w:tcPr>
-            <w:tcW w:w="1351" w:type="dxa"/>
-            <w:tcBorders>
-              <w:top w:val="single" w:sz="4" w:space="0" w:color="CCCCCC"/>
-              <w:start w:val="single" w:sz="4" w:space="0" w:color="CCCCCC"/>
-              <w:bottom w:val="single" w:sz="4" w:space="0" w:color="CCCCCC"/>
-              <w:end w:val="single" w:sz="4" w:space="0" w:color="CCCCCC"/>
-            </w:tcBorders>
-            <w:shd w:fill="FFFFFF" w:val="clear"/>
-            <w:tcMar>
-              <w:top w:w="80" w:type="dxa"/>
-              <w:start w:w="120" w:type="dxa"/>
-              <w:bottom w:w="80" w:type="dxa"/>
-              <w:end w:w="120" w:type="dxa"/>
-            </w:tcMar>
-            <w:vAlign w:val="center"/>
-          </w:tcPr>
-          <w:p>
-            <w:pPr>
-              <w:pStyle w:val="Normal"/>
-              <w:jc w:val="start"/>
-              <w:rPr>
-                <w:sz w:val="26"/>
-                <w:szCs w:val="26"/>
+            <w:tcW w:w="1352" w:type="dxa"/>
+            <w:tcBorders>
+              <w:top w:val="single" w:sz="4" w:space="0" w:color="CCCCCC"/>
+              <w:start w:val="single" w:sz="4" w:space="0" w:color="CCCCCC"/>
+              <w:bottom w:val="single" w:sz="4" w:space="0" w:color="CCCCCC"/>
+              <w:end w:val="single" w:sz="4" w:space="0" w:color="CCCCCC"/>
+            </w:tcBorders>
+            <w:shd w:fill="FFFFFF" w:val="clear"/>
+            <w:tcMar>
+              <w:top w:w="80" w:type="dxa"/>
+              <w:start w:w="120" w:type="dxa"/>
+              <w:bottom w:w="80" w:type="dxa"/>
+              <w:end w:w="120" w:type="dxa"/>
+            </w:tcMar>
+            <w:vAlign w:val="center"/>
+          </w:tcPr>
+          <w:p>
+            <w:pPr>
+              <w:pStyle w:val="Normal"/>
+              <w:jc w:val="start"/>
+              <w:rPr>
+                <w:highlight w:val="none"/>
+                <w:shd w:fill="069A2E" w:val="clear"/>
               </w:rPr>
             </w:pPr>
             <w:r>
@@ -3074,6 +3074,7 @@
                 <w:color w:val="555555"/>
                 <w:sz w:val="26"/>
                 <w:szCs w:val="26"/>
+                <w:shd w:fill="069A2E" w:val="clear"/>
               </w:rPr>
               <w:t>1.5 hrs</w:t>
             </w:r>
@@ -3102,8 +3103,8 @@
               <w:pStyle w:val="Normal"/>
               <w:jc w:val="start"/>
               <w:rPr>
-                <w:sz w:val="26"/>
-                <w:szCs w:val="26"/>
+                <w:highlight w:val="none"/>
+                <w:shd w:fill="069A2E" w:val="clear"/>
               </w:rPr>
             </w:pPr>
             <w:r>
@@ -3114,6 +3115,7 @@
                 <w:color w:val="A32D2D"/>
                 <w:sz w:val="26"/>
                 <w:szCs w:val="26"/>
+                <w:shd w:fill="069A2E" w:val="clear"/>
               </w:rPr>
               <w:t xml:space="preserve">▶ </w:t>
             </w:r>
@@ -3125,6 +3127,7 @@
                 <w:color w:val="A32D2D"/>
                 <w:sz w:val="26"/>
                 <w:szCs w:val="26"/>
+                <w:shd w:fill="069A2E" w:val="clear"/>
               </w:rPr>
               <w:t>YouTube</w:t>
             </w:r>
@@ -3135,7 +3138,7 @@
         <w:trPr/>
         <w:tc>
           <w:tcPr>
-            <w:tcW w:w="554" w:type="dxa"/>
+            <w:tcW w:w="553" w:type="dxa"/>
             <w:tcBorders>
               <w:top w:val="single" w:sz="4" w:space="0" w:color="CCCCCC"/>
               <w:start w:val="single" w:sz="4" w:space="0" w:color="CCCCCC"/>
@@ -3196,19 +3199,19 @@
               <w:pStyle w:val="Normal"/>
               <w:jc w:val="start"/>
               <w:rPr>
+                <w:highlight w:val="none"/>
+                <w:shd w:fill="069A2E" w:val="clear"/>
+              </w:rPr>
+            </w:pPr>
+            <w:r>
+              <w:rPr>
+                <w:rFonts w:eastAsia="Arial" w:cs="Arial"/>
                 <w:b/>
                 <w:bCs/>
                 <w:color w:val="000000"/>
-              </w:rPr>
-            </w:pPr>
-            <w:r>
-              <w:rPr>
-                <w:rFonts w:eastAsia="Arial" w:cs="Arial"/>
-                <w:b/>
-                <w:bCs/>
-                <w:color w:val="000000"/>
-                <w:sz w:val="26"/>
-                <w:szCs w:val="26"/>
+                <w:sz w:val="26"/>
+                <w:szCs w:val="26"/>
+                <w:shd w:fill="069A2E" w:val="clear"/>
               </w:rPr>
               <w:t>Day 7</w:t>
             </w:r>
@@ -3237,8 +3240,8 @@
               <w:pStyle w:val="Normal"/>
               <w:jc w:val="start"/>
               <w:rPr>
-                <w:sz w:val="26"/>
-                <w:szCs w:val="26"/>
+                <w:highlight w:val="none"/>
+                <w:shd w:fill="069A2E" w:val="clear"/>
               </w:rPr>
             </w:pPr>
             <w:r>
@@ -3249,6 +3252,7 @@
                 <w:color w:val="222222"/>
                 <w:sz w:val="26"/>
                 <w:szCs w:val="26"/>
+                <w:shd w:fill="069A2E" w:val="clear"/>
               </w:rPr>
               <w:t>What is MLflow? Concepts — runs, experiments, metrics</w:t>
             </w:r>
@@ -3256,29 +3260,29 @@
         </w:tc>
         <w:tc>
           <w:tcPr>
-            <w:tcW w:w="1351" w:type="dxa"/>
-            <w:tcBorders>
-              <w:top w:val="single" w:sz="4" w:space="0" w:color="CCCCCC"/>
-              <w:start w:val="single" w:sz="4" w:space="0" w:color="CCCCCC"/>
-              <w:bottom w:val="single" w:sz="4" w:space="0" w:color="CCCCCC"/>
-              <w:end w:val="single" w:sz="4" w:space="0" w:color="CCCCCC"/>
-            </w:tcBorders>
-            <w:shd w:fill="FFFFFF" w:val="clear"/>
-            <w:tcMar>
-              <w:top w:w="80" w:type="dxa"/>
-              <w:start w:w="120" w:type="dxa"/>
-              <w:bottom w:w="80" w:type="dxa"/>
-              <w:end w:w="120" w:type="dxa"/>
-            </w:tcMar>
-            <w:vAlign w:val="center"/>
-          </w:tcPr>
-          <w:p>
-            <w:pPr>
-              <w:pStyle w:val="Normal"/>
-              <w:jc w:val="start"/>
-              <w:rPr>
-                <w:sz w:val="26"/>
-                <w:szCs w:val="26"/>
+            <w:tcW w:w="1352" w:type="dxa"/>
+            <w:tcBorders>
+              <w:top w:val="single" w:sz="4" w:space="0" w:color="CCCCCC"/>
+              <w:start w:val="single" w:sz="4" w:space="0" w:color="CCCCCC"/>
+              <w:bottom w:val="single" w:sz="4" w:space="0" w:color="CCCCCC"/>
+              <w:end w:val="single" w:sz="4" w:space="0" w:color="CCCCCC"/>
+            </w:tcBorders>
+            <w:shd w:fill="FFFFFF" w:val="clear"/>
+            <w:tcMar>
+              <w:top w:w="80" w:type="dxa"/>
+              <w:start w:w="120" w:type="dxa"/>
+              <w:bottom w:w="80" w:type="dxa"/>
+              <w:end w:w="120" w:type="dxa"/>
+            </w:tcMar>
+            <w:vAlign w:val="center"/>
+          </w:tcPr>
+          <w:p>
+            <w:pPr>
+              <w:pStyle w:val="Normal"/>
+              <w:jc w:val="start"/>
+              <w:rPr>
+                <w:highlight w:val="none"/>
+                <w:shd w:fill="069A2E" w:val="clear"/>
               </w:rPr>
             </w:pPr>
             <w:r>
@@ -3289,6 +3293,7 @@
                 <w:color w:val="555555"/>
                 <w:sz w:val="26"/>
                 <w:szCs w:val="26"/>
+                <w:shd w:fill="069A2E" w:val="clear"/>
               </w:rPr>
               <w:t>1.5 hrs</w:t>
             </w:r>
@@ -3317,8 +3322,8 @@
               <w:pStyle w:val="Normal"/>
               <w:jc w:val="start"/>
               <w:rPr>
-                <w:sz w:val="26"/>
-                <w:szCs w:val="26"/>
+                <w:highlight w:val="none"/>
+                <w:shd w:fill="069A2E" w:val="clear"/>
               </w:rPr>
             </w:pPr>
             <w:r>
@@ -3329,6 +3334,7 @@
                 <w:color w:val="A32D2D"/>
                 <w:sz w:val="26"/>
                 <w:szCs w:val="26"/>
+                <w:shd w:fill="069A2E" w:val="clear"/>
               </w:rPr>
               <w:t xml:space="preserve">▶ </w:t>
             </w:r>
@@ -3340,6 +3346,7 @@
                 <w:color w:val="A32D2D"/>
                 <w:sz w:val="26"/>
                 <w:szCs w:val="26"/>
+                <w:shd w:fill="069A2E" w:val="clear"/>
               </w:rPr>
               <w:t>YouTube</w:t>
             </w:r>
@@ -3350,7 +3357,7 @@
         <w:trPr/>
         <w:tc>
           <w:tcPr>
-            <w:tcW w:w="554" w:type="dxa"/>
+            <w:tcW w:w="553" w:type="dxa"/>
             <w:tcBorders>
               <w:top w:val="single" w:sz="4" w:space="0" w:color="CCCCCC"/>
               <w:start w:val="single" w:sz="4" w:space="0" w:color="CCCCCC"/>
@@ -3409,19 +3416,16 @@
           <w:p>
             <w:pPr>
               <w:pStyle w:val="Normal"/>
-              <w:jc w:val="start"/>
-              <w:rPr>
+              <w:shd w:fill="3FAF46" w:val="clear"/>
+              <w:jc w:val="start"/>
+              <w:rPr/>
+            </w:pPr>
+            <w:r>
+              <w:rPr>
+                <w:rFonts w:eastAsia="Arial" w:cs="Arial"/>
                 <w:b/>
                 <w:bCs/>
                 <w:color w:val="000000"/>
-              </w:rPr>
-            </w:pPr>
-            <w:r>
-              <w:rPr>
-                <w:rFonts w:eastAsia="Arial" w:cs="Arial"/>
-                <w:b/>
-                <w:bCs/>
-                <w:color w:val="000000"/>
                 <w:sz w:val="26"/>
                 <w:szCs w:val="26"/>
               </w:rPr>
@@ -3450,11 +3454,9 @@
           <w:p>
             <w:pPr>
               <w:pStyle w:val="Normal"/>
-              <w:jc w:val="start"/>
-              <w:rPr>
-                <w:sz w:val="26"/>
-                <w:szCs w:val="26"/>
-              </w:rPr>
+              <w:shd w:fill="3FAF46" w:val="clear"/>
+              <w:jc w:val="start"/>
+              <w:rPr/>
             </w:pPr>
             <w:r>
               <w:rPr>
@@ -3471,30 +3473,28 @@
         </w:tc>
         <w:tc>
           <w:tcPr>
-            <w:tcW w:w="1351" w:type="dxa"/>
-            <w:tcBorders>
-              <w:top w:val="single" w:sz="4" w:space="0" w:color="CCCCCC"/>
-              <w:start w:val="single" w:sz="4" w:space="0" w:color="CCCCCC"/>
-              <w:bottom w:val="single" w:sz="4" w:space="0" w:color="CCCCCC"/>
-              <w:end w:val="single" w:sz="4" w:space="0" w:color="CCCCCC"/>
-            </w:tcBorders>
-            <w:shd w:fill="FFFFFF" w:val="clear"/>
-            <w:tcMar>
-              <w:top w:w="80" w:type="dxa"/>
-              <w:start w:w="120" w:type="dxa"/>
-              <w:bottom w:w="80" w:type="dxa"/>
-              <w:end w:w="120" w:type="dxa"/>
-            </w:tcMar>
-            <w:vAlign w:val="center"/>
-          </w:tcPr>
-          <w:p>
-            <w:pPr>
-              <w:pStyle w:val="Normal"/>
-              <w:jc w:val="start"/>
-              <w:rPr>
-                <w:sz w:val="26"/>
-                <w:szCs w:val="26"/>
-              </w:rPr>
+            <w:tcW w:w="1352" w:type="dxa"/>
+            <w:tcBorders>
+              <w:top w:val="single" w:sz="4" w:space="0" w:color="CCCCCC"/>
+              <w:start w:val="single" w:sz="4" w:space="0" w:color="CCCCCC"/>
+              <w:bottom w:val="single" w:sz="4" w:space="0" w:color="CCCCCC"/>
+              <w:end w:val="single" w:sz="4" w:space="0" w:color="CCCCCC"/>
+            </w:tcBorders>
+            <w:shd w:fill="FFFFFF" w:val="clear"/>
+            <w:tcMar>
+              <w:top w:w="80" w:type="dxa"/>
+              <w:start w:w="120" w:type="dxa"/>
+              <w:bottom w:w="80" w:type="dxa"/>
+              <w:end w:w="120" w:type="dxa"/>
+            </w:tcMar>
+            <w:vAlign w:val="center"/>
+          </w:tcPr>
+          <w:p>
+            <w:pPr>
+              <w:pStyle w:val="Normal"/>
+              <w:shd w:fill="3FAF46" w:val="clear"/>
+              <w:jc w:val="start"/>
+              <w:rPr/>
             </w:pPr>
             <w:r>
               <w:rPr>
@@ -3530,11 +3530,9 @@
           <w:p>
             <w:pPr>
               <w:pStyle w:val="Normal"/>
-              <w:jc w:val="start"/>
-              <w:rPr>
-                <w:sz w:val="26"/>
-                <w:szCs w:val="26"/>
-              </w:rPr>
+              <w:shd w:fill="3FAF46" w:val="clear"/>
+              <w:jc w:val="start"/>
+              <w:rPr/>
             </w:pPr>
             <w:r>
               <w:rPr>
@@ -3565,7 +3563,7 @@
         <w:trPr/>
         <w:tc>
           <w:tcPr>
-            <w:tcW w:w="554" w:type="dxa"/>
+            <w:tcW w:w="553" w:type="dxa"/>
             <w:tcBorders>
               <w:top w:val="single" w:sz="4" w:space="0" w:color="CCCCCC"/>
               <w:start w:val="single" w:sz="4" w:space="0" w:color="CCCCCC"/>
@@ -3686,7 +3684,7 @@
         </w:tc>
         <w:tc>
           <w:tcPr>
-            <w:tcW w:w="1351" w:type="dxa"/>
+            <w:tcW w:w="1352" w:type="dxa"/>
             <w:tcBorders>
               <w:top w:val="single" w:sz="4" w:space="0" w:color="CCCCCC"/>
               <w:start w:val="single" w:sz="4" w:space="0" w:color="CCCCCC"/>
@@ -3780,7 +3778,7 @@
         <w:trPr/>
         <w:tc>
           <w:tcPr>
-            <w:tcW w:w="554" w:type="dxa"/>
+            <w:tcW w:w="553" w:type="dxa"/>
             <w:tcBorders>
               <w:top w:val="single" w:sz="4" w:space="0" w:color="CCCCCC"/>
               <w:start w:val="single" w:sz="4" w:space="0" w:color="CCCCCC"/>
@@ -3901,7 +3899,7 @@
         </w:tc>
         <w:tc>
           <w:tcPr>
-            <w:tcW w:w="1351" w:type="dxa"/>
+            <w:tcW w:w="1352" w:type="dxa"/>
             <w:tcBorders>
               <w:top w:val="single" w:sz="4" w:space="0" w:color="CCCCCC"/>
               <w:start w:val="single" w:sz="4" w:space="0" w:color="CCCCCC"/>
@@ -3995,7 +3993,7 @@
         <w:trPr/>
         <w:tc>
           <w:tcPr>
-            <w:tcW w:w="554" w:type="dxa"/>
+            <w:tcW w:w="553" w:type="dxa"/>
             <w:tcBorders>
               <w:top w:val="single" w:sz="4" w:space="0" w:color="CCCCCC"/>
               <w:start w:val="single" w:sz="4" w:space="0" w:color="CCCCCC"/>
@@ -4116,7 +4114,7 @@
         </w:tc>
         <w:tc>
           <w:tcPr>
-            <w:tcW w:w="1351" w:type="dxa"/>
+            <w:tcW w:w="1352" w:type="dxa"/>
             <w:tcBorders>
               <w:top w:val="single" w:sz="4" w:space="0" w:color="CCCCCC"/>
               <w:start w:val="single" w:sz="4" w:space="0" w:color="CCCCCC"/>
@@ -4212,7 +4210,7 @@
         </w:trPr>
         <w:tc>
           <w:tcPr>
-            <w:tcW w:w="554" w:type="dxa"/>
+            <w:tcW w:w="553" w:type="dxa"/>
             <w:tcBorders>
               <w:top w:val="single" w:sz="4" w:space="0" w:color="CCCCCC"/>
               <w:start w:val="single" w:sz="4" w:space="0" w:color="CCCCCC"/>
@@ -4333,7 +4331,7 @@
         </w:tc>
         <w:tc>
           <w:tcPr>
-            <w:tcW w:w="1351" w:type="dxa"/>
+            <w:tcW w:w="1352" w:type="dxa"/>
             <w:tcBorders>
               <w:top w:val="single" w:sz="4" w:space="0" w:color="CCCCCC"/>
               <w:start w:val="single" w:sz="4" w:space="0" w:color="CCCCCC"/>
@@ -4807,9 +4805,9 @@
       <w:tblGrid>
         <w:gridCol w:w="519"/>
         <w:gridCol w:w="1671"/>
-        <w:gridCol w:w="4679"/>
+        <w:gridCol w:w="4678"/>
         <w:gridCol w:w="1260"/>
-        <w:gridCol w:w="1951"/>
+        <w:gridCol w:w="1952"/>
       </w:tblGrid>
       <w:tr>
         <w:trPr/>
@@ -4931,7 +4929,7 @@
         </w:tc>
         <w:tc>
           <w:tcPr>
-            <w:tcW w:w="4679" w:type="dxa"/>
+            <w:tcW w:w="4678" w:type="dxa"/>
             <w:tcBorders>
               <w:top w:val="single" w:sz="4" w:space="0" w:color="CCCCCC"/>
               <w:start w:val="single" w:sz="4" w:space="0" w:color="CCCCCC"/>
@@ -5011,7 +5009,7 @@
         </w:tc>
         <w:tc>
           <w:tcPr>
-            <w:tcW w:w="1951" w:type="dxa"/>
+            <w:tcW w:w="1952" w:type="dxa"/>
             <w:tcBorders>
               <w:top w:val="single" w:sz="4" w:space="0" w:color="CCCCCC"/>
               <w:start w:val="single" w:sz="4" w:space="0" w:color="CCCCCC"/>
@@ -5134,7 +5132,7 @@
         </w:tc>
         <w:tc>
           <w:tcPr>
-            <w:tcW w:w="4679" w:type="dxa"/>
+            <w:tcW w:w="4678" w:type="dxa"/>
             <w:tcBorders>
               <w:top w:val="single" w:sz="4" w:space="0" w:color="CCCCCC"/>
               <w:start w:val="single" w:sz="4" w:space="0" w:color="CCCCCC"/>
@@ -5214,7 +5212,7 @@
         </w:tc>
         <w:tc>
           <w:tcPr>
-            <w:tcW w:w="1951" w:type="dxa"/>
+            <w:tcW w:w="1952" w:type="dxa"/>
             <w:tcBorders>
               <w:top w:val="single" w:sz="4" w:space="0" w:color="CCCCCC"/>
               <w:start w:val="single" w:sz="4" w:space="0" w:color="CCCCCC"/>
@@ -5348,7 +5346,7 @@
         </w:tc>
         <w:tc>
           <w:tcPr>
-            <w:tcW w:w="4679" w:type="dxa"/>
+            <w:tcW w:w="4678" w:type="dxa"/>
             <w:tcBorders>
               <w:top w:val="single" w:sz="4" w:space="0" w:color="CCCCCC"/>
               <w:start w:val="single" w:sz="4" w:space="0" w:color="CCCCCC"/>
@@ -5428,7 +5426,7 @@
         </w:tc>
         <w:tc>
           <w:tcPr>
-            <w:tcW w:w="1951" w:type="dxa"/>
+            <w:tcW w:w="1952" w:type="dxa"/>
             <w:tcBorders>
               <w:top w:val="single" w:sz="4" w:space="0" w:color="CCCCCC"/>
               <w:start w:val="single" w:sz="4" w:space="0" w:color="CCCCCC"/>
@@ -5562,7 +5560,7 @@
         </w:tc>
         <w:tc>
           <w:tcPr>
-            <w:tcW w:w="4679" w:type="dxa"/>
+            <w:tcW w:w="4678" w:type="dxa"/>
             <w:tcBorders>
               <w:top w:val="single" w:sz="4" w:space="0" w:color="CCCCCC"/>
               <w:start w:val="single" w:sz="4" w:space="0" w:color="CCCCCC"/>
@@ -5642,7 +5640,7 @@
         </w:tc>
         <w:tc>
           <w:tcPr>
-            <w:tcW w:w="1951" w:type="dxa"/>
+            <w:tcW w:w="1952" w:type="dxa"/>
             <w:tcBorders>
               <w:top w:val="single" w:sz="4" w:space="0" w:color="CCCCCC"/>
               <w:start w:val="single" w:sz="4" w:space="0" w:color="CCCCCC"/>
@@ -5776,7 +5774,7 @@
         </w:tc>
         <w:tc>
           <w:tcPr>
-            <w:tcW w:w="4679" w:type="dxa"/>
+            <w:tcW w:w="4678" w:type="dxa"/>
             <w:tcBorders>
               <w:top w:val="single" w:sz="4" w:space="0" w:color="CCCCCC"/>
               <w:start w:val="single" w:sz="4" w:space="0" w:color="CCCCCC"/>
@@ -5856,7 +5854,7 @@
         </w:tc>
         <w:tc>
           <w:tcPr>
-            <w:tcW w:w="1951" w:type="dxa"/>
+            <w:tcW w:w="1952" w:type="dxa"/>
             <w:tcBorders>
               <w:top w:val="single" w:sz="4" w:space="0" w:color="CCCCCC"/>
               <w:start w:val="single" w:sz="4" w:space="0" w:color="CCCCCC"/>
@@ -5990,7 +5988,7 @@
         </w:tc>
         <w:tc>
           <w:tcPr>
-            <w:tcW w:w="4679" w:type="dxa"/>
+            <w:tcW w:w="4678" w:type="dxa"/>
             <w:tcBorders>
               <w:top w:val="single" w:sz="4" w:space="0" w:color="CCCCCC"/>
               <w:start w:val="single" w:sz="4" w:space="0" w:color="CCCCCC"/>
@@ -6070,7 +6068,7 @@
         </w:tc>
         <w:tc>
           <w:tcPr>
-            <w:tcW w:w="1951" w:type="dxa"/>
+            <w:tcW w:w="1952" w:type="dxa"/>
             <w:tcBorders>
               <w:top w:val="single" w:sz="4" w:space="0" w:color="CCCCCC"/>
               <w:start w:val="single" w:sz="4" w:space="0" w:color="CCCCCC"/>
@@ -6204,7 +6202,7 @@
         </w:tc>
         <w:tc>
           <w:tcPr>
-            <w:tcW w:w="4679" w:type="dxa"/>
+            <w:tcW w:w="4678" w:type="dxa"/>
             <w:tcBorders>
               <w:top w:val="single" w:sz="4" w:space="0" w:color="CCCCCC"/>
               <w:start w:val="single" w:sz="4" w:space="0" w:color="CCCCCC"/>
@@ -6284,7 +6282,7 @@
         </w:tc>
         <w:tc>
           <w:tcPr>
-            <w:tcW w:w="1951" w:type="dxa"/>
+            <w:tcW w:w="1952" w:type="dxa"/>
             <w:tcBorders>
               <w:top w:val="single" w:sz="4" w:space="0" w:color="CCCCCC"/>
               <w:start w:val="single" w:sz="4" w:space="0" w:color="CCCCCC"/>
@@ -6418,7 +6416,7 @@
         </w:tc>
         <w:tc>
           <w:tcPr>
-            <w:tcW w:w="4679" w:type="dxa"/>
+            <w:tcW w:w="4678" w:type="dxa"/>
             <w:tcBorders>
               <w:top w:val="single" w:sz="4" w:space="0" w:color="CCCCCC"/>
               <w:start w:val="single" w:sz="4" w:space="0" w:color="CCCCCC"/>
@@ -6498,7 +6496,7 @@
         </w:tc>
         <w:tc>
           <w:tcPr>
-            <w:tcW w:w="1951" w:type="dxa"/>
+            <w:tcW w:w="1952" w:type="dxa"/>
             <w:tcBorders>
               <w:top w:val="single" w:sz="4" w:space="0" w:color="CCCCCC"/>
               <w:start w:val="single" w:sz="4" w:space="0" w:color="CCCCCC"/>
@@ -6632,7 +6630,7 @@
         </w:tc>
         <w:tc>
           <w:tcPr>
-            <w:tcW w:w="4679" w:type="dxa"/>
+            <w:tcW w:w="4678" w:type="dxa"/>
             <w:tcBorders>
               <w:top w:val="single" w:sz="4" w:space="0" w:color="CCCCCC"/>
               <w:start w:val="single" w:sz="4" w:space="0" w:color="CCCCCC"/>
@@ -6712,7 +6710,7 @@
         </w:tc>
         <w:tc>
           <w:tcPr>
-            <w:tcW w:w="1951" w:type="dxa"/>
+            <w:tcW w:w="1952" w:type="dxa"/>
             <w:tcBorders>
               <w:top w:val="single" w:sz="4" w:space="0" w:color="CCCCCC"/>
               <w:start w:val="single" w:sz="4" w:space="0" w:color="CCCCCC"/>
@@ -6846,7 +6844,7 @@
         </w:tc>
         <w:tc>
           <w:tcPr>
-            <w:tcW w:w="4679" w:type="dxa"/>
+            <w:tcW w:w="4678" w:type="dxa"/>
             <w:tcBorders>
               <w:top w:val="single" w:sz="4" w:space="0" w:color="CCCCCC"/>
               <w:start w:val="single" w:sz="4" w:space="0" w:color="CCCCCC"/>
@@ -6926,7 +6924,7 @@
         </w:tc>
         <w:tc>
           <w:tcPr>
-            <w:tcW w:w="1951" w:type="dxa"/>
+            <w:tcW w:w="1952" w:type="dxa"/>
             <w:tcBorders>
               <w:top w:val="single" w:sz="4" w:space="0" w:color="CCCCCC"/>
               <w:start w:val="single" w:sz="4" w:space="0" w:color="CCCCCC"/>
@@ -7060,7 +7058,7 @@
         </w:tc>
         <w:tc>
           <w:tcPr>
-            <w:tcW w:w="4679" w:type="dxa"/>
+            <w:tcW w:w="4678" w:type="dxa"/>
             <w:tcBorders>
               <w:top w:val="single" w:sz="4" w:space="0" w:color="CCCCCC"/>
               <w:start w:val="single" w:sz="4" w:space="0" w:color="CCCCCC"/>
@@ -7140,7 +7138,7 @@
         </w:tc>
         <w:tc>
           <w:tcPr>
-            <w:tcW w:w="1951" w:type="dxa"/>
+            <w:tcW w:w="1952" w:type="dxa"/>
             <w:tcBorders>
               <w:top w:val="single" w:sz="4" w:space="0" w:color="CCCCCC"/>
               <w:start w:val="single" w:sz="4" w:space="0" w:color="CCCCCC"/>
@@ -7274,7 +7272,7 @@
         </w:tc>
         <w:tc>
           <w:tcPr>
-            <w:tcW w:w="4679" w:type="dxa"/>
+            <w:tcW w:w="4678" w:type="dxa"/>
             <w:tcBorders>
               <w:top w:val="single" w:sz="4" w:space="0" w:color="CCCCCC"/>
               <w:start w:val="single" w:sz="4" w:space="0" w:color="CCCCCC"/>
@@ -7354,7 +7352,7 @@
         </w:tc>
         <w:tc>
           <w:tcPr>
-            <w:tcW w:w="1951" w:type="dxa"/>
+            <w:tcW w:w="1952" w:type="dxa"/>
             <w:tcBorders>
               <w:top w:val="single" w:sz="4" w:space="0" w:color="CCCCCC"/>
               <w:start w:val="single" w:sz="4" w:space="0" w:color="CCCCCC"/>
@@ -7488,7 +7486,7 @@
         </w:tc>
         <w:tc>
           <w:tcPr>
-            <w:tcW w:w="4679" w:type="dxa"/>
+            <w:tcW w:w="4678" w:type="dxa"/>
             <w:tcBorders>
               <w:top w:val="single" w:sz="4" w:space="0" w:color="CCCCCC"/>
               <w:start w:val="single" w:sz="4" w:space="0" w:color="CCCCCC"/>
@@ -7568,7 +7566,7 @@
         </w:tc>
         <w:tc>
           <w:tcPr>
-            <w:tcW w:w="1951" w:type="dxa"/>
+            <w:tcW w:w="1952" w:type="dxa"/>
             <w:tcBorders>
               <w:top w:val="single" w:sz="4" w:space="0" w:color="CCCCCC"/>
               <w:start w:val="single" w:sz="4" w:space="0" w:color="CCCCCC"/>
@@ -7702,7 +7700,7 @@
         </w:tc>
         <w:tc>
           <w:tcPr>
-            <w:tcW w:w="4679" w:type="dxa"/>
+            <w:tcW w:w="4678" w:type="dxa"/>
             <w:tcBorders>
               <w:top w:val="single" w:sz="4" w:space="0" w:color="CCCCCC"/>
               <w:start w:val="single" w:sz="4" w:space="0" w:color="CCCCCC"/>
@@ -7782,7 +7780,7 @@
         </w:tc>
         <w:tc>
           <w:tcPr>
-            <w:tcW w:w="1951" w:type="dxa"/>
+            <w:tcW w:w="1952" w:type="dxa"/>
             <w:tcBorders>
               <w:top w:val="single" w:sz="4" w:space="0" w:color="CCCCCC"/>
               <w:start w:val="single" w:sz="4" w:space="0" w:color="CCCCCC"/>
@@ -7916,7 +7914,7 @@
         </w:tc>
         <w:tc>
           <w:tcPr>
-            <w:tcW w:w="4679" w:type="dxa"/>
+            <w:tcW w:w="4678" w:type="dxa"/>
             <w:tcBorders>
               <w:top w:val="single" w:sz="4" w:space="0" w:color="CCCCCC"/>
               <w:start w:val="single" w:sz="4" w:space="0" w:color="CCCCCC"/>
@@ -7996,7 +7994,7 @@
         </w:tc>
         <w:tc>
           <w:tcPr>
-            <w:tcW w:w="1951" w:type="dxa"/>
+            <w:tcW w:w="1952" w:type="dxa"/>
             <w:tcBorders>
               <w:top w:val="single" w:sz="4" w:space="0" w:color="CCCCCC"/>
               <w:start w:val="single" w:sz="4" w:space="0" w:color="CCCCCC"/>
@@ -8426,10 +8424,10 @@
       </w:tblPr>
       <w:tblGrid>
         <w:gridCol w:w="519"/>
-        <w:gridCol w:w="1670"/>
-        <w:gridCol w:w="3871"/>
-        <w:gridCol w:w="1049"/>
-        <w:gridCol w:w="2521"/>
+        <w:gridCol w:w="1669"/>
+        <w:gridCol w:w="3872"/>
+        <w:gridCol w:w="1048"/>
+        <w:gridCol w:w="2522"/>
       </w:tblGrid>
       <w:tr>
         <w:trPr/>
@@ -8511,7 +8509,7 @@
         </w:tc>
         <w:tc>
           <w:tcPr>
-            <w:tcW w:w="1670" w:type="dxa"/>
+            <w:tcW w:w="1669" w:type="dxa"/>
             <w:tcBorders>
               <w:top w:val="single" w:sz="4" w:space="0" w:color="CCCCCC"/>
               <w:start w:val="single" w:sz="4" w:space="0" w:color="CCCCCC"/>
@@ -8551,7 +8549,7 @@
         </w:tc>
         <w:tc>
           <w:tcPr>
-            <w:tcW w:w="3871" w:type="dxa"/>
+            <w:tcW w:w="3872" w:type="dxa"/>
             <w:tcBorders>
               <w:top w:val="single" w:sz="4" w:space="0" w:color="CCCCCC"/>
               <w:start w:val="single" w:sz="4" w:space="0" w:color="CCCCCC"/>
@@ -8591,7 +8589,7 @@
         </w:tc>
         <w:tc>
           <w:tcPr>
-            <w:tcW w:w="1049" w:type="dxa"/>
+            <w:tcW w:w="1048" w:type="dxa"/>
             <w:tcBorders>
               <w:top w:val="single" w:sz="4" w:space="0" w:color="CCCCCC"/>
               <w:start w:val="single" w:sz="4" w:space="0" w:color="CCCCCC"/>
@@ -8631,7 +8629,7 @@
         </w:tc>
         <w:tc>
           <w:tcPr>
-            <w:tcW w:w="2521" w:type="dxa"/>
+            <w:tcW w:w="2522" w:type="dxa"/>
             <w:tcBorders>
               <w:top w:val="single" w:sz="4" w:space="0" w:color="CCCCCC"/>
               <w:start w:val="single" w:sz="4" w:space="0" w:color="CCCCCC"/>
@@ -8714,7 +8712,7 @@
         </w:tc>
         <w:tc>
           <w:tcPr>
-            <w:tcW w:w="1670" w:type="dxa"/>
+            <w:tcW w:w="1669" w:type="dxa"/>
             <w:tcBorders>
               <w:top w:val="single" w:sz="4" w:space="0" w:color="CCCCCC"/>
               <w:start w:val="single" w:sz="4" w:space="0" w:color="CCCCCC"/>
@@ -8754,7 +8752,7 @@
         </w:tc>
         <w:tc>
           <w:tcPr>
-            <w:tcW w:w="3871" w:type="dxa"/>
+            <w:tcW w:w="3872" w:type="dxa"/>
             <w:tcBorders>
               <w:top w:val="single" w:sz="4" w:space="0" w:color="CCCCCC"/>
               <w:start w:val="single" w:sz="4" w:space="0" w:color="CCCCCC"/>
@@ -8794,7 +8792,7 @@
         </w:tc>
         <w:tc>
           <w:tcPr>
-            <w:tcW w:w="1049" w:type="dxa"/>
+            <w:tcW w:w="1048" w:type="dxa"/>
             <w:tcBorders>
               <w:top w:val="single" w:sz="4" w:space="0" w:color="CCCCCC"/>
               <w:start w:val="single" w:sz="4" w:space="0" w:color="CCCCCC"/>
@@ -8834,7 +8832,7 @@
         </w:tc>
         <w:tc>
           <w:tcPr>
-            <w:tcW w:w="2521" w:type="dxa"/>
+            <w:tcW w:w="2522" w:type="dxa"/>
             <w:tcBorders>
               <w:top w:val="single" w:sz="4" w:space="0" w:color="CCCCCC"/>
               <w:start w:val="single" w:sz="4" w:space="0" w:color="CCCCCC"/>
@@ -8928,7 +8926,7 @@
         </w:tc>
         <w:tc>
           <w:tcPr>
-            <w:tcW w:w="1670" w:type="dxa"/>
+            <w:tcW w:w="1669" w:type="dxa"/>
             <w:tcBorders>
               <w:top w:val="single" w:sz="4" w:space="0" w:color="CCCCCC"/>
               <w:start w:val="single" w:sz="4" w:space="0" w:color="CCCCCC"/>
@@ -8968,7 +8966,7 @@
         </w:tc>
         <w:tc>
           <w:tcPr>
-            <w:tcW w:w="3871" w:type="dxa"/>
+            <w:tcW w:w="3872" w:type="dxa"/>
             <w:tcBorders>
               <w:top w:val="single" w:sz="4" w:space="0" w:color="CCCCCC"/>
               <w:start w:val="single" w:sz="4" w:space="0" w:color="CCCCCC"/>
@@ -9008,7 +9006,7 @@
         </w:tc>
         <w:tc>
           <w:tcPr>
-            <w:tcW w:w="1049" w:type="dxa"/>
+            <w:tcW w:w="1048" w:type="dxa"/>
             <w:tcBorders>
               <w:top w:val="single" w:sz="4" w:space="0" w:color="CCCCCC"/>
               <w:start w:val="single" w:sz="4" w:space="0" w:color="CCCCCC"/>
@@ -9048,7 +9046,7 @@
         </w:tc>
         <w:tc>
           <w:tcPr>
-            <w:tcW w:w="2521" w:type="dxa"/>
+            <w:tcW w:w="2522" w:type="dxa"/>
             <w:tcBorders>
               <w:top w:val="single" w:sz="4" w:space="0" w:color="CCCCCC"/>
               <w:start w:val="single" w:sz="4" w:space="0" w:color="CCCCCC"/>
@@ -9142,7 +9140,7 @@
         </w:tc>
         <w:tc>
           <w:tcPr>
-            <w:tcW w:w="1670" w:type="dxa"/>
+            <w:tcW w:w="1669" w:type="dxa"/>
             <w:tcBorders>
               <w:top w:val="single" w:sz="4" w:space="0" w:color="CCCCCC"/>
               <w:start w:val="single" w:sz="4" w:space="0" w:color="CCCCCC"/>
@@ -9182,7 +9180,7 @@
         </w:tc>
         <w:tc>
           <w:tcPr>
-            <w:tcW w:w="3871" w:type="dxa"/>
+            <w:tcW w:w="3872" w:type="dxa"/>
             <w:tcBorders>
               <w:top w:val="single" w:sz="4" w:space="0" w:color="CCCCCC"/>
               <w:start w:val="single" w:sz="4" w:space="0" w:color="CCCCCC"/>
@@ -9222,7 +9220,7 @@
         </w:tc>
         <w:tc>
           <w:tcPr>
-            <w:tcW w:w="1049" w:type="dxa"/>
+            <w:tcW w:w="1048" w:type="dxa"/>
             <w:tcBorders>
               <w:top w:val="single" w:sz="4" w:space="0" w:color="CCCCCC"/>
               <w:start w:val="single" w:sz="4" w:space="0" w:color="CCCCCC"/>
@@ -9262,7 +9260,7 @@
         </w:tc>
         <w:tc>
           <w:tcPr>
-            <w:tcW w:w="2521" w:type="dxa"/>
+            <w:tcW w:w="2522" w:type="dxa"/>
             <w:tcBorders>
               <w:top w:val="single" w:sz="4" w:space="0" w:color="CCCCCC"/>
               <w:start w:val="single" w:sz="4" w:space="0" w:color="CCCCCC"/>
@@ -9356,7 +9354,7 @@
         </w:tc>
         <w:tc>
           <w:tcPr>
-            <w:tcW w:w="1670" w:type="dxa"/>
+            <w:tcW w:w="1669" w:type="dxa"/>
             <w:tcBorders>
               <w:top w:val="single" w:sz="4" w:space="0" w:color="CCCCCC"/>
               <w:start w:val="single" w:sz="4" w:space="0" w:color="CCCCCC"/>
@@ -9396,7 +9394,7 @@
         </w:tc>
         <w:tc>
           <w:tcPr>
-            <w:tcW w:w="3871" w:type="dxa"/>
+            <w:tcW w:w="3872" w:type="dxa"/>
             <w:tcBorders>
               <w:top w:val="single" w:sz="4" w:space="0" w:color="CCCCCC"/>
               <w:start w:val="single" w:sz="4" w:space="0" w:color="CCCCCC"/>
@@ -9436,7 +9434,7 @@
         </w:tc>
         <w:tc>
           <w:tcPr>
-            <w:tcW w:w="1049" w:type="dxa"/>
+            <w:tcW w:w="1048" w:type="dxa"/>
             <w:tcBorders>
               <w:top w:val="single" w:sz="4" w:space="0" w:color="CCCCCC"/>
               <w:start w:val="single" w:sz="4" w:space="0" w:color="CCCCCC"/>
@@ -9476,7 +9474,7 @@
         </w:tc>
         <w:tc>
           <w:tcPr>
-            <w:tcW w:w="2521" w:type="dxa"/>
+            <w:tcW w:w="2522" w:type="dxa"/>
             <w:tcBorders>
               <w:top w:val="single" w:sz="4" w:space="0" w:color="CCCCCC"/>
               <w:start w:val="single" w:sz="4" w:space="0" w:color="CCCCCC"/>
@@ -9570,7 +9568,7 @@
         </w:tc>
         <w:tc>
           <w:tcPr>
-            <w:tcW w:w="1670" w:type="dxa"/>
+            <w:tcW w:w="1669" w:type="dxa"/>
             <w:tcBorders>
               <w:top w:val="single" w:sz="4" w:space="0" w:color="CCCCCC"/>
               <w:start w:val="single" w:sz="4" w:space="0" w:color="CCCCCC"/>
@@ -9610,7 +9608,7 @@
         </w:tc>
         <w:tc>
           <w:tcPr>
-            <w:tcW w:w="3871" w:type="dxa"/>
+            <w:tcW w:w="3872" w:type="dxa"/>
             <w:tcBorders>
               <w:top w:val="single" w:sz="4" w:space="0" w:color="CCCCCC"/>
               <w:start w:val="single" w:sz="4" w:space="0" w:color="CCCCCC"/>
@@ -9650,7 +9648,7 @@
         </w:tc>
         <w:tc>
           <w:tcPr>
-            <w:tcW w:w="1049" w:type="dxa"/>
+            <w:tcW w:w="1048" w:type="dxa"/>
             <w:tcBorders>
               <w:top w:val="single" w:sz="4" w:space="0" w:color="CCCCCC"/>
               <w:start w:val="single" w:sz="4" w:space="0" w:color="CCCCCC"/>
@@ -9690,7 +9688,7 @@
         </w:tc>
         <w:tc>
           <w:tcPr>
-            <w:tcW w:w="2521" w:type="dxa"/>
+            <w:tcW w:w="2522" w:type="dxa"/>
             <w:tcBorders>
               <w:top w:val="single" w:sz="4" w:space="0" w:color="CCCCCC"/>
               <w:start w:val="single" w:sz="4" w:space="0" w:color="CCCCCC"/>
@@ -9784,7 +9782,7 @@
         </w:tc>
         <w:tc>
           <w:tcPr>
-            <w:tcW w:w="1670" w:type="dxa"/>
+            <w:tcW w:w="1669" w:type="dxa"/>
             <w:tcBorders>
               <w:top w:val="single" w:sz="4" w:space="0" w:color="CCCCCC"/>
               <w:start w:val="single" w:sz="4" w:space="0" w:color="CCCCCC"/>
@@ -9824,7 +9822,7 @@
         </w:tc>
         <w:tc>
           <w:tcPr>
-            <w:tcW w:w="3871" w:type="dxa"/>
+            <w:tcW w:w="3872" w:type="dxa"/>
             <w:tcBorders>
               <w:top w:val="single" w:sz="4" w:space="0" w:color="CCCCCC"/>
               <w:start w:val="single" w:sz="4" w:space="0" w:color="CCCCCC"/>
@@ -9864,7 +9862,7 @@
         </w:tc>
         <w:tc>
           <w:tcPr>
-            <w:tcW w:w="1049" w:type="dxa"/>
+            <w:tcW w:w="1048" w:type="dxa"/>
             <w:tcBorders>
               <w:top w:val="single" w:sz="4" w:space="0" w:color="CCCCCC"/>
               <w:start w:val="single" w:sz="4" w:space="0" w:color="CCCCCC"/>
@@ -9904,7 +9902,7 @@
         </w:tc>
         <w:tc>
           <w:tcPr>
-            <w:tcW w:w="2521" w:type="dxa"/>
+            <w:tcW w:w="2522" w:type="dxa"/>
             <w:tcBorders>
               <w:top w:val="single" w:sz="4" w:space="0" w:color="CCCCCC"/>
               <w:start w:val="single" w:sz="4" w:space="0" w:color="CCCCCC"/>
@@ -9998,7 +9996,7 @@
         </w:tc>
         <w:tc>
           <w:tcPr>
-            <w:tcW w:w="1670" w:type="dxa"/>
+            <w:tcW w:w="1669" w:type="dxa"/>
             <w:tcBorders>
               <w:top w:val="single" w:sz="4" w:space="0" w:color="CCCCCC"/>
               <w:start w:val="single" w:sz="4" w:space="0" w:color="CCCCCC"/>
@@ -10038,7 +10036,7 @@
         </w:tc>
         <w:tc>
           <w:tcPr>
-            <w:tcW w:w="3871" w:type="dxa"/>
+            <w:tcW w:w="3872" w:type="dxa"/>
             <w:tcBorders>
               <w:top w:val="single" w:sz="4" w:space="0" w:color="CCCCCC"/>
               <w:start w:val="single" w:sz="4" w:space="0" w:color="CCCCCC"/>
@@ -10078,7 +10076,7 @@
         </w:tc>
         <w:tc>
           <w:tcPr>
-            <w:tcW w:w="1049" w:type="dxa"/>
+            <w:tcW w:w="1048" w:type="dxa"/>
             <w:tcBorders>
               <w:top w:val="single" w:sz="4" w:space="0" w:color="CCCCCC"/>
               <w:start w:val="single" w:sz="4" w:space="0" w:color="CCCCCC"/>
@@ -10118,7 +10116,7 @@
         </w:tc>
         <w:tc>
           <w:tcPr>
-            <w:tcW w:w="2521" w:type="dxa"/>
+            <w:tcW w:w="2522" w:type="dxa"/>
             <w:tcBorders>
               <w:top w:val="single" w:sz="4" w:space="0" w:color="CCCCCC"/>
               <w:start w:val="single" w:sz="4" w:space="0" w:color="CCCCCC"/>
@@ -10212,7 +10210,7 @@
         </w:tc>
         <w:tc>
           <w:tcPr>
-            <w:tcW w:w="1670" w:type="dxa"/>
+            <w:tcW w:w="1669" w:type="dxa"/>
             <w:tcBorders>
               <w:top w:val="single" w:sz="4" w:space="0" w:color="CCCCCC"/>
               <w:start w:val="single" w:sz="4" w:space="0" w:color="CCCCCC"/>
@@ -10252,7 +10250,7 @@
         </w:tc>
         <w:tc>
           <w:tcPr>
-            <w:tcW w:w="3871" w:type="dxa"/>
+            <w:tcW w:w="3872" w:type="dxa"/>
             <w:tcBorders>
               <w:top w:val="single" w:sz="4" w:space="0" w:color="CCCCCC"/>
               <w:start w:val="single" w:sz="4" w:space="0" w:color="CCCCCC"/>
@@ -10292,7 +10290,7 @@
         </w:tc>
         <w:tc>
           <w:tcPr>
-            <w:tcW w:w="1049" w:type="dxa"/>
+            <w:tcW w:w="1048" w:type="dxa"/>
             <w:tcBorders>
               <w:top w:val="single" w:sz="4" w:space="0" w:color="CCCCCC"/>
               <w:start w:val="single" w:sz="4" w:space="0" w:color="CCCCCC"/>
@@ -10332,7 +10330,7 @@
         </w:tc>
         <w:tc>
           <w:tcPr>
-            <w:tcW w:w="2521" w:type="dxa"/>
+            <w:tcW w:w="2522" w:type="dxa"/>
             <w:tcBorders>
               <w:top w:val="single" w:sz="4" w:space="0" w:color="CCCCCC"/>
               <w:start w:val="single" w:sz="4" w:space="0" w:color="CCCCCC"/>
@@ -10426,7 +10424,7 @@
         </w:tc>
         <w:tc>
           <w:tcPr>
-            <w:tcW w:w="1670" w:type="dxa"/>
+            <w:tcW w:w="1669" w:type="dxa"/>
             <w:tcBorders>
               <w:top w:val="single" w:sz="4" w:space="0" w:color="CCCCCC"/>
               <w:start w:val="single" w:sz="4" w:space="0" w:color="CCCCCC"/>
@@ -10466,7 +10464,7 @@
         </w:tc>
         <w:tc>
           <w:tcPr>
-            <w:tcW w:w="3871" w:type="dxa"/>
+            <w:tcW w:w="3872" w:type="dxa"/>
             <w:tcBorders>
               <w:top w:val="single" w:sz="4" w:space="0" w:color="CCCCCC"/>
               <w:start w:val="single" w:sz="4" w:space="0" w:color="CCCCCC"/>
@@ -10506,7 +10504,7 @@
         </w:tc>
         <w:tc>
           <w:tcPr>
-            <w:tcW w:w="1049" w:type="dxa"/>
+            <w:tcW w:w="1048" w:type="dxa"/>
             <w:tcBorders>
               <w:top w:val="single" w:sz="4" w:space="0" w:color="CCCCCC"/>
               <w:start w:val="single" w:sz="4" w:space="0" w:color="CCCCCC"/>
@@ -10546,7 +10544,7 @@
         </w:tc>
         <w:tc>
           <w:tcPr>
-            <w:tcW w:w="2521" w:type="dxa"/>
+            <w:tcW w:w="2522" w:type="dxa"/>
             <w:tcBorders>
               <w:top w:val="single" w:sz="4" w:space="0" w:color="CCCCCC"/>
               <w:start w:val="single" w:sz="4" w:space="0" w:color="CCCCCC"/>
@@ -10640,7 +10638,7 @@
         </w:tc>
         <w:tc>
           <w:tcPr>
-            <w:tcW w:w="1670" w:type="dxa"/>
+            <w:tcW w:w="1669" w:type="dxa"/>
             <w:tcBorders>
               <w:top w:val="single" w:sz="4" w:space="0" w:color="CCCCCC"/>
               <w:start w:val="single" w:sz="4" w:space="0" w:color="CCCCCC"/>
@@ -10680,7 +10678,7 @@
         </w:tc>
         <w:tc>
           <w:tcPr>
-            <w:tcW w:w="3871" w:type="dxa"/>
+            <w:tcW w:w="3872" w:type="dxa"/>
             <w:tcBorders>
               <w:top w:val="single" w:sz="4" w:space="0" w:color="CCCCCC"/>
               <w:start w:val="single" w:sz="4" w:space="0" w:color="CCCCCC"/>
@@ -10720,7 +10718,7 @@
         </w:tc>
         <w:tc>
           <w:tcPr>
-            <w:tcW w:w="1049" w:type="dxa"/>
+            <w:tcW w:w="1048" w:type="dxa"/>
             <w:tcBorders>
               <w:top w:val="single" w:sz="4" w:space="0" w:color="CCCCCC"/>
               <w:start w:val="single" w:sz="4" w:space="0" w:color="CCCCCC"/>
@@ -10760,7 +10758,7 @@
         </w:tc>
         <w:tc>
           <w:tcPr>
-            <w:tcW w:w="2521" w:type="dxa"/>
+            <w:tcW w:w="2522" w:type="dxa"/>
             <w:tcBorders>
               <w:top w:val="single" w:sz="4" w:space="0" w:color="CCCCCC"/>
               <w:start w:val="single" w:sz="4" w:space="0" w:color="CCCCCC"/>
@@ -11220,10 +11218,10 @@
         </w:tblCellMar>
       </w:tblPr>
       <w:tblGrid>
-        <w:gridCol w:w="518"/>
+        <w:gridCol w:w="517"/>
         <w:gridCol w:w="1551"/>
         <w:gridCol w:w="4620"/>
-        <w:gridCol w:w="1351"/>
+        <w:gridCol w:w="1352"/>
         <w:gridCol w:w="2070"/>
       </w:tblGrid>
       <w:tr>
@@ -11266,7 +11264,7 @@
         <w:trPr/>
         <w:tc>
           <w:tcPr>
-            <w:tcW w:w="518" w:type="dxa"/>
+            <w:tcW w:w="517" w:type="dxa"/>
             <w:tcBorders>
               <w:top w:val="single" w:sz="4" w:space="0" w:color="CCCCCC"/>
               <w:start w:val="single" w:sz="4" w:space="0" w:color="CCCCCC"/>
@@ -11386,7 +11384,7 @@
         </w:tc>
         <w:tc>
           <w:tcPr>
-            <w:tcW w:w="1351" w:type="dxa"/>
+            <w:tcW w:w="1352" w:type="dxa"/>
             <w:tcBorders>
               <w:top w:val="single" w:sz="4" w:space="0" w:color="CCCCCC"/>
               <w:start w:val="single" w:sz="4" w:space="0" w:color="CCCCCC"/>
@@ -11469,7 +11467,7 @@
         <w:trPr/>
         <w:tc>
           <w:tcPr>
-            <w:tcW w:w="518" w:type="dxa"/>
+            <w:tcW w:w="517" w:type="dxa"/>
             <w:tcBorders>
               <w:top w:val="single" w:sz="4" w:space="0" w:color="CCCCCC"/>
               <w:start w:val="single" w:sz="4" w:space="0" w:color="CCCCCC"/>
@@ -11589,7 +11587,7 @@
         </w:tc>
         <w:tc>
           <w:tcPr>
-            <w:tcW w:w="1351" w:type="dxa"/>
+            <w:tcW w:w="1352" w:type="dxa"/>
             <w:tcBorders>
               <w:top w:val="single" w:sz="4" w:space="0" w:color="CCCCCC"/>
               <w:start w:val="single" w:sz="4" w:space="0" w:color="CCCCCC"/>
@@ -11683,7 +11681,7 @@
         <w:trPr/>
         <w:tc>
           <w:tcPr>
-            <w:tcW w:w="518" w:type="dxa"/>
+            <w:tcW w:w="517" w:type="dxa"/>
             <w:tcBorders>
               <w:top w:val="single" w:sz="4" w:space="0" w:color="CCCCCC"/>
               <w:start w:val="single" w:sz="4" w:space="0" w:color="CCCCCC"/>
@@ -11803,7 +11801,7 @@
         </w:tc>
         <w:tc>
           <w:tcPr>
-            <w:tcW w:w="1351" w:type="dxa"/>
+            <w:tcW w:w="1352" w:type="dxa"/>
             <w:tcBorders>
               <w:top w:val="single" w:sz="4" w:space="0" w:color="CCCCCC"/>
               <w:start w:val="single" w:sz="4" w:space="0" w:color="CCCCCC"/>
@@ -11897,7 +11895,7 @@
         <w:trPr/>
         <w:tc>
           <w:tcPr>
-            <w:tcW w:w="518" w:type="dxa"/>
+            <w:tcW w:w="517" w:type="dxa"/>
             <w:tcBorders>
               <w:top w:val="single" w:sz="4" w:space="0" w:color="CCCCCC"/>
               <w:start w:val="single" w:sz="4" w:space="0" w:color="CCCCCC"/>
@@ -12017,7 +12015,7 @@
         </w:tc>
         <w:tc>
           <w:tcPr>
-            <w:tcW w:w="1351" w:type="dxa"/>
+            <w:tcW w:w="1352" w:type="dxa"/>
             <w:tcBorders>
               <w:top w:val="single" w:sz="4" w:space="0" w:color="CCCCCC"/>
               <w:start w:val="single" w:sz="4" w:space="0" w:color="CCCCCC"/>
@@ -12111,7 +12109,7 @@
         <w:trPr/>
         <w:tc>
           <w:tcPr>
-            <w:tcW w:w="518" w:type="dxa"/>
+            <w:tcW w:w="517" w:type="dxa"/>
             <w:tcBorders>
               <w:top w:val="single" w:sz="4" w:space="0" w:color="CCCCCC"/>
               <w:start w:val="single" w:sz="4" w:space="0" w:color="CCCCCC"/>
@@ -12231,7 +12229,7 @@
         </w:tc>
         <w:tc>
           <w:tcPr>
-            <w:tcW w:w="1351" w:type="dxa"/>
+            <w:tcW w:w="1352" w:type="dxa"/>
             <w:tcBorders>
               <w:top w:val="single" w:sz="4" w:space="0" w:color="CCCCCC"/>
               <w:start w:val="single" w:sz="4" w:space="0" w:color="CCCCCC"/>
@@ -12325,7 +12323,7 @@
         <w:trPr/>
         <w:tc>
           <w:tcPr>
-            <w:tcW w:w="518" w:type="dxa"/>
+            <w:tcW w:w="517" w:type="dxa"/>
             <w:tcBorders>
               <w:top w:val="single" w:sz="4" w:space="0" w:color="CCCCCC"/>
               <w:start w:val="single" w:sz="4" w:space="0" w:color="CCCCCC"/>
@@ -12445,7 +12443,7 @@
         </w:tc>
         <w:tc>
           <w:tcPr>
-            <w:tcW w:w="1351" w:type="dxa"/>
+            <w:tcW w:w="1352" w:type="dxa"/>
             <w:tcBorders>
               <w:top w:val="single" w:sz="4" w:space="0" w:color="CCCCCC"/>
               <w:start w:val="single" w:sz="4" w:space="0" w:color="CCCCCC"/>
@@ -12539,7 +12537,7 @@
         <w:trPr/>
         <w:tc>
           <w:tcPr>
-            <w:tcW w:w="518" w:type="dxa"/>
+            <w:tcW w:w="517" w:type="dxa"/>
             <w:tcBorders>
               <w:top w:val="single" w:sz="4" w:space="0" w:color="CCCCCC"/>
               <w:start w:val="single" w:sz="4" w:space="0" w:color="CCCCCC"/>
@@ -12659,7 +12657,7 @@
         </w:tc>
         <w:tc>
           <w:tcPr>
-            <w:tcW w:w="1351" w:type="dxa"/>
+            <w:tcW w:w="1352" w:type="dxa"/>
             <w:tcBorders>
               <w:top w:val="single" w:sz="4" w:space="0" w:color="CCCCCC"/>
               <w:start w:val="single" w:sz="4" w:space="0" w:color="CCCCCC"/>
@@ -12753,7 +12751,7 @@
         <w:trPr/>
         <w:tc>
           <w:tcPr>
-            <w:tcW w:w="518" w:type="dxa"/>
+            <w:tcW w:w="517" w:type="dxa"/>
             <w:tcBorders>
               <w:top w:val="single" w:sz="4" w:space="0" w:color="CCCCCC"/>
               <w:start w:val="single" w:sz="4" w:space="0" w:color="CCCCCC"/>
@@ -12873,7 +12871,7 @@
         </w:tc>
         <w:tc>
           <w:tcPr>
-            <w:tcW w:w="1351" w:type="dxa"/>
+            <w:tcW w:w="1352" w:type="dxa"/>
             <w:tcBorders>
               <w:top w:val="single" w:sz="4" w:space="0" w:color="CCCCCC"/>
               <w:start w:val="single" w:sz="4" w:space="0" w:color="CCCCCC"/>
@@ -12967,7 +12965,7 @@
         <w:trPr/>
         <w:tc>
           <w:tcPr>
-            <w:tcW w:w="518" w:type="dxa"/>
+            <w:tcW w:w="517" w:type="dxa"/>
             <w:tcBorders>
               <w:top w:val="single" w:sz="4" w:space="0" w:color="CCCCCC"/>
               <w:start w:val="single" w:sz="4" w:space="0" w:color="CCCCCC"/>
@@ -13087,7 +13085,7 @@
         </w:tc>
         <w:tc>
           <w:tcPr>
-            <w:tcW w:w="1351" w:type="dxa"/>
+            <w:tcW w:w="1352" w:type="dxa"/>
             <w:tcBorders>
               <w:top w:val="single" w:sz="4" w:space="0" w:color="CCCCCC"/>
               <w:start w:val="single" w:sz="4" w:space="0" w:color="CCCCCC"/>
@@ -13181,7 +13179,7 @@
         <w:trPr/>
         <w:tc>
           <w:tcPr>
-            <w:tcW w:w="518" w:type="dxa"/>
+            <w:tcW w:w="517" w:type="dxa"/>
             <w:tcBorders>
               <w:top w:val="single" w:sz="4" w:space="0" w:color="CCCCCC"/>
               <w:start w:val="single" w:sz="4" w:space="0" w:color="CCCCCC"/>
@@ -13301,7 +13299,7 @@
         </w:tc>
         <w:tc>
           <w:tcPr>
-            <w:tcW w:w="1351" w:type="dxa"/>
+            <w:tcW w:w="1352" w:type="dxa"/>
             <w:tcBorders>
               <w:top w:val="single" w:sz="4" w:space="0" w:color="CCCCCC"/>
               <w:start w:val="single" w:sz="4" w:space="0" w:color="CCCCCC"/>
@@ -13395,7 +13393,7 @@
         <w:trPr/>
         <w:tc>
           <w:tcPr>
-            <w:tcW w:w="518" w:type="dxa"/>
+            <w:tcW w:w="517" w:type="dxa"/>
             <w:tcBorders>
               <w:top w:val="single" w:sz="4" w:space="0" w:color="CCCCCC"/>
               <w:start w:val="single" w:sz="4" w:space="0" w:color="CCCCCC"/>
@@ -13515,7 +13513,7 @@
         </w:tc>
         <w:tc>
           <w:tcPr>
-            <w:tcW w:w="1351" w:type="dxa"/>
+            <w:tcW w:w="1352" w:type="dxa"/>
             <w:tcBorders>
               <w:top w:val="single" w:sz="4" w:space="0" w:color="CCCCCC"/>
               <w:start w:val="single" w:sz="4" w:space="0" w:color="CCCCCC"/>
@@ -13609,7 +13607,7 @@
         <w:trPr/>
         <w:tc>
           <w:tcPr>
-            <w:tcW w:w="518" w:type="dxa"/>
+            <w:tcW w:w="517" w:type="dxa"/>
             <w:tcBorders>
               <w:top w:val="single" w:sz="4" w:space="0" w:color="CCCCCC"/>
               <w:start w:val="single" w:sz="4" w:space="0" w:color="CCCCCC"/>
@@ -13729,7 +13727,7 @@
         </w:tc>
         <w:tc>
           <w:tcPr>
-            <w:tcW w:w="1351" w:type="dxa"/>
+            <w:tcW w:w="1352" w:type="dxa"/>
             <w:tcBorders>
               <w:top w:val="single" w:sz="4" w:space="0" w:color="CCCCCC"/>
               <w:start w:val="single" w:sz="4" w:space="0" w:color="CCCCCC"/>
@@ -13823,7 +13821,7 @@
         <w:trPr/>
         <w:tc>
           <w:tcPr>
-            <w:tcW w:w="518" w:type="dxa"/>
+            <w:tcW w:w="517" w:type="dxa"/>
             <w:tcBorders>
               <w:top w:val="single" w:sz="4" w:space="0" w:color="CCCCCC"/>
               <w:start w:val="single" w:sz="4" w:space="0" w:color="CCCCCC"/>
@@ -13943,7 +13941,7 @@
         </w:tc>
         <w:tc>
           <w:tcPr>
-            <w:tcW w:w="1351" w:type="dxa"/>
+            <w:tcW w:w="1352" w:type="dxa"/>
             <w:tcBorders>
               <w:top w:val="single" w:sz="4" w:space="0" w:color="CCCCCC"/>
               <w:start w:val="single" w:sz="4" w:space="0" w:color="CCCCCC"/>
@@ -14037,7 +14035,7 @@
         <w:trPr/>
         <w:tc>
           <w:tcPr>
-            <w:tcW w:w="518" w:type="dxa"/>
+            <w:tcW w:w="517" w:type="dxa"/>
             <w:tcBorders>
               <w:top w:val="single" w:sz="4" w:space="0" w:color="CCCCCC"/>
               <w:start w:val="single" w:sz="4" w:space="0" w:color="CCCCCC"/>
@@ -14157,7 +14155,7 @@
         </w:tc>
         <w:tc>
           <w:tcPr>
-            <w:tcW w:w="1351" w:type="dxa"/>
+            <w:tcW w:w="1352" w:type="dxa"/>
             <w:tcBorders>
               <w:top w:val="single" w:sz="4" w:space="0" w:color="CCCCCC"/>
               <w:start w:val="single" w:sz="4" w:space="0" w:color="CCCCCC"/>
@@ -14869,8 +14867,8 @@
       <w:u w:val="single"/>
     </w:rPr>
   </w:style>
-  <w:style w:type="character" w:styleId="FootnoteCharactersuser">
-    <w:name w:val="Footnote Characters (user)"/>
+  <w:style w:type="character" w:styleId="FootnoteCharacters">
+    <w:name w:val="Footnote Characters"/>
     <w:uiPriority w:val="99"/>
     <w:semiHidden/>
     <w:unhideWhenUsed/>
@@ -14879,8 +14877,8 @@
       <w:vertAlign w:val="superscript"/>
     </w:rPr>
   </w:style>
-  <w:style w:type="character" w:styleId="FootnoteCharacters">
-    <w:name w:val="Footnote Characters"/>
+  <w:style w:type="character" w:styleId="FootnoteCharactersuser">
+    <w:name w:val="Footnote Characters (user)"/>
     <w:qFormat/>
     <w:rPr>
       <w:vertAlign w:val="superscript"/>
@@ -14904,8 +14902,8 @@
       <w:szCs w:val="20"/>
     </w:rPr>
   </w:style>
-  <w:style w:type="character" w:styleId="EndnoteCharactersuser">
-    <w:name w:val="Endnote Characters (user)"/>
+  <w:style w:type="character" w:styleId="EndnoteCharacters">
+    <w:name w:val="Endnote Characters"/>
     <w:uiPriority w:val="99"/>
     <w:semiHidden/>
     <w:unhideWhenUsed/>
@@ -14914,8 +14912,8 @@
       <w:vertAlign w:val="superscript"/>
     </w:rPr>
   </w:style>
-  <w:style w:type="character" w:styleId="EndnoteCharacters">
-    <w:name w:val="Endnote Characters"/>
+  <w:style w:type="character" w:styleId="EndnoteCharactersuser">
+    <w:name w:val="Endnote Characters (user)"/>
     <w:qFormat/>
     <w:rPr>
       <w:vertAlign w:val="superscript"/>

</xml_diff>